<commit_message>
Removed Training May 23 submodule
</commit_message>
<xml_diff>
--- a/May 27 Linux/Linux Assignment.docx
+++ b/May 27 Linux/Linux Assignment.docx
@@ -41,6 +41,9 @@
     </w:p>
     <w:p>
       <w:r>
+        <w:rPr>
+          <w:noProof/>
+        </w:rPr>
         <w:drawing>
           <wp:inline distT="0" distB="0" distL="0" distR="0" wp14:anchorId="7FBF8290" wp14:editId="1EAC47DC">
             <wp:extent cx="5731510" cy="4526915"/>
@@ -91,6 +94,9 @@
         </w:rPr>
       </w:pPr>
       <w:r>
+        <w:rPr>
+          <w:noProof/>
+        </w:rPr>
         <w:drawing>
           <wp:inline distT="0" distB="0" distL="0" distR="0" wp14:anchorId="5C3892E0" wp14:editId="3F29FE34">
             <wp:extent cx="4022303" cy="2184504"/>
@@ -228,6 +234,9 @@
     </w:p>
     <w:p>
       <w:r>
+        <w:rPr>
+          <w:noProof/>
+        </w:rPr>
         <w:drawing>
           <wp:inline distT="0" distB="0" distL="0" distR="0" wp14:anchorId="014E8948" wp14:editId="3500268B">
             <wp:extent cx="5731510" cy="738505"/>
@@ -285,6 +294,9 @@
     </w:p>
     <w:p>
       <w:r>
+        <w:rPr>
+          <w:noProof/>
+        </w:rPr>
         <w:drawing>
           <wp:inline distT="0" distB="0" distL="0" distR="0" wp14:anchorId="7C50ACF1" wp14:editId="41EDA1E7">
             <wp:extent cx="5731510" cy="1322705"/>
@@ -357,6 +369,9 @@
     </w:p>
     <w:p>
       <w:r>
+        <w:rPr>
+          <w:noProof/>
+        </w:rPr>
         <w:drawing>
           <wp:inline distT="0" distB="0" distL="0" distR="0" wp14:anchorId="6D4823CC" wp14:editId="3CD3739C">
             <wp:extent cx="5731510" cy="1080770"/>
@@ -484,6 +499,9 @@
     </w:p>
     <w:p>
       <w:r>
+        <w:rPr>
+          <w:noProof/>
+        </w:rPr>
         <w:drawing>
           <wp:inline distT="0" distB="0" distL="0" distR="0" wp14:anchorId="1E1A5CA2" wp14:editId="390CEAF2">
             <wp:extent cx="5731510" cy="4859655"/>
@@ -538,6 +556,9 @@
     </w:p>
     <w:p>
       <w:r>
+        <w:rPr>
+          <w:noProof/>
+        </w:rPr>
         <w:drawing>
           <wp:inline distT="0" distB="0" distL="0" distR="0" wp14:anchorId="53F83E79" wp14:editId="3B09C1A6">
             <wp:extent cx="4978987" cy="538480"/>
@@ -632,6 +653,9 @@
         </w:rPr>
       </w:pPr>
       <w:r>
+        <w:rPr>
+          <w:noProof/>
+        </w:rPr>
         <w:lastRenderedPageBreak/>
         <w:drawing>
           <wp:inline distT="0" distB="0" distL="0" distR="0" wp14:anchorId="6B394036" wp14:editId="172E5785">
@@ -962,6 +986,9 @@
         <w:ind w:left="720"/>
       </w:pPr>
       <w:r>
+        <w:rPr>
+          <w:noProof/>
+        </w:rPr>
         <w:drawing>
           <wp:inline distT="0" distB="0" distL="0" distR="0" wp14:anchorId="407F84F4" wp14:editId="4F2D30E8">
             <wp:extent cx="5731510" cy="1548765"/>
@@ -1131,6 +1158,7 @@
       </w:pPr>
       <w:r>
         <w:rPr>
+          <w:noProof/>
           <w:lang w:val="en-US"/>
         </w:rPr>
         <w:drawing>
@@ -1269,6 +1297,7 @@
       </w:pPr>
       <w:r>
         <w:rPr>
+          <w:noProof/>
           <w:lang w:val="en-US"/>
         </w:rPr>
         <w:lastRenderedPageBreak/>
@@ -1309,6 +1338,1552 @@
         </w:drawing>
       </w:r>
     </w:p>
+    <w:p>
+      <w:pPr>
+        <w:rPr>
+          <w:lang w:val="en-US"/>
+        </w:rPr>
+      </w:pPr>
+    </w:p>
+    <w:p>
+      <w:pPr>
+        <w:rPr>
+          <w:lang w:val="en-US"/>
+        </w:rPr>
+      </w:pPr>
+    </w:p>
+    <w:p>
+      <w:r>
+        <w:rPr>
+          <w:lang w:val="en-US"/>
+        </w:rPr>
+        <w:t>15.</w:t>
+      </w:r>
+      <w:r>
+        <w:rPr>
+          <w:rFonts w:ascii="Aptos" w:hAnsi="Aptos"/>
+          <w:color w:val="000000"/>
+          <w:shd w:val="clear" w:color="auto" w:fill="FFFFFF"/>
+          <w:lang w:val="en-US"/>
+        </w:rPr>
+        <w:t xml:space="preserve"> </w:t>
+      </w:r>
+      <w:r>
+        <w:rPr>
+          <w:lang w:val="en-US"/>
+        </w:rPr>
+        <w:t>Create a file called example.txt. Write a script to make it read-only for all users.</w:t>
+      </w:r>
+      <w:r>
+        <w:t> </w:t>
+      </w:r>
+    </w:p>
+    <w:p>
+      <w:pPr>
+        <w:rPr>
+          <w:lang w:val="en-US"/>
+        </w:rPr>
+      </w:pPr>
+      <w:r>
+        <w:rPr>
+          <w:lang w:val="en-US"/>
+        </w:rPr>
+        <w:drawing>
+          <wp:inline distT="0" distB="0" distL="0" distR="0" wp14:anchorId="265D83D2" wp14:editId="6C074FEA">
+            <wp:extent cx="5731510" cy="3615055"/>
+            <wp:effectExtent l="0" t="0" r="2540" b="4445"/>
+            <wp:docPr id="441141886" name="Picture 1"/>
+            <wp:cNvGraphicFramePr>
+              <a:graphicFrameLocks xmlns:a="http://schemas.openxmlformats.org/drawingml/2006/main" noChangeAspect="1"/>
+            </wp:cNvGraphicFramePr>
+            <a:graphic xmlns:a="http://schemas.openxmlformats.org/drawingml/2006/main">
+              <a:graphicData uri="http://schemas.openxmlformats.org/drawingml/2006/picture">
+                <pic:pic xmlns:pic="http://schemas.openxmlformats.org/drawingml/2006/picture">
+                  <pic:nvPicPr>
+                    <pic:cNvPr id="441141886" name=""/>
+                    <pic:cNvPicPr/>
+                  </pic:nvPicPr>
+                  <pic:blipFill>
+                    <a:blip r:embed="rId17"/>
+                    <a:stretch>
+                      <a:fillRect/>
+                    </a:stretch>
+                  </pic:blipFill>
+                  <pic:spPr>
+                    <a:xfrm>
+                      <a:off x="0" y="0"/>
+                      <a:ext cx="5731510" cy="3615055"/>
+                    </a:xfrm>
+                    <a:prstGeom prst="rect">
+                      <a:avLst/>
+                    </a:prstGeom>
+                  </pic:spPr>
+                </pic:pic>
+              </a:graphicData>
+            </a:graphic>
+          </wp:inline>
+        </w:drawing>
+      </w:r>
+    </w:p>
+    <w:p>
+      <w:pPr>
+        <w:rPr>
+          <w:lang w:val="en-US"/>
+        </w:rPr>
+      </w:pPr>
+    </w:p>
+    <w:p>
+      <w:r>
+        <w:rPr>
+          <w:lang w:val="en-US"/>
+        </w:rPr>
+        <w:lastRenderedPageBreak/>
+        <w:t xml:space="preserve">16. </w:t>
+      </w:r>
+      <w:r>
+        <w:rPr>
+          <w:lang w:val="en-US"/>
+        </w:rPr>
+        <w:t>Write a script that changes the permissions of a script named myscript.sh to make it executable by the owner, group, and others.</w:t>
+      </w:r>
+      <w:r>
+        <w:t> </w:t>
+      </w:r>
+    </w:p>
+    <w:p>
+      <w:r>
+        <w:t>Need to install VMWare for providing execution permission</w:t>
+      </w:r>
+    </w:p>
+    <w:p/>
+    <w:p>
+      <w:r>
+        <w:t xml:space="preserve">17. </w:t>
+      </w:r>
+      <w:r>
+        <w:rPr>
+          <w:lang w:val="en-US"/>
+        </w:rPr>
+        <w:t>Recursively make all the files readable in a directory.</w:t>
+      </w:r>
+      <w:r>
+        <w:t> </w:t>
+      </w:r>
+    </w:p>
+    <w:p/>
+    <w:p>
+      <w:pPr>
+        <w:tabs>
+          <w:tab w:val="left" w:pos="820"/>
+        </w:tabs>
+      </w:pPr>
+      <w:r>
+        <w:t xml:space="preserve">18. </w:t>
+      </w:r>
+      <w:r>
+        <w:rPr>
+          <w:lang w:val="en-US"/>
+        </w:rPr>
+        <w:t>List out all the files that end with ".log" in a directory.</w:t>
+      </w:r>
+      <w:r>
+        <w:t> </w:t>
+      </w:r>
+    </w:p>
+    <w:p>
+      <w:pPr>
+        <w:rPr>
+          <w:lang w:val="en-US"/>
+        </w:rPr>
+      </w:pPr>
+      <w:r>
+        <w:rPr>
+          <w:lang w:val="en-US"/>
+        </w:rPr>
+        <w:drawing>
+          <wp:inline distT="0" distB="0" distL="0" distR="0" wp14:anchorId="61E807F3" wp14:editId="2D96E089">
+            <wp:extent cx="5731510" cy="1716405"/>
+            <wp:effectExtent l="0" t="0" r="2540" b="0"/>
+            <wp:docPr id="56392583" name="Picture 1"/>
+            <wp:cNvGraphicFramePr>
+              <a:graphicFrameLocks xmlns:a="http://schemas.openxmlformats.org/drawingml/2006/main" noChangeAspect="1"/>
+            </wp:cNvGraphicFramePr>
+            <a:graphic xmlns:a="http://schemas.openxmlformats.org/drawingml/2006/main">
+              <a:graphicData uri="http://schemas.openxmlformats.org/drawingml/2006/picture">
+                <pic:pic xmlns:pic="http://schemas.openxmlformats.org/drawingml/2006/picture">
+                  <pic:nvPicPr>
+                    <pic:cNvPr id="56392583" name=""/>
+                    <pic:cNvPicPr/>
+                  </pic:nvPicPr>
+                  <pic:blipFill>
+                    <a:blip r:embed="rId18"/>
+                    <a:stretch>
+                      <a:fillRect/>
+                    </a:stretch>
+                  </pic:blipFill>
+                  <pic:spPr>
+                    <a:xfrm>
+                      <a:off x="0" y="0"/>
+                      <a:ext cx="5731510" cy="1716405"/>
+                    </a:xfrm>
+                    <a:prstGeom prst="rect">
+                      <a:avLst/>
+                    </a:prstGeom>
+                  </pic:spPr>
+                </pic:pic>
+              </a:graphicData>
+            </a:graphic>
+          </wp:inline>
+        </w:drawing>
+      </w:r>
+    </w:p>
+    <w:p/>
+    <w:p>
+      <w:r>
+        <w:t xml:space="preserve">19. </w:t>
+      </w:r>
+      <w:r>
+        <w:rPr>
+          <w:lang w:val="en-US"/>
+        </w:rPr>
+        <w:t>Write a command to get the kernel version.</w:t>
+      </w:r>
+      <w:r>
+        <w:t> </w:t>
+      </w:r>
+    </w:p>
+    <w:p>
+      <w:r>
+        <w:drawing>
+          <wp:inline distT="0" distB="0" distL="0" distR="0" wp14:anchorId="3746B167" wp14:editId="7CC1D8D7">
+            <wp:extent cx="5731510" cy="1174750"/>
+            <wp:effectExtent l="0" t="0" r="2540" b="6350"/>
+            <wp:docPr id="1487418391" name="Picture 1"/>
+            <wp:cNvGraphicFramePr>
+              <a:graphicFrameLocks xmlns:a="http://schemas.openxmlformats.org/drawingml/2006/main" noChangeAspect="1"/>
+            </wp:cNvGraphicFramePr>
+            <a:graphic xmlns:a="http://schemas.openxmlformats.org/drawingml/2006/main">
+              <a:graphicData uri="http://schemas.openxmlformats.org/drawingml/2006/picture">
+                <pic:pic xmlns:pic="http://schemas.openxmlformats.org/drawingml/2006/picture">
+                  <pic:nvPicPr>
+                    <pic:cNvPr id="1487418391" name=""/>
+                    <pic:cNvPicPr/>
+                  </pic:nvPicPr>
+                  <pic:blipFill>
+                    <a:blip r:embed="rId19"/>
+                    <a:stretch>
+                      <a:fillRect/>
+                    </a:stretch>
+                  </pic:blipFill>
+                  <pic:spPr>
+                    <a:xfrm>
+                      <a:off x="0" y="0"/>
+                      <a:ext cx="5731510" cy="1174750"/>
+                    </a:xfrm>
+                    <a:prstGeom prst="rect">
+                      <a:avLst/>
+                    </a:prstGeom>
+                  </pic:spPr>
+                </pic:pic>
+              </a:graphicData>
+            </a:graphic>
+          </wp:inline>
+        </w:drawing>
+      </w:r>
+    </w:p>
+    <w:p>
+      <w:r>
+        <w:t xml:space="preserve">Difference between </w:t>
+      </w:r>
+      <w:proofErr w:type="spellStart"/>
+      <w:r>
+        <w:t>uname</w:t>
+      </w:r>
+      <w:proofErr w:type="spellEnd"/>
+      <w:r>
+        <w:t xml:space="preserve">-r and </w:t>
+      </w:r>
+      <w:proofErr w:type="spellStart"/>
+      <w:r>
+        <w:t>uname</w:t>
+      </w:r>
+      <w:proofErr w:type="spellEnd"/>
+      <w:r>
+        <w:t>-v</w:t>
+      </w:r>
+    </w:p>
+    <w:tbl>
+      <w:tblPr>
+        <w:tblStyle w:val="TableGrid"/>
+        <w:tblW w:w="0" w:type="auto"/>
+        <w:tblLook w:val="04A0" w:firstRow="1" w:lastRow="0" w:firstColumn="1" w:lastColumn="0" w:noHBand="0" w:noVBand="1"/>
+      </w:tblPr>
+      <w:tblGrid>
+        <w:gridCol w:w="1362"/>
+        <w:gridCol w:w="2318"/>
+        <w:gridCol w:w="2040"/>
+        <w:gridCol w:w="3296"/>
+      </w:tblGrid>
+      <w:tr>
+        <w:tc>
+          <w:tcPr>
+            <w:tcW w:w="0" w:type="auto"/>
+            <w:hideMark/>
+          </w:tcPr>
+          <w:p>
+            <w:pPr>
+              <w:spacing w:after="160" w:line="278" w:lineRule="auto"/>
+              <w:rPr>
+                <w:b/>
+                <w:bCs/>
+              </w:rPr>
+            </w:pPr>
+            <w:r>
+              <w:rPr>
+                <w:b/>
+                <w:bCs/>
+              </w:rPr>
+              <w:t>Command</w:t>
+            </w:r>
+          </w:p>
+        </w:tc>
+        <w:tc>
+          <w:tcPr>
+            <w:tcW w:w="2318" w:type="dxa"/>
+            <w:hideMark/>
+          </w:tcPr>
+          <w:p>
+            <w:pPr>
+              <w:spacing w:after="160" w:line="278" w:lineRule="auto"/>
+              <w:rPr>
+                <w:b/>
+                <w:bCs/>
+              </w:rPr>
+            </w:pPr>
+            <w:r>
+              <w:rPr>
+                <w:b/>
+                <w:bCs/>
+              </w:rPr>
+              <w:t>What It Shows</w:t>
+            </w:r>
+          </w:p>
+        </w:tc>
+        <w:tc>
+          <w:tcPr>
+            <w:tcW w:w="1604" w:type="dxa"/>
+            <w:hideMark/>
+          </w:tcPr>
+          <w:p>
+            <w:pPr>
+              <w:spacing w:after="160" w:line="278" w:lineRule="auto"/>
+              <w:rPr>
+                <w:b/>
+                <w:bCs/>
+              </w:rPr>
+            </w:pPr>
+            <w:r>
+              <w:rPr>
+                <w:b/>
+                <w:bCs/>
+              </w:rPr>
+              <w:t>Example Output</w:t>
+            </w:r>
+          </w:p>
+        </w:tc>
+        <w:tc>
+          <w:tcPr>
+            <w:tcW w:w="0" w:type="auto"/>
+            <w:hideMark/>
+          </w:tcPr>
+          <w:p>
+            <w:pPr>
+              <w:spacing w:after="160" w:line="278" w:lineRule="auto"/>
+              <w:rPr>
+                <w:b/>
+                <w:bCs/>
+              </w:rPr>
+            </w:pPr>
+            <w:r>
+              <w:rPr>
+                <w:b/>
+                <w:bCs/>
+              </w:rPr>
+              <w:t>Explanation</w:t>
+            </w:r>
+          </w:p>
+        </w:tc>
+      </w:tr>
+      <w:tr>
+        <w:tc>
+          <w:tcPr>
+            <w:tcW w:w="0" w:type="auto"/>
+            <w:hideMark/>
+          </w:tcPr>
+          <w:p>
+            <w:pPr>
+              <w:spacing w:after="160" w:line="278" w:lineRule="auto"/>
+            </w:pPr>
+            <w:proofErr w:type="spellStart"/>
+            <w:r>
+              <w:t>uname</w:t>
+            </w:r>
+            <w:proofErr w:type="spellEnd"/>
+            <w:r>
+              <w:t xml:space="preserve"> -r</w:t>
+            </w:r>
+          </w:p>
+        </w:tc>
+        <w:tc>
+          <w:tcPr>
+            <w:tcW w:w="2318" w:type="dxa"/>
+            <w:hideMark/>
+          </w:tcPr>
+          <w:p>
+            <w:pPr>
+              <w:spacing w:after="160" w:line="278" w:lineRule="auto"/>
+            </w:pPr>
+            <w:r>
+              <w:t xml:space="preserve">Kernel </w:t>
+            </w:r>
+            <w:r>
+              <w:rPr>
+                <w:b/>
+                <w:bCs/>
+              </w:rPr>
+              <w:t>release</w:t>
+            </w:r>
+            <w:r>
+              <w:t xml:space="preserve"> version</w:t>
+            </w:r>
+          </w:p>
+        </w:tc>
+        <w:tc>
+          <w:tcPr>
+            <w:tcW w:w="1604" w:type="dxa"/>
+            <w:hideMark/>
+          </w:tcPr>
+          <w:p>
+            <w:pPr>
+              <w:spacing w:after="160" w:line="278" w:lineRule="auto"/>
+            </w:pPr>
+            <w:r>
+              <w:t>3.5.7-463ebcdc.x86_64</w:t>
+            </w:r>
+          </w:p>
+        </w:tc>
+        <w:tc>
+          <w:tcPr>
+            <w:tcW w:w="0" w:type="auto"/>
+            <w:hideMark/>
+          </w:tcPr>
+          <w:p>
+            <w:pPr>
+              <w:spacing w:after="160" w:line="278" w:lineRule="auto"/>
+            </w:pPr>
+            <w:r>
+              <w:t xml:space="preserve">Shows the </w:t>
+            </w:r>
+            <w:r>
+              <w:rPr>
+                <w:b/>
+                <w:bCs/>
+              </w:rPr>
+              <w:t>kernel version number</w:t>
+            </w:r>
+            <w:r>
+              <w:t>, e.g., Linux kernel release.</w:t>
+            </w:r>
+          </w:p>
+        </w:tc>
+      </w:tr>
+      <w:tr>
+        <w:trPr>
+          <w:trHeight w:val="742"/>
+        </w:trPr>
+        <w:tc>
+          <w:tcPr>
+            <w:tcW w:w="0" w:type="auto"/>
+            <w:hideMark/>
+          </w:tcPr>
+          <w:p>
+            <w:pPr>
+              <w:spacing w:after="160" w:line="278" w:lineRule="auto"/>
+            </w:pPr>
+            <w:proofErr w:type="spellStart"/>
+            <w:r>
+              <w:t>uname</w:t>
+            </w:r>
+            <w:proofErr w:type="spellEnd"/>
+            <w:r>
+              <w:t xml:space="preserve"> -v</w:t>
+            </w:r>
+          </w:p>
+        </w:tc>
+        <w:tc>
+          <w:tcPr>
+            <w:tcW w:w="2318" w:type="dxa"/>
+            <w:hideMark/>
+          </w:tcPr>
+          <w:p>
+            <w:pPr>
+              <w:spacing w:after="160" w:line="278" w:lineRule="auto"/>
+            </w:pPr>
+            <w:r>
+              <w:t xml:space="preserve">Kernel </w:t>
+            </w:r>
+            <w:r>
+              <w:rPr>
+                <w:b/>
+                <w:bCs/>
+              </w:rPr>
+              <w:t>version</w:t>
+            </w:r>
+            <w:r>
+              <w:t xml:space="preserve"> (build info)</w:t>
+            </w:r>
+          </w:p>
+        </w:tc>
+        <w:tc>
+          <w:tcPr>
+            <w:tcW w:w="1604" w:type="dxa"/>
+            <w:hideMark/>
+          </w:tcPr>
+          <w:p>
+            <w:pPr>
+              <w:spacing w:after="160" w:line="278" w:lineRule="auto"/>
+            </w:pPr>
+            <w:r>
+              <w:t>2025-03-03 17:26 UTC</w:t>
+            </w:r>
+          </w:p>
+        </w:tc>
+        <w:tc>
+          <w:tcPr>
+            <w:tcW w:w="0" w:type="auto"/>
+            <w:hideMark/>
+          </w:tcPr>
+          <w:p>
+            <w:pPr>
+              <w:spacing w:after="160" w:line="278" w:lineRule="auto"/>
+            </w:pPr>
+            <w:r>
+              <w:t xml:space="preserve">Shows the </w:t>
+            </w:r>
+            <w:r>
+              <w:rPr>
+                <w:b/>
+                <w:bCs/>
+              </w:rPr>
+              <w:t>kernel build date/time and extra info</w:t>
+            </w:r>
+            <w:r>
+              <w:t xml:space="preserve"> about the kernel version.</w:t>
+            </w:r>
+          </w:p>
+        </w:tc>
+      </w:tr>
+    </w:tbl>
+    <w:p/>
+    <w:p>
+      <w:r>
+        <w:t xml:space="preserve">20. </w:t>
+      </w:r>
+      <w:r>
+        <w:rPr>
+          <w:lang w:val="en-US"/>
+        </w:rPr>
+        <w:t>Find the IP address of the system.</w:t>
+      </w:r>
+      <w:r>
+        <w:t> </w:t>
+      </w:r>
+    </w:p>
+    <w:p>
+      <w:r>
+        <w:lastRenderedPageBreak/>
+        <w:t>Need VMWare</w:t>
+      </w:r>
+    </w:p>
+    <w:p/>
+    <w:p>
+      <w:r>
+        <w:t xml:space="preserve">21. </w:t>
+      </w:r>
+      <w:r>
+        <w:rPr>
+          <w:lang w:val="en-US"/>
+        </w:rPr>
+        <w:t>Write a script to list all files and directories in the current directory, sorted by size.</w:t>
+      </w:r>
+      <w:r>
+        <w:t> </w:t>
+      </w:r>
+    </w:p>
+    <w:p>
+      <w:r>
+        <w:t xml:space="preserve">-S: </w:t>
+      </w:r>
+      <w:r>
+        <w:rPr>
+          <w:b/>
+          <w:bCs/>
+        </w:rPr>
+        <w:t>Sort by file size</w:t>
+      </w:r>
+      <w:r>
+        <w:t>, largest files first</w:t>
+      </w:r>
+      <w:r>
+        <w:t>.</w:t>
+      </w:r>
+    </w:p>
+    <w:p>
+      <w:r>
+        <w:t xml:space="preserve">For smallest file first: </w:t>
+      </w:r>
+    </w:p>
+    <w:p>
+      <w:r>
+        <w:rPr>
+          <w:i/>
+          <w:iCs/>
+          <w:color w:val="FF0000"/>
+        </w:rPr>
+        <w:t>ls -</w:t>
+      </w:r>
+      <w:proofErr w:type="spellStart"/>
+      <w:r>
+        <w:rPr>
+          <w:i/>
+          <w:iCs/>
+          <w:color w:val="FF0000"/>
+        </w:rPr>
+        <w:t>lS</w:t>
+      </w:r>
+      <w:proofErr w:type="spellEnd"/>
+      <w:r>
+        <w:rPr>
+          <w:i/>
+          <w:iCs/>
+          <w:color w:val="FF0000"/>
+        </w:rPr>
+        <w:t xml:space="preserve"> -</w:t>
+      </w:r>
+      <w:proofErr w:type="gramStart"/>
+      <w:r>
+        <w:rPr>
+          <w:i/>
+          <w:iCs/>
+          <w:color w:val="FF0000"/>
+        </w:rPr>
+        <w:t>r</w:t>
+      </w:r>
+      <w:r>
+        <w:rPr>
+          <w:color w:val="FF0000"/>
+        </w:rPr>
+        <w:t xml:space="preserve">  </w:t>
+      </w:r>
+      <w:r>
+        <w:t>:</w:t>
+      </w:r>
+      <w:proofErr w:type="gramEnd"/>
+      <w:r>
+        <w:t xml:space="preserve"> </w:t>
+      </w:r>
+      <w:r>
+        <w:t xml:space="preserve">-r means </w:t>
+      </w:r>
+      <w:r>
+        <w:rPr>
+          <w:b/>
+          <w:bCs/>
+        </w:rPr>
+        <w:t>reverse the sort order</w:t>
+      </w:r>
+      <w:r>
+        <w:rPr>
+          <w:b/>
+          <w:bCs/>
+        </w:rPr>
+        <w:t xml:space="preserve"> </w:t>
+      </w:r>
+      <w:r>
+        <w:t>or</w:t>
+      </w:r>
+    </w:p>
+    <w:p>
+      <w:pPr>
+        <w:rPr>
+          <w:i/>
+          <w:iCs/>
+          <w:color w:val="FF0000"/>
+        </w:rPr>
+      </w:pPr>
+      <w:r>
+        <w:rPr>
+          <w:i/>
+          <w:iCs/>
+          <w:color w:val="FF0000"/>
+        </w:rPr>
+        <w:t>ls -</w:t>
+      </w:r>
+      <w:proofErr w:type="spellStart"/>
+      <w:r>
+        <w:rPr>
+          <w:i/>
+          <w:iCs/>
+          <w:color w:val="FF0000"/>
+        </w:rPr>
+        <w:t>lSr</w:t>
+      </w:r>
+      <w:proofErr w:type="spellEnd"/>
+      <w:r>
+        <w:rPr>
+          <w:i/>
+          <w:iCs/>
+          <w:color w:val="FF0000"/>
+        </w:rPr>
+        <w:t xml:space="preserve"> </w:t>
+      </w:r>
+    </w:p>
+    <w:p>
+      <w:r>
+        <w:drawing>
+          <wp:inline distT="0" distB="0" distL="0" distR="0" wp14:anchorId="5516554E" wp14:editId="0F6A10FF">
+            <wp:extent cx="5731510" cy="1770380"/>
+            <wp:effectExtent l="0" t="0" r="2540" b="1270"/>
+            <wp:docPr id="405234656" name="Picture 1"/>
+            <wp:cNvGraphicFramePr>
+              <a:graphicFrameLocks xmlns:a="http://schemas.openxmlformats.org/drawingml/2006/main" noChangeAspect="1"/>
+            </wp:cNvGraphicFramePr>
+            <a:graphic xmlns:a="http://schemas.openxmlformats.org/drawingml/2006/main">
+              <a:graphicData uri="http://schemas.openxmlformats.org/drawingml/2006/picture">
+                <pic:pic xmlns:pic="http://schemas.openxmlformats.org/drawingml/2006/picture">
+                  <pic:nvPicPr>
+                    <pic:cNvPr id="405234656" name=""/>
+                    <pic:cNvPicPr/>
+                  </pic:nvPicPr>
+                  <pic:blipFill>
+                    <a:blip r:embed="rId20"/>
+                    <a:stretch>
+                      <a:fillRect/>
+                    </a:stretch>
+                  </pic:blipFill>
+                  <pic:spPr>
+                    <a:xfrm>
+                      <a:off x="0" y="0"/>
+                      <a:ext cx="5731510" cy="1770380"/>
+                    </a:xfrm>
+                    <a:prstGeom prst="rect">
+                      <a:avLst/>
+                    </a:prstGeom>
+                  </pic:spPr>
+                </pic:pic>
+              </a:graphicData>
+            </a:graphic>
+          </wp:inline>
+        </w:drawing>
+      </w:r>
+    </w:p>
+    <w:p>
+      <w:r>
+        <w:t xml:space="preserve">22. And </w:t>
+      </w:r>
+      <w:proofErr w:type="gramStart"/>
+      <w:r>
+        <w:rPr>
+          <w:lang w:val="en-US"/>
+        </w:rPr>
+        <w:t>List</w:t>
+      </w:r>
+      <w:proofErr w:type="gramEnd"/>
+      <w:r>
+        <w:rPr>
+          <w:lang w:val="en-US"/>
+        </w:rPr>
+        <w:t xml:space="preserve"> all files and directories in the current directory with sizes in human-readable format.</w:t>
+      </w:r>
+      <w:r>
+        <w:t> </w:t>
+      </w:r>
+      <w:r>
+        <w:t xml:space="preserve"> </w:t>
+      </w:r>
+    </w:p>
+    <w:p>
+      <w:r>
+        <w:drawing>
+          <wp:inline distT="0" distB="0" distL="0" distR="0" wp14:anchorId="3CFA88D1" wp14:editId="075AFBF6">
+            <wp:extent cx="5731510" cy="1772920"/>
+            <wp:effectExtent l="0" t="0" r="2540" b="0"/>
+            <wp:docPr id="583620574" name="Picture 1"/>
+            <wp:cNvGraphicFramePr>
+              <a:graphicFrameLocks xmlns:a="http://schemas.openxmlformats.org/drawingml/2006/main" noChangeAspect="1"/>
+            </wp:cNvGraphicFramePr>
+            <a:graphic xmlns:a="http://schemas.openxmlformats.org/drawingml/2006/main">
+              <a:graphicData uri="http://schemas.openxmlformats.org/drawingml/2006/picture">
+                <pic:pic xmlns:pic="http://schemas.openxmlformats.org/drawingml/2006/picture">
+                  <pic:nvPicPr>
+                    <pic:cNvPr id="583620574" name=""/>
+                    <pic:cNvPicPr/>
+                  </pic:nvPicPr>
+                  <pic:blipFill>
+                    <a:blip r:embed="rId21"/>
+                    <a:stretch>
+                      <a:fillRect/>
+                    </a:stretch>
+                  </pic:blipFill>
+                  <pic:spPr>
+                    <a:xfrm>
+                      <a:off x="0" y="0"/>
+                      <a:ext cx="5731510" cy="1772920"/>
+                    </a:xfrm>
+                    <a:prstGeom prst="rect">
+                      <a:avLst/>
+                    </a:prstGeom>
+                  </pic:spPr>
+                </pic:pic>
+              </a:graphicData>
+            </a:graphic>
+          </wp:inline>
+        </w:drawing>
+      </w:r>
+    </w:p>
+    <w:p/>
+    <w:p>
+      <w:r>
+        <w:t>23.</w:t>
+      </w:r>
+      <w:r>
+        <w:rPr>
+          <w:rFonts w:ascii="Aptos" w:hAnsi="Aptos"/>
+          <w:color w:val="000000"/>
+          <w:shd w:val="clear" w:color="auto" w:fill="FFFFFF"/>
+          <w:lang w:val="en-US"/>
+        </w:rPr>
+        <w:t xml:space="preserve"> </w:t>
+      </w:r>
+      <w:r>
+        <w:rPr>
+          <w:lang w:val="en-US"/>
+        </w:rPr>
+        <w:t>Print the hostname a computer.</w:t>
+      </w:r>
+      <w:r>
+        <w:t> </w:t>
+      </w:r>
+    </w:p>
+    <w:p>
+      <w:r>
+        <w:drawing>
+          <wp:inline distT="0" distB="0" distL="0" distR="0" wp14:anchorId="321D5647" wp14:editId="2A83B018">
+            <wp:extent cx="5391902" cy="704948"/>
+            <wp:effectExtent l="0" t="0" r="0" b="0"/>
+            <wp:docPr id="1627271917" name="Picture 1"/>
+            <wp:cNvGraphicFramePr>
+              <a:graphicFrameLocks xmlns:a="http://schemas.openxmlformats.org/drawingml/2006/main" noChangeAspect="1"/>
+            </wp:cNvGraphicFramePr>
+            <a:graphic xmlns:a="http://schemas.openxmlformats.org/drawingml/2006/main">
+              <a:graphicData uri="http://schemas.openxmlformats.org/drawingml/2006/picture">
+                <pic:pic xmlns:pic="http://schemas.openxmlformats.org/drawingml/2006/picture">
+                  <pic:nvPicPr>
+                    <pic:cNvPr id="1627271917" name=""/>
+                    <pic:cNvPicPr/>
+                  </pic:nvPicPr>
+                  <pic:blipFill>
+                    <a:blip r:embed="rId22"/>
+                    <a:stretch>
+                      <a:fillRect/>
+                    </a:stretch>
+                  </pic:blipFill>
+                  <pic:spPr>
+                    <a:xfrm>
+                      <a:off x="0" y="0"/>
+                      <a:ext cx="5391902" cy="704948"/>
+                    </a:xfrm>
+                    <a:prstGeom prst="rect">
+                      <a:avLst/>
+                    </a:prstGeom>
+                  </pic:spPr>
+                </pic:pic>
+              </a:graphicData>
+            </a:graphic>
+          </wp:inline>
+        </w:drawing>
+      </w:r>
+      <w:r>
+        <w:t xml:space="preserve"> </w:t>
+      </w:r>
+    </w:p>
+    <w:p/>
+    <w:p>
+      <w:r>
+        <w:t xml:space="preserve">24. </w:t>
+      </w:r>
+      <w:r>
+        <w:rPr>
+          <w:lang w:val="en-US"/>
+        </w:rPr>
+        <w:t>Command to Kill a particular process running in your system.</w:t>
+      </w:r>
+      <w:r>
+        <w:t> </w:t>
+      </w:r>
+    </w:p>
+    <w:p>
+      <w:r>
+        <w:lastRenderedPageBreak/>
+        <w:t>First created a temporary process (</w:t>
+      </w:r>
+      <w:r>
+        <w:t>Each sleep 1000 &amp; command runs in the background and becomes a new process.</w:t>
+      </w:r>
+      <w:r>
+        <w:t xml:space="preserve"> &amp; is used to run process in background). And then killed this process.</w:t>
+      </w:r>
+    </w:p>
+    <w:p>
+      <w:r>
+        <w:drawing>
+          <wp:inline distT="0" distB="0" distL="0" distR="0" wp14:anchorId="5DB8CFFF" wp14:editId="16105FA7">
+            <wp:extent cx="4572638" cy="2257740"/>
+            <wp:effectExtent l="0" t="0" r="0" b="9525"/>
+            <wp:docPr id="22127636" name="Picture 1"/>
+            <wp:cNvGraphicFramePr>
+              <a:graphicFrameLocks xmlns:a="http://schemas.openxmlformats.org/drawingml/2006/main" noChangeAspect="1"/>
+            </wp:cNvGraphicFramePr>
+            <a:graphic xmlns:a="http://schemas.openxmlformats.org/drawingml/2006/main">
+              <a:graphicData uri="http://schemas.openxmlformats.org/drawingml/2006/picture">
+                <pic:pic xmlns:pic="http://schemas.openxmlformats.org/drawingml/2006/picture">
+                  <pic:nvPicPr>
+                    <pic:cNvPr id="22127636" name=""/>
+                    <pic:cNvPicPr/>
+                  </pic:nvPicPr>
+                  <pic:blipFill>
+                    <a:blip r:embed="rId23"/>
+                    <a:stretch>
+                      <a:fillRect/>
+                    </a:stretch>
+                  </pic:blipFill>
+                  <pic:spPr>
+                    <a:xfrm>
+                      <a:off x="0" y="0"/>
+                      <a:ext cx="4572638" cy="2257740"/>
+                    </a:xfrm>
+                    <a:prstGeom prst="rect">
+                      <a:avLst/>
+                    </a:prstGeom>
+                  </pic:spPr>
+                </pic:pic>
+              </a:graphicData>
+            </a:graphic>
+          </wp:inline>
+        </w:drawing>
+      </w:r>
+    </w:p>
+    <w:p/>
+    <w:p>
+      <w:pPr>
+        <w:numPr>
+          <w:ilvl w:val="0"/>
+          <w:numId w:val="5"/>
+        </w:numPr>
+        <w:tabs>
+          <w:tab w:val="clear" w:pos="720"/>
+          <w:tab w:val="num" w:pos="360"/>
+        </w:tabs>
+        <w:ind w:left="360"/>
+      </w:pPr>
+      <w:r>
+        <w:rPr>
+          <w:lang w:val="en-US"/>
+        </w:rPr>
+        <w:t xml:space="preserve">Create two files test1.txt and test2.txt with some content and merge it to a single file </w:t>
+      </w:r>
+      <w:proofErr w:type="spellStart"/>
+      <w:r>
+        <w:rPr>
+          <w:lang w:val="en-US"/>
+        </w:rPr>
+        <w:t>test.text</w:t>
+      </w:r>
+      <w:proofErr w:type="spellEnd"/>
+      <w:r>
+        <w:t> </w:t>
+      </w:r>
+    </w:p>
+    <w:p>
+      <w:pPr>
+        <w:ind w:left="360"/>
+      </w:pPr>
+      <w:r>
+        <w:drawing>
+          <wp:inline distT="0" distB="0" distL="0" distR="0" wp14:anchorId="6D93113B" wp14:editId="25C3B840">
+            <wp:extent cx="5731510" cy="1981835"/>
+            <wp:effectExtent l="0" t="0" r="2540" b="0"/>
+            <wp:docPr id="69055905" name="Picture 1"/>
+            <wp:cNvGraphicFramePr>
+              <a:graphicFrameLocks xmlns:a="http://schemas.openxmlformats.org/drawingml/2006/main" noChangeAspect="1"/>
+            </wp:cNvGraphicFramePr>
+            <a:graphic xmlns:a="http://schemas.openxmlformats.org/drawingml/2006/main">
+              <a:graphicData uri="http://schemas.openxmlformats.org/drawingml/2006/picture">
+                <pic:pic xmlns:pic="http://schemas.openxmlformats.org/drawingml/2006/picture">
+                  <pic:nvPicPr>
+                    <pic:cNvPr id="69055905" name=""/>
+                    <pic:cNvPicPr/>
+                  </pic:nvPicPr>
+                  <pic:blipFill>
+                    <a:blip r:embed="rId24"/>
+                    <a:stretch>
+                      <a:fillRect/>
+                    </a:stretch>
+                  </pic:blipFill>
+                  <pic:spPr>
+                    <a:xfrm>
+                      <a:off x="0" y="0"/>
+                      <a:ext cx="5731510" cy="1981835"/>
+                    </a:xfrm>
+                    <a:prstGeom prst="rect">
+                      <a:avLst/>
+                    </a:prstGeom>
+                  </pic:spPr>
+                </pic:pic>
+              </a:graphicData>
+            </a:graphic>
+          </wp:inline>
+        </w:drawing>
+      </w:r>
+    </w:p>
+    <w:p>
+      <w:pPr>
+        <w:numPr>
+          <w:ilvl w:val="0"/>
+          <w:numId w:val="9"/>
+        </w:numPr>
+      </w:pPr>
+      <w:r>
+        <w:t xml:space="preserve">cat reads and </w:t>
+      </w:r>
+      <w:r>
+        <w:rPr>
+          <w:b/>
+          <w:bCs/>
+        </w:rPr>
+        <w:t>prints</w:t>
+      </w:r>
+      <w:r>
+        <w:t xml:space="preserve"> the content of files.</w:t>
+      </w:r>
+    </w:p>
+    <w:p>
+      <w:pPr>
+        <w:numPr>
+          <w:ilvl w:val="0"/>
+          <w:numId w:val="9"/>
+        </w:numPr>
+      </w:pPr>
+      <w:r>
+        <w:t>&gt; redirects the combined output into test.txt.</w:t>
+      </w:r>
+    </w:p>
+    <w:p>
+      <w:pPr>
+        <w:ind w:left="360"/>
+      </w:pPr>
+      <w:r>
+        <w:drawing>
+          <wp:inline distT="0" distB="0" distL="0" distR="0" wp14:anchorId="757F8031" wp14:editId="492ED5D5">
+            <wp:extent cx="5731510" cy="1305560"/>
+            <wp:effectExtent l="0" t="0" r="2540" b="8890"/>
+            <wp:docPr id="807813913" name="Picture 1"/>
+            <wp:cNvGraphicFramePr>
+              <a:graphicFrameLocks xmlns:a="http://schemas.openxmlformats.org/drawingml/2006/main" noChangeAspect="1"/>
+            </wp:cNvGraphicFramePr>
+            <a:graphic xmlns:a="http://schemas.openxmlformats.org/drawingml/2006/main">
+              <a:graphicData uri="http://schemas.openxmlformats.org/drawingml/2006/picture">
+                <pic:pic xmlns:pic="http://schemas.openxmlformats.org/drawingml/2006/picture">
+                  <pic:nvPicPr>
+                    <pic:cNvPr id="807813913" name=""/>
+                    <pic:cNvPicPr/>
+                  </pic:nvPicPr>
+                  <pic:blipFill>
+                    <a:blip r:embed="rId25"/>
+                    <a:stretch>
+                      <a:fillRect/>
+                    </a:stretch>
+                  </pic:blipFill>
+                  <pic:spPr>
+                    <a:xfrm>
+                      <a:off x="0" y="0"/>
+                      <a:ext cx="5731510" cy="1305560"/>
+                    </a:xfrm>
+                    <a:prstGeom prst="rect">
+                      <a:avLst/>
+                    </a:prstGeom>
+                  </pic:spPr>
+                </pic:pic>
+              </a:graphicData>
+            </a:graphic>
+          </wp:inline>
+        </w:drawing>
+      </w:r>
+    </w:p>
+    <w:p>
+      <w:pPr>
+        <w:numPr>
+          <w:ilvl w:val="0"/>
+          <w:numId w:val="6"/>
+        </w:numPr>
+        <w:tabs>
+          <w:tab w:val="clear" w:pos="720"/>
+          <w:tab w:val="num" w:pos="360"/>
+        </w:tabs>
+        <w:ind w:left="360"/>
+      </w:pPr>
+      <w:r>
+        <w:rPr>
+          <w:lang w:val="en-US"/>
+        </w:rPr>
+        <w:t>Create a shell script test.sh with the content given at the bottom and execute it.</w:t>
+      </w:r>
+      <w:r>
+        <w:t> </w:t>
+      </w:r>
+    </w:p>
+    <w:p>
+      <w:r>
+        <w:lastRenderedPageBreak/>
+        <w:drawing>
+          <wp:inline distT="0" distB="0" distL="0" distR="0" wp14:anchorId="206B752F" wp14:editId="5EBD6247">
+            <wp:extent cx="5731510" cy="4214495"/>
+            <wp:effectExtent l="0" t="0" r="2540" b="0"/>
+            <wp:docPr id="1491523463" name="Picture 1"/>
+            <wp:cNvGraphicFramePr>
+              <a:graphicFrameLocks xmlns:a="http://schemas.openxmlformats.org/drawingml/2006/main" noChangeAspect="1"/>
+            </wp:cNvGraphicFramePr>
+            <a:graphic xmlns:a="http://schemas.openxmlformats.org/drawingml/2006/main">
+              <a:graphicData uri="http://schemas.openxmlformats.org/drawingml/2006/picture">
+                <pic:pic xmlns:pic="http://schemas.openxmlformats.org/drawingml/2006/picture">
+                  <pic:nvPicPr>
+                    <pic:cNvPr id="1491523463" name=""/>
+                    <pic:cNvPicPr/>
+                  </pic:nvPicPr>
+                  <pic:blipFill>
+                    <a:blip r:embed="rId26"/>
+                    <a:stretch>
+                      <a:fillRect/>
+                    </a:stretch>
+                  </pic:blipFill>
+                  <pic:spPr>
+                    <a:xfrm>
+                      <a:off x="0" y="0"/>
+                      <a:ext cx="5731510" cy="4214495"/>
+                    </a:xfrm>
+                    <a:prstGeom prst="rect">
+                      <a:avLst/>
+                    </a:prstGeom>
+                  </pic:spPr>
+                </pic:pic>
+              </a:graphicData>
+            </a:graphic>
+          </wp:inline>
+        </w:drawing>
+      </w:r>
+    </w:p>
+    <w:p/>
+    <w:p>
+      <w:pPr>
+        <w:numPr>
+          <w:ilvl w:val="0"/>
+          <w:numId w:val="7"/>
+        </w:numPr>
+        <w:tabs>
+          <w:tab w:val="clear" w:pos="720"/>
+          <w:tab w:val="num" w:pos="360"/>
+        </w:tabs>
+        <w:ind w:left="360"/>
+      </w:pPr>
+      <w:r>
+        <w:rPr>
+          <w:lang w:val="en-US"/>
+        </w:rPr>
+        <w:t xml:space="preserve">Tes.sh creates </w:t>
+      </w:r>
+      <w:proofErr w:type="spellStart"/>
+      <w:r>
+        <w:rPr>
+          <w:lang w:val="en-US"/>
+        </w:rPr>
+        <w:t>mutiple</w:t>
+      </w:r>
+      <w:proofErr w:type="spellEnd"/>
+      <w:r>
+        <w:rPr>
+          <w:lang w:val="en-US"/>
+        </w:rPr>
+        <w:t xml:space="preserve"> </w:t>
+      </w:r>
+      <w:proofErr w:type="gramStart"/>
+      <w:r>
+        <w:rPr>
+          <w:lang w:val="en-US"/>
+        </w:rPr>
+        <w:t>process ,</w:t>
+      </w:r>
+      <w:proofErr w:type="gramEnd"/>
+      <w:r>
+        <w:rPr>
+          <w:lang w:val="en-US"/>
+        </w:rPr>
+        <w:t xml:space="preserve"> </w:t>
+      </w:r>
+      <w:proofErr w:type="spellStart"/>
+      <w:r>
+        <w:rPr>
+          <w:lang w:val="en-US"/>
+        </w:rPr>
+        <w:t>wrtie</w:t>
+      </w:r>
+      <w:proofErr w:type="spellEnd"/>
+      <w:r>
+        <w:rPr>
+          <w:lang w:val="en-US"/>
+        </w:rPr>
+        <w:t xml:space="preserve"> command to kill some specific process with given </w:t>
+      </w:r>
+      <w:proofErr w:type="spellStart"/>
+      <w:r>
+        <w:rPr>
+          <w:lang w:val="en-US"/>
+        </w:rPr>
+        <w:t>pid</w:t>
+      </w:r>
+      <w:proofErr w:type="spellEnd"/>
+      <w:r>
+        <w:rPr>
+          <w:lang w:val="en-US"/>
+        </w:rPr>
+        <w:t>.</w:t>
+      </w:r>
+      <w:r>
+        <w:t> </w:t>
+      </w:r>
+    </w:p>
+    <w:p>
+      <w:pPr>
+        <w:ind w:left="360"/>
+      </w:pPr>
+      <w:r>
+        <w:drawing>
+          <wp:inline distT="0" distB="0" distL="0" distR="0" wp14:anchorId="388F3B43" wp14:editId="69E1489D">
+            <wp:extent cx="5068007" cy="3038899"/>
+            <wp:effectExtent l="0" t="0" r="0" b="9525"/>
+            <wp:docPr id="1368391923" name="Picture 1"/>
+            <wp:cNvGraphicFramePr>
+              <a:graphicFrameLocks xmlns:a="http://schemas.openxmlformats.org/drawingml/2006/main" noChangeAspect="1"/>
+            </wp:cNvGraphicFramePr>
+            <a:graphic xmlns:a="http://schemas.openxmlformats.org/drawingml/2006/main">
+              <a:graphicData uri="http://schemas.openxmlformats.org/drawingml/2006/picture">
+                <pic:pic xmlns:pic="http://schemas.openxmlformats.org/drawingml/2006/picture">
+                  <pic:nvPicPr>
+                    <pic:cNvPr id="1368391923" name=""/>
+                    <pic:cNvPicPr/>
+                  </pic:nvPicPr>
+                  <pic:blipFill>
+                    <a:blip r:embed="rId27"/>
+                    <a:stretch>
+                      <a:fillRect/>
+                    </a:stretch>
+                  </pic:blipFill>
+                  <pic:spPr>
+                    <a:xfrm>
+                      <a:off x="0" y="0"/>
+                      <a:ext cx="5068007" cy="3038899"/>
+                    </a:xfrm>
+                    <a:prstGeom prst="rect">
+                      <a:avLst/>
+                    </a:prstGeom>
+                  </pic:spPr>
+                </pic:pic>
+              </a:graphicData>
+            </a:graphic>
+          </wp:inline>
+        </w:drawing>
+      </w:r>
+    </w:p>
+    <w:p>
+      <w:pPr>
+        <w:numPr>
+          <w:ilvl w:val="0"/>
+          <w:numId w:val="8"/>
+        </w:numPr>
+        <w:tabs>
+          <w:tab w:val="clear" w:pos="720"/>
+          <w:tab w:val="num" w:pos="360"/>
+        </w:tabs>
+        <w:ind w:left="360"/>
+      </w:pPr>
+      <w:r>
+        <w:rPr>
+          <w:lang w:val="en-US"/>
+        </w:rPr>
+        <w:t xml:space="preserve">Write a shell script which take your name as </w:t>
+      </w:r>
+      <w:proofErr w:type="gramStart"/>
+      <w:r>
+        <w:rPr>
+          <w:lang w:val="en-US"/>
+        </w:rPr>
+        <w:t>input</w:t>
+      </w:r>
+      <w:proofErr w:type="gramEnd"/>
+      <w:r>
+        <w:rPr>
+          <w:lang w:val="en-US"/>
+        </w:rPr>
+        <w:t xml:space="preserve"> and it will </w:t>
+      </w:r>
+      <w:proofErr w:type="spellStart"/>
+      <w:r>
+        <w:rPr>
+          <w:lang w:val="en-US"/>
+        </w:rPr>
+        <w:t>dispaly</w:t>
+      </w:r>
+      <w:proofErr w:type="spellEnd"/>
+      <w:r>
+        <w:rPr>
+          <w:lang w:val="en-US"/>
+        </w:rPr>
+        <w:t xml:space="preserve"> Hello your name.</w:t>
+      </w:r>
+      <w:r>
+        <w:t> </w:t>
+      </w:r>
+    </w:p>
+    <w:p>
+      <w:pPr>
+        <w:rPr>
+          <w:b/>
+          <w:bCs/>
+        </w:rPr>
+      </w:pPr>
+      <w:proofErr w:type="gramStart"/>
+      <w:r>
+        <w:rPr>
+          <w:b/>
+          <w:bCs/>
+        </w:rPr>
+        <w:lastRenderedPageBreak/>
+        <w:t>#!/</w:t>
+      </w:r>
+      <w:proofErr w:type="gramEnd"/>
+      <w:r>
+        <w:rPr>
+          <w:b/>
+          <w:bCs/>
+        </w:rPr>
+        <w:t>bin/bash — Meaning</w:t>
+      </w:r>
+    </w:p>
+    <w:p>
+      <w:pPr>
+        <w:numPr>
+          <w:ilvl w:val="0"/>
+          <w:numId w:val="10"/>
+        </w:numPr>
+      </w:pPr>
+      <w:r>
+        <w:t>#! tells the system this is a script and should be run by an interpreter.</w:t>
+      </w:r>
+    </w:p>
+    <w:p>
+      <w:pPr>
+        <w:numPr>
+          <w:ilvl w:val="0"/>
+          <w:numId w:val="10"/>
+        </w:numPr>
+      </w:pPr>
+      <w:r>
+        <w:t xml:space="preserve">/bin/bash specifies </w:t>
+      </w:r>
+      <w:r>
+        <w:rPr>
+          <w:b/>
+          <w:bCs/>
+        </w:rPr>
+        <w:t>which interpreter</w:t>
+      </w:r>
+      <w:r>
+        <w:t xml:space="preserve"> should run the script — in this case, the </w:t>
+      </w:r>
+      <w:r>
+        <w:rPr>
+          <w:b/>
+          <w:bCs/>
+        </w:rPr>
+        <w:t>Bash shell</w:t>
+      </w:r>
+      <w:r>
+        <w:t>.</w:t>
+      </w:r>
+    </w:p>
+    <w:p>
+      <w:pPr>
+        <w:rPr>
+          <w:b/>
+          <w:bCs/>
+        </w:rPr>
+      </w:pPr>
+      <w:r>
+        <w:rPr>
+          <w:b/>
+          <w:bCs/>
+        </w:rPr>
+        <w:t>Why it's important</w:t>
+      </w:r>
+    </w:p>
+    <w:p>
+      <w:r>
+        <w:t xml:space="preserve">Without </w:t>
+      </w:r>
+      <w:proofErr w:type="gramStart"/>
+      <w:r>
+        <w:t>#!/</w:t>
+      </w:r>
+      <w:proofErr w:type="gramEnd"/>
+      <w:r>
+        <w:t xml:space="preserve">bin/bash, </w:t>
+      </w:r>
+      <w:r>
+        <w:t>the</w:t>
+      </w:r>
+      <w:r>
+        <w:t xml:space="preserve"> script might:</w:t>
+      </w:r>
+    </w:p>
+    <w:p>
+      <w:pPr>
+        <w:numPr>
+          <w:ilvl w:val="0"/>
+          <w:numId w:val="11"/>
+        </w:numPr>
+      </w:pPr>
+      <w:r>
+        <w:t xml:space="preserve">Be executed by a </w:t>
+      </w:r>
+      <w:r>
+        <w:rPr>
+          <w:b/>
+          <w:bCs/>
+        </w:rPr>
+        <w:t>different shell</w:t>
+      </w:r>
+      <w:r>
+        <w:t xml:space="preserve"> (like </w:t>
+      </w:r>
+      <w:proofErr w:type="spellStart"/>
+      <w:r>
+        <w:t>sh</w:t>
+      </w:r>
+      <w:proofErr w:type="spellEnd"/>
+      <w:r>
+        <w:t xml:space="preserve">, dash, </w:t>
+      </w:r>
+      <w:proofErr w:type="spellStart"/>
+      <w:r>
+        <w:t>zsh</w:t>
+      </w:r>
+      <w:proofErr w:type="spellEnd"/>
+      <w:r>
+        <w:t>, etc.).</w:t>
+      </w:r>
+    </w:p>
+    <w:p>
+      <w:pPr>
+        <w:numPr>
+          <w:ilvl w:val="0"/>
+          <w:numId w:val="11"/>
+        </w:numPr>
+      </w:pPr>
+      <w:r>
+        <w:t xml:space="preserve">Behave unexpectedly or throw errors if </w:t>
+      </w:r>
+      <w:r>
+        <w:t>the</w:t>
+      </w:r>
+      <w:r>
+        <w:t xml:space="preserve"> script uses </w:t>
+      </w:r>
+      <w:r>
+        <w:rPr>
+          <w:b/>
+          <w:bCs/>
+        </w:rPr>
+        <w:t>Bash-specific features</w:t>
+      </w:r>
+      <w:r>
+        <w:t>.</w:t>
+      </w:r>
+    </w:p>
+    <w:p/>
+    <w:p>
+      <w:pPr>
+        <w:ind w:left="360"/>
+      </w:pPr>
+      <w:r>
+        <w:drawing>
+          <wp:inline distT="0" distB="0" distL="0" distR="0" wp14:anchorId="397F5D78" wp14:editId="66319943">
+            <wp:extent cx="4686954" cy="3153215"/>
+            <wp:effectExtent l="0" t="0" r="0" b="9525"/>
+            <wp:docPr id="900154524" name="Picture 1"/>
+            <wp:cNvGraphicFramePr>
+              <a:graphicFrameLocks xmlns:a="http://schemas.openxmlformats.org/drawingml/2006/main" noChangeAspect="1"/>
+            </wp:cNvGraphicFramePr>
+            <a:graphic xmlns:a="http://schemas.openxmlformats.org/drawingml/2006/main">
+              <a:graphicData uri="http://schemas.openxmlformats.org/drawingml/2006/picture">
+                <pic:pic xmlns:pic="http://schemas.openxmlformats.org/drawingml/2006/picture">
+                  <pic:nvPicPr>
+                    <pic:cNvPr id="900154524" name=""/>
+                    <pic:cNvPicPr/>
+                  </pic:nvPicPr>
+                  <pic:blipFill>
+                    <a:blip r:embed="rId28"/>
+                    <a:stretch>
+                      <a:fillRect/>
+                    </a:stretch>
+                  </pic:blipFill>
+                  <pic:spPr>
+                    <a:xfrm>
+                      <a:off x="0" y="0"/>
+                      <a:ext cx="4686954" cy="3153215"/>
+                    </a:xfrm>
+                    <a:prstGeom prst="rect">
+                      <a:avLst/>
+                    </a:prstGeom>
+                  </pic:spPr>
+                </pic:pic>
+              </a:graphicData>
+            </a:graphic>
+          </wp:inline>
+        </w:drawing>
+      </w:r>
+    </w:p>
+    <w:p>
+      <w:pPr>
+        <w:numPr>
+          <w:ilvl w:val="0"/>
+          <w:numId w:val="8"/>
+        </w:numPr>
+        <w:tabs>
+          <w:tab w:val="clear" w:pos="720"/>
+          <w:tab w:val="num" w:pos="360"/>
+        </w:tabs>
+        <w:ind w:left="360"/>
+      </w:pPr>
+    </w:p>
     <w:p/>
     <w:p/>
     <w:p/>
@@ -1326,6 +2901,119 @@
 <file path=word/numbering.xml><?xml version="1.0" encoding="utf-8"?>
 <w:numbering xmlns:wpc="http://schemas.microsoft.com/office/word/2010/wordprocessingCanvas" xmlns:cx="http://schemas.microsoft.com/office/drawing/2014/chartex" xmlns:cx1="http://schemas.microsoft.com/office/drawing/2015/9/8/chartex" xmlns:cx2="http://schemas.microsoft.com/office/drawing/2015/10/21/chartex" xmlns:cx3="http://schemas.microsoft.com/office/drawing/2016/5/9/chartex" xmlns:cx4="http://schemas.microsoft.com/office/drawing/2016/5/10/chartex" xmlns:cx5="http://schemas.microsoft.com/office/drawing/2016/5/11/chartex" xmlns:cx6="http://schemas.microsoft.com/office/drawing/2016/5/12/chartex" xmlns:cx7="http://schemas.microsoft.com/office/drawing/2016/5/13/chartex" xmlns:cx8="http://schemas.microsoft.com/office/drawing/2016/5/14/chartex" xmlns:mc="http://schemas.openxmlformats.org/markup-compatibility/2006" xmlns:aink="http://schemas.microsoft.com/office/drawing/2016/ink" xmlns:am3d="http://schemas.microsoft.com/office/drawing/2017/model3d" xmlns:o="urn:schemas-microsoft-com:office:office" xmlns:oel="http://schemas.microsoft.com/office/2019/extlst" xmlns:r="http://schemas.openxmlformats.org/officeDocument/2006/relationships" xmlns:m="http://schemas.openxmlformats.org/officeDocument/2006/math" xmlns:v="urn:schemas-microsoft-com:vml" xmlns:wp14="http://schemas.microsoft.com/office/word/2010/wordprocessingDrawing" xmlns:wp="http://schemas.openxmlformats.org/drawingml/2006/wordprocessingDrawing" xmlns:w10="urn:schemas-microsoft-com:office:word" xmlns:w="http://schemas.openxmlformats.org/wordprocessingml/2006/main" xmlns:w14="http://schemas.microsoft.com/office/word/2010/wordml" xmlns:w15="http://schemas.microsoft.com/office/word/2012/wordml" xmlns:w16cex="http://schemas.microsoft.com/office/word/2018/wordml/cex" xmlns:w16cid="http://schemas.microsoft.com/office/word/2016/wordml/cid" xmlns:w16="http://schemas.microsoft.com/office/word/2018/wordml" xmlns:w16sdtdh="http://schemas.microsoft.com/office/word/2020/wordml/sdtdatahash" xmlns:w16se="http://schemas.microsoft.com/office/word/2015/wordml/symex" xmlns:wpg="http://schemas.microsoft.com/office/word/2010/wordprocessingGroup" xmlns:wpi="http://schemas.microsoft.com/office/word/2010/wordprocessingInk" xmlns:wne="http://schemas.microsoft.com/office/word/2006/wordml" xmlns:wps="http://schemas.microsoft.com/office/word/2010/wordprocessingShape" mc:Ignorable="w14 w15 w16se w16cid w16 w16cex w16sdtdh wp14">
   <w:abstractNum w:abstractNumId="0" w15:restartNumberingAfterBreak="0">
+    <w:nsid w:val="11A763D0"/>
+    <w:multiLevelType w:val="multilevel"/>
+    <w:tmpl w:val="CFDA7AAA"/>
+    <w:lvl w:ilvl="0">
+      <w:start w:val="27"/>
+      <w:numFmt w:val="decimal"/>
+      <w:lvlText w:val="%1."/>
+      <w:lvlJc w:val="left"/>
+      <w:pPr>
+        <w:tabs>
+          <w:tab w:val="num" w:pos="720"/>
+        </w:tabs>
+        <w:ind w:left="720" w:hanging="360"/>
+      </w:pPr>
+    </w:lvl>
+    <w:lvl w:ilvl="1" w:tentative="1">
+      <w:start w:val="1"/>
+      <w:numFmt w:val="decimal"/>
+      <w:lvlText w:val="%2."/>
+      <w:lvlJc w:val="left"/>
+      <w:pPr>
+        <w:tabs>
+          <w:tab w:val="num" w:pos="1440"/>
+        </w:tabs>
+        <w:ind w:left="1440" w:hanging="360"/>
+      </w:pPr>
+    </w:lvl>
+    <w:lvl w:ilvl="2" w:tentative="1">
+      <w:start w:val="1"/>
+      <w:numFmt w:val="decimal"/>
+      <w:lvlText w:val="%3."/>
+      <w:lvlJc w:val="left"/>
+      <w:pPr>
+        <w:tabs>
+          <w:tab w:val="num" w:pos="2160"/>
+        </w:tabs>
+        <w:ind w:left="2160" w:hanging="360"/>
+      </w:pPr>
+    </w:lvl>
+    <w:lvl w:ilvl="3" w:tentative="1">
+      <w:start w:val="1"/>
+      <w:numFmt w:val="decimal"/>
+      <w:lvlText w:val="%4."/>
+      <w:lvlJc w:val="left"/>
+      <w:pPr>
+        <w:tabs>
+          <w:tab w:val="num" w:pos="2880"/>
+        </w:tabs>
+        <w:ind w:left="2880" w:hanging="360"/>
+      </w:pPr>
+    </w:lvl>
+    <w:lvl w:ilvl="4" w:tentative="1">
+      <w:start w:val="1"/>
+      <w:numFmt w:val="decimal"/>
+      <w:lvlText w:val="%5."/>
+      <w:lvlJc w:val="left"/>
+      <w:pPr>
+        <w:tabs>
+          <w:tab w:val="num" w:pos="3600"/>
+        </w:tabs>
+        <w:ind w:left="3600" w:hanging="360"/>
+      </w:pPr>
+    </w:lvl>
+    <w:lvl w:ilvl="5" w:tentative="1">
+      <w:start w:val="1"/>
+      <w:numFmt w:val="decimal"/>
+      <w:lvlText w:val="%6."/>
+      <w:lvlJc w:val="left"/>
+      <w:pPr>
+        <w:tabs>
+          <w:tab w:val="num" w:pos="4320"/>
+        </w:tabs>
+        <w:ind w:left="4320" w:hanging="360"/>
+      </w:pPr>
+    </w:lvl>
+    <w:lvl w:ilvl="6" w:tentative="1">
+      <w:start w:val="1"/>
+      <w:numFmt w:val="decimal"/>
+      <w:lvlText w:val="%7."/>
+      <w:lvlJc w:val="left"/>
+      <w:pPr>
+        <w:tabs>
+          <w:tab w:val="num" w:pos="5040"/>
+        </w:tabs>
+        <w:ind w:left="5040" w:hanging="360"/>
+      </w:pPr>
+    </w:lvl>
+    <w:lvl w:ilvl="7" w:tentative="1">
+      <w:start w:val="1"/>
+      <w:numFmt w:val="decimal"/>
+      <w:lvlText w:val="%8."/>
+      <w:lvlJc w:val="left"/>
+      <w:pPr>
+        <w:tabs>
+          <w:tab w:val="num" w:pos="5760"/>
+        </w:tabs>
+        <w:ind w:left="5760" w:hanging="360"/>
+      </w:pPr>
+    </w:lvl>
+    <w:lvl w:ilvl="8" w:tentative="1">
+      <w:start w:val="1"/>
+      <w:numFmt w:val="decimal"/>
+      <w:lvlText w:val="%9."/>
+      <w:lvlJc w:val="left"/>
+      <w:pPr>
+        <w:tabs>
+          <w:tab w:val="num" w:pos="6480"/>
+        </w:tabs>
+        <w:ind w:left="6480" w:hanging="360"/>
+      </w:pPr>
+    </w:lvl>
+  </w:abstractNum>
+  <w:abstractNum w:abstractNumId="1" w15:restartNumberingAfterBreak="0">
     <w:nsid w:val="167D7BB0"/>
     <w:multiLevelType w:val="multilevel"/>
     <w:tmpl w:val="B80E9D72"/>
@@ -1442,7 +3130,757 @@
       </w:pPr>
     </w:lvl>
   </w:abstractNum>
-  <w:abstractNum w:abstractNumId="1" w15:restartNumberingAfterBreak="0">
+  <w:abstractNum w:abstractNumId="2" w15:restartNumberingAfterBreak="0">
+    <w:nsid w:val="2B7F618C"/>
+    <w:multiLevelType w:val="multilevel"/>
+    <w:tmpl w:val="E1E24212"/>
+    <w:lvl w:ilvl="0">
+      <w:start w:val="26"/>
+      <w:numFmt w:val="decimal"/>
+      <w:lvlText w:val="%1."/>
+      <w:lvlJc w:val="left"/>
+      <w:pPr>
+        <w:tabs>
+          <w:tab w:val="num" w:pos="720"/>
+        </w:tabs>
+        <w:ind w:left="720" w:hanging="360"/>
+      </w:pPr>
+    </w:lvl>
+    <w:lvl w:ilvl="1" w:tentative="1">
+      <w:start w:val="1"/>
+      <w:numFmt w:val="decimal"/>
+      <w:lvlText w:val="%2."/>
+      <w:lvlJc w:val="left"/>
+      <w:pPr>
+        <w:tabs>
+          <w:tab w:val="num" w:pos="1440"/>
+        </w:tabs>
+        <w:ind w:left="1440" w:hanging="360"/>
+      </w:pPr>
+    </w:lvl>
+    <w:lvl w:ilvl="2" w:tentative="1">
+      <w:start w:val="1"/>
+      <w:numFmt w:val="decimal"/>
+      <w:lvlText w:val="%3."/>
+      <w:lvlJc w:val="left"/>
+      <w:pPr>
+        <w:tabs>
+          <w:tab w:val="num" w:pos="2160"/>
+        </w:tabs>
+        <w:ind w:left="2160" w:hanging="360"/>
+      </w:pPr>
+    </w:lvl>
+    <w:lvl w:ilvl="3" w:tentative="1">
+      <w:start w:val="1"/>
+      <w:numFmt w:val="decimal"/>
+      <w:lvlText w:val="%4."/>
+      <w:lvlJc w:val="left"/>
+      <w:pPr>
+        <w:tabs>
+          <w:tab w:val="num" w:pos="2880"/>
+        </w:tabs>
+        <w:ind w:left="2880" w:hanging="360"/>
+      </w:pPr>
+    </w:lvl>
+    <w:lvl w:ilvl="4" w:tentative="1">
+      <w:start w:val="1"/>
+      <w:numFmt w:val="decimal"/>
+      <w:lvlText w:val="%5."/>
+      <w:lvlJc w:val="left"/>
+      <w:pPr>
+        <w:tabs>
+          <w:tab w:val="num" w:pos="3600"/>
+        </w:tabs>
+        <w:ind w:left="3600" w:hanging="360"/>
+      </w:pPr>
+    </w:lvl>
+    <w:lvl w:ilvl="5" w:tentative="1">
+      <w:start w:val="1"/>
+      <w:numFmt w:val="decimal"/>
+      <w:lvlText w:val="%6."/>
+      <w:lvlJc w:val="left"/>
+      <w:pPr>
+        <w:tabs>
+          <w:tab w:val="num" w:pos="4320"/>
+        </w:tabs>
+        <w:ind w:left="4320" w:hanging="360"/>
+      </w:pPr>
+    </w:lvl>
+    <w:lvl w:ilvl="6" w:tentative="1">
+      <w:start w:val="1"/>
+      <w:numFmt w:val="decimal"/>
+      <w:lvlText w:val="%7."/>
+      <w:lvlJc w:val="left"/>
+      <w:pPr>
+        <w:tabs>
+          <w:tab w:val="num" w:pos="5040"/>
+        </w:tabs>
+        <w:ind w:left="5040" w:hanging="360"/>
+      </w:pPr>
+    </w:lvl>
+    <w:lvl w:ilvl="7" w:tentative="1">
+      <w:start w:val="1"/>
+      <w:numFmt w:val="decimal"/>
+      <w:lvlText w:val="%8."/>
+      <w:lvlJc w:val="left"/>
+      <w:pPr>
+        <w:tabs>
+          <w:tab w:val="num" w:pos="5760"/>
+        </w:tabs>
+        <w:ind w:left="5760" w:hanging="360"/>
+      </w:pPr>
+    </w:lvl>
+    <w:lvl w:ilvl="8" w:tentative="1">
+      <w:start w:val="1"/>
+      <w:numFmt w:val="decimal"/>
+      <w:lvlText w:val="%9."/>
+      <w:lvlJc w:val="left"/>
+      <w:pPr>
+        <w:tabs>
+          <w:tab w:val="num" w:pos="6480"/>
+        </w:tabs>
+        <w:ind w:left="6480" w:hanging="360"/>
+      </w:pPr>
+    </w:lvl>
+  </w:abstractNum>
+  <w:abstractNum w:abstractNumId="3" w15:restartNumberingAfterBreak="0">
+    <w:nsid w:val="2C3525DF"/>
+    <w:multiLevelType w:val="multilevel"/>
+    <w:tmpl w:val="3F7872A0"/>
+    <w:lvl w:ilvl="0">
+      <w:start w:val="1"/>
+      <w:numFmt w:val="bullet"/>
+      <w:lvlText w:val=""/>
+      <w:lvlJc w:val="left"/>
+      <w:pPr>
+        <w:tabs>
+          <w:tab w:val="num" w:pos="720"/>
+        </w:tabs>
+        <w:ind w:left="720" w:hanging="360"/>
+      </w:pPr>
+      <w:rPr>
+        <w:rFonts w:ascii="Symbol" w:hAnsi="Symbol" w:hint="default"/>
+        <w:sz w:val="20"/>
+      </w:rPr>
+    </w:lvl>
+    <w:lvl w:ilvl="1" w:tentative="1">
+      <w:start w:val="1"/>
+      <w:numFmt w:val="bullet"/>
+      <w:lvlText w:val="o"/>
+      <w:lvlJc w:val="left"/>
+      <w:pPr>
+        <w:tabs>
+          <w:tab w:val="num" w:pos="1440"/>
+        </w:tabs>
+        <w:ind w:left="1440" w:hanging="360"/>
+      </w:pPr>
+      <w:rPr>
+        <w:rFonts w:ascii="Courier New" w:hAnsi="Courier New" w:hint="default"/>
+        <w:sz w:val="20"/>
+      </w:rPr>
+    </w:lvl>
+    <w:lvl w:ilvl="2" w:tentative="1">
+      <w:start w:val="1"/>
+      <w:numFmt w:val="bullet"/>
+      <w:lvlText w:val=""/>
+      <w:lvlJc w:val="left"/>
+      <w:pPr>
+        <w:tabs>
+          <w:tab w:val="num" w:pos="2160"/>
+        </w:tabs>
+        <w:ind w:left="2160" w:hanging="360"/>
+      </w:pPr>
+      <w:rPr>
+        <w:rFonts w:ascii="Wingdings" w:hAnsi="Wingdings" w:hint="default"/>
+        <w:sz w:val="20"/>
+      </w:rPr>
+    </w:lvl>
+    <w:lvl w:ilvl="3" w:tentative="1">
+      <w:start w:val="1"/>
+      <w:numFmt w:val="bullet"/>
+      <w:lvlText w:val=""/>
+      <w:lvlJc w:val="left"/>
+      <w:pPr>
+        <w:tabs>
+          <w:tab w:val="num" w:pos="2880"/>
+        </w:tabs>
+        <w:ind w:left="2880" w:hanging="360"/>
+      </w:pPr>
+      <w:rPr>
+        <w:rFonts w:ascii="Wingdings" w:hAnsi="Wingdings" w:hint="default"/>
+        <w:sz w:val="20"/>
+      </w:rPr>
+    </w:lvl>
+    <w:lvl w:ilvl="4" w:tentative="1">
+      <w:start w:val="1"/>
+      <w:numFmt w:val="bullet"/>
+      <w:lvlText w:val=""/>
+      <w:lvlJc w:val="left"/>
+      <w:pPr>
+        <w:tabs>
+          <w:tab w:val="num" w:pos="3600"/>
+        </w:tabs>
+        <w:ind w:left="3600" w:hanging="360"/>
+      </w:pPr>
+      <w:rPr>
+        <w:rFonts w:ascii="Wingdings" w:hAnsi="Wingdings" w:hint="default"/>
+        <w:sz w:val="20"/>
+      </w:rPr>
+    </w:lvl>
+    <w:lvl w:ilvl="5" w:tentative="1">
+      <w:start w:val="1"/>
+      <w:numFmt w:val="bullet"/>
+      <w:lvlText w:val=""/>
+      <w:lvlJc w:val="left"/>
+      <w:pPr>
+        <w:tabs>
+          <w:tab w:val="num" w:pos="4320"/>
+        </w:tabs>
+        <w:ind w:left="4320" w:hanging="360"/>
+      </w:pPr>
+      <w:rPr>
+        <w:rFonts w:ascii="Wingdings" w:hAnsi="Wingdings" w:hint="default"/>
+        <w:sz w:val="20"/>
+      </w:rPr>
+    </w:lvl>
+    <w:lvl w:ilvl="6" w:tentative="1">
+      <w:start w:val="1"/>
+      <w:numFmt w:val="bullet"/>
+      <w:lvlText w:val=""/>
+      <w:lvlJc w:val="left"/>
+      <w:pPr>
+        <w:tabs>
+          <w:tab w:val="num" w:pos="5040"/>
+        </w:tabs>
+        <w:ind w:left="5040" w:hanging="360"/>
+      </w:pPr>
+      <w:rPr>
+        <w:rFonts w:ascii="Wingdings" w:hAnsi="Wingdings" w:hint="default"/>
+        <w:sz w:val="20"/>
+      </w:rPr>
+    </w:lvl>
+    <w:lvl w:ilvl="7" w:tentative="1">
+      <w:start w:val="1"/>
+      <w:numFmt w:val="bullet"/>
+      <w:lvlText w:val=""/>
+      <w:lvlJc w:val="left"/>
+      <w:pPr>
+        <w:tabs>
+          <w:tab w:val="num" w:pos="5760"/>
+        </w:tabs>
+        <w:ind w:left="5760" w:hanging="360"/>
+      </w:pPr>
+      <w:rPr>
+        <w:rFonts w:ascii="Wingdings" w:hAnsi="Wingdings" w:hint="default"/>
+        <w:sz w:val="20"/>
+      </w:rPr>
+    </w:lvl>
+    <w:lvl w:ilvl="8" w:tentative="1">
+      <w:start w:val="1"/>
+      <w:numFmt w:val="bullet"/>
+      <w:lvlText w:val=""/>
+      <w:lvlJc w:val="left"/>
+      <w:pPr>
+        <w:tabs>
+          <w:tab w:val="num" w:pos="6480"/>
+        </w:tabs>
+        <w:ind w:left="6480" w:hanging="360"/>
+      </w:pPr>
+      <w:rPr>
+        <w:rFonts w:ascii="Wingdings" w:hAnsi="Wingdings" w:hint="default"/>
+        <w:sz w:val="20"/>
+      </w:rPr>
+    </w:lvl>
+  </w:abstractNum>
+  <w:abstractNum w:abstractNumId="4" w15:restartNumberingAfterBreak="0">
+    <w:nsid w:val="2F09201F"/>
+    <w:multiLevelType w:val="multilevel"/>
+    <w:tmpl w:val="FA541904"/>
+    <w:lvl w:ilvl="0">
+      <w:start w:val="1"/>
+      <w:numFmt w:val="bullet"/>
+      <w:lvlText w:val=""/>
+      <w:lvlJc w:val="left"/>
+      <w:pPr>
+        <w:tabs>
+          <w:tab w:val="num" w:pos="720"/>
+        </w:tabs>
+        <w:ind w:left="720" w:hanging="360"/>
+      </w:pPr>
+      <w:rPr>
+        <w:rFonts w:ascii="Symbol" w:hAnsi="Symbol" w:hint="default"/>
+        <w:sz w:val="20"/>
+      </w:rPr>
+    </w:lvl>
+    <w:lvl w:ilvl="1" w:tentative="1">
+      <w:start w:val="1"/>
+      <w:numFmt w:val="bullet"/>
+      <w:lvlText w:val="o"/>
+      <w:lvlJc w:val="left"/>
+      <w:pPr>
+        <w:tabs>
+          <w:tab w:val="num" w:pos="1440"/>
+        </w:tabs>
+        <w:ind w:left="1440" w:hanging="360"/>
+      </w:pPr>
+      <w:rPr>
+        <w:rFonts w:ascii="Courier New" w:hAnsi="Courier New" w:hint="default"/>
+        <w:sz w:val="20"/>
+      </w:rPr>
+    </w:lvl>
+    <w:lvl w:ilvl="2" w:tentative="1">
+      <w:start w:val="1"/>
+      <w:numFmt w:val="bullet"/>
+      <w:lvlText w:val=""/>
+      <w:lvlJc w:val="left"/>
+      <w:pPr>
+        <w:tabs>
+          <w:tab w:val="num" w:pos="2160"/>
+        </w:tabs>
+        <w:ind w:left="2160" w:hanging="360"/>
+      </w:pPr>
+      <w:rPr>
+        <w:rFonts w:ascii="Wingdings" w:hAnsi="Wingdings" w:hint="default"/>
+        <w:sz w:val="20"/>
+      </w:rPr>
+    </w:lvl>
+    <w:lvl w:ilvl="3" w:tentative="1">
+      <w:start w:val="1"/>
+      <w:numFmt w:val="bullet"/>
+      <w:lvlText w:val=""/>
+      <w:lvlJc w:val="left"/>
+      <w:pPr>
+        <w:tabs>
+          <w:tab w:val="num" w:pos="2880"/>
+        </w:tabs>
+        <w:ind w:left="2880" w:hanging="360"/>
+      </w:pPr>
+      <w:rPr>
+        <w:rFonts w:ascii="Wingdings" w:hAnsi="Wingdings" w:hint="default"/>
+        <w:sz w:val="20"/>
+      </w:rPr>
+    </w:lvl>
+    <w:lvl w:ilvl="4" w:tentative="1">
+      <w:start w:val="1"/>
+      <w:numFmt w:val="bullet"/>
+      <w:lvlText w:val=""/>
+      <w:lvlJc w:val="left"/>
+      <w:pPr>
+        <w:tabs>
+          <w:tab w:val="num" w:pos="3600"/>
+        </w:tabs>
+        <w:ind w:left="3600" w:hanging="360"/>
+      </w:pPr>
+      <w:rPr>
+        <w:rFonts w:ascii="Wingdings" w:hAnsi="Wingdings" w:hint="default"/>
+        <w:sz w:val="20"/>
+      </w:rPr>
+    </w:lvl>
+    <w:lvl w:ilvl="5" w:tentative="1">
+      <w:start w:val="1"/>
+      <w:numFmt w:val="bullet"/>
+      <w:lvlText w:val=""/>
+      <w:lvlJc w:val="left"/>
+      <w:pPr>
+        <w:tabs>
+          <w:tab w:val="num" w:pos="4320"/>
+        </w:tabs>
+        <w:ind w:left="4320" w:hanging="360"/>
+      </w:pPr>
+      <w:rPr>
+        <w:rFonts w:ascii="Wingdings" w:hAnsi="Wingdings" w:hint="default"/>
+        <w:sz w:val="20"/>
+      </w:rPr>
+    </w:lvl>
+    <w:lvl w:ilvl="6" w:tentative="1">
+      <w:start w:val="1"/>
+      <w:numFmt w:val="bullet"/>
+      <w:lvlText w:val=""/>
+      <w:lvlJc w:val="left"/>
+      <w:pPr>
+        <w:tabs>
+          <w:tab w:val="num" w:pos="5040"/>
+        </w:tabs>
+        <w:ind w:left="5040" w:hanging="360"/>
+      </w:pPr>
+      <w:rPr>
+        <w:rFonts w:ascii="Wingdings" w:hAnsi="Wingdings" w:hint="default"/>
+        <w:sz w:val="20"/>
+      </w:rPr>
+    </w:lvl>
+    <w:lvl w:ilvl="7" w:tentative="1">
+      <w:start w:val="1"/>
+      <w:numFmt w:val="bullet"/>
+      <w:lvlText w:val=""/>
+      <w:lvlJc w:val="left"/>
+      <w:pPr>
+        <w:tabs>
+          <w:tab w:val="num" w:pos="5760"/>
+        </w:tabs>
+        <w:ind w:left="5760" w:hanging="360"/>
+      </w:pPr>
+      <w:rPr>
+        <w:rFonts w:ascii="Wingdings" w:hAnsi="Wingdings" w:hint="default"/>
+        <w:sz w:val="20"/>
+      </w:rPr>
+    </w:lvl>
+    <w:lvl w:ilvl="8" w:tentative="1">
+      <w:start w:val="1"/>
+      <w:numFmt w:val="bullet"/>
+      <w:lvlText w:val=""/>
+      <w:lvlJc w:val="left"/>
+      <w:pPr>
+        <w:tabs>
+          <w:tab w:val="num" w:pos="6480"/>
+        </w:tabs>
+        <w:ind w:left="6480" w:hanging="360"/>
+      </w:pPr>
+      <w:rPr>
+        <w:rFonts w:ascii="Wingdings" w:hAnsi="Wingdings" w:hint="default"/>
+        <w:sz w:val="20"/>
+      </w:rPr>
+    </w:lvl>
+  </w:abstractNum>
+  <w:abstractNum w:abstractNumId="5" w15:restartNumberingAfterBreak="0">
+    <w:nsid w:val="31496BFF"/>
+    <w:multiLevelType w:val="multilevel"/>
+    <w:tmpl w:val="C4C8E926"/>
+    <w:lvl w:ilvl="0">
+      <w:start w:val="25"/>
+      <w:numFmt w:val="decimal"/>
+      <w:lvlText w:val="%1."/>
+      <w:lvlJc w:val="left"/>
+      <w:pPr>
+        <w:tabs>
+          <w:tab w:val="num" w:pos="720"/>
+        </w:tabs>
+        <w:ind w:left="720" w:hanging="360"/>
+      </w:pPr>
+    </w:lvl>
+    <w:lvl w:ilvl="1" w:tentative="1">
+      <w:start w:val="1"/>
+      <w:numFmt w:val="decimal"/>
+      <w:lvlText w:val="%2."/>
+      <w:lvlJc w:val="left"/>
+      <w:pPr>
+        <w:tabs>
+          <w:tab w:val="num" w:pos="1440"/>
+        </w:tabs>
+        <w:ind w:left="1440" w:hanging="360"/>
+      </w:pPr>
+    </w:lvl>
+    <w:lvl w:ilvl="2" w:tentative="1">
+      <w:start w:val="1"/>
+      <w:numFmt w:val="decimal"/>
+      <w:lvlText w:val="%3."/>
+      <w:lvlJc w:val="left"/>
+      <w:pPr>
+        <w:tabs>
+          <w:tab w:val="num" w:pos="2160"/>
+        </w:tabs>
+        <w:ind w:left="2160" w:hanging="360"/>
+      </w:pPr>
+    </w:lvl>
+    <w:lvl w:ilvl="3" w:tentative="1">
+      <w:start w:val="1"/>
+      <w:numFmt w:val="decimal"/>
+      <w:lvlText w:val="%4."/>
+      <w:lvlJc w:val="left"/>
+      <w:pPr>
+        <w:tabs>
+          <w:tab w:val="num" w:pos="2880"/>
+        </w:tabs>
+        <w:ind w:left="2880" w:hanging="360"/>
+      </w:pPr>
+    </w:lvl>
+    <w:lvl w:ilvl="4" w:tentative="1">
+      <w:start w:val="1"/>
+      <w:numFmt w:val="decimal"/>
+      <w:lvlText w:val="%5."/>
+      <w:lvlJc w:val="left"/>
+      <w:pPr>
+        <w:tabs>
+          <w:tab w:val="num" w:pos="3600"/>
+        </w:tabs>
+        <w:ind w:left="3600" w:hanging="360"/>
+      </w:pPr>
+    </w:lvl>
+    <w:lvl w:ilvl="5" w:tentative="1">
+      <w:start w:val="1"/>
+      <w:numFmt w:val="decimal"/>
+      <w:lvlText w:val="%6."/>
+      <w:lvlJc w:val="left"/>
+      <w:pPr>
+        <w:tabs>
+          <w:tab w:val="num" w:pos="4320"/>
+        </w:tabs>
+        <w:ind w:left="4320" w:hanging="360"/>
+      </w:pPr>
+    </w:lvl>
+    <w:lvl w:ilvl="6" w:tentative="1">
+      <w:start w:val="1"/>
+      <w:numFmt w:val="decimal"/>
+      <w:lvlText w:val="%7."/>
+      <w:lvlJc w:val="left"/>
+      <w:pPr>
+        <w:tabs>
+          <w:tab w:val="num" w:pos="5040"/>
+        </w:tabs>
+        <w:ind w:left="5040" w:hanging="360"/>
+      </w:pPr>
+    </w:lvl>
+    <w:lvl w:ilvl="7" w:tentative="1">
+      <w:start w:val="1"/>
+      <w:numFmt w:val="decimal"/>
+      <w:lvlText w:val="%8."/>
+      <w:lvlJc w:val="left"/>
+      <w:pPr>
+        <w:tabs>
+          <w:tab w:val="num" w:pos="5760"/>
+        </w:tabs>
+        <w:ind w:left="5760" w:hanging="360"/>
+      </w:pPr>
+    </w:lvl>
+    <w:lvl w:ilvl="8" w:tentative="1">
+      <w:start w:val="1"/>
+      <w:numFmt w:val="decimal"/>
+      <w:lvlText w:val="%9."/>
+      <w:lvlJc w:val="left"/>
+      <w:pPr>
+        <w:tabs>
+          <w:tab w:val="num" w:pos="6480"/>
+        </w:tabs>
+        <w:ind w:left="6480" w:hanging="360"/>
+      </w:pPr>
+    </w:lvl>
+  </w:abstractNum>
+  <w:abstractNum w:abstractNumId="6" w15:restartNumberingAfterBreak="0">
+    <w:nsid w:val="3E935D36"/>
+    <w:multiLevelType w:val="multilevel"/>
+    <w:tmpl w:val="59629032"/>
+    <w:lvl w:ilvl="0">
+      <w:start w:val="28"/>
+      <w:numFmt w:val="decimal"/>
+      <w:lvlText w:val="%1."/>
+      <w:lvlJc w:val="left"/>
+      <w:pPr>
+        <w:tabs>
+          <w:tab w:val="num" w:pos="720"/>
+        </w:tabs>
+        <w:ind w:left="720" w:hanging="360"/>
+      </w:pPr>
+    </w:lvl>
+    <w:lvl w:ilvl="1" w:tentative="1">
+      <w:start w:val="1"/>
+      <w:numFmt w:val="decimal"/>
+      <w:lvlText w:val="%2."/>
+      <w:lvlJc w:val="left"/>
+      <w:pPr>
+        <w:tabs>
+          <w:tab w:val="num" w:pos="1440"/>
+        </w:tabs>
+        <w:ind w:left="1440" w:hanging="360"/>
+      </w:pPr>
+    </w:lvl>
+    <w:lvl w:ilvl="2" w:tentative="1">
+      <w:start w:val="1"/>
+      <w:numFmt w:val="decimal"/>
+      <w:lvlText w:val="%3."/>
+      <w:lvlJc w:val="left"/>
+      <w:pPr>
+        <w:tabs>
+          <w:tab w:val="num" w:pos="2160"/>
+        </w:tabs>
+        <w:ind w:left="2160" w:hanging="360"/>
+      </w:pPr>
+    </w:lvl>
+    <w:lvl w:ilvl="3" w:tentative="1">
+      <w:start w:val="1"/>
+      <w:numFmt w:val="decimal"/>
+      <w:lvlText w:val="%4."/>
+      <w:lvlJc w:val="left"/>
+      <w:pPr>
+        <w:tabs>
+          <w:tab w:val="num" w:pos="2880"/>
+        </w:tabs>
+        <w:ind w:left="2880" w:hanging="360"/>
+      </w:pPr>
+    </w:lvl>
+    <w:lvl w:ilvl="4" w:tentative="1">
+      <w:start w:val="1"/>
+      <w:numFmt w:val="decimal"/>
+      <w:lvlText w:val="%5."/>
+      <w:lvlJc w:val="left"/>
+      <w:pPr>
+        <w:tabs>
+          <w:tab w:val="num" w:pos="3600"/>
+        </w:tabs>
+        <w:ind w:left="3600" w:hanging="360"/>
+      </w:pPr>
+    </w:lvl>
+    <w:lvl w:ilvl="5" w:tentative="1">
+      <w:start w:val="1"/>
+      <w:numFmt w:val="decimal"/>
+      <w:lvlText w:val="%6."/>
+      <w:lvlJc w:val="left"/>
+      <w:pPr>
+        <w:tabs>
+          <w:tab w:val="num" w:pos="4320"/>
+        </w:tabs>
+        <w:ind w:left="4320" w:hanging="360"/>
+      </w:pPr>
+    </w:lvl>
+    <w:lvl w:ilvl="6" w:tentative="1">
+      <w:start w:val="1"/>
+      <w:numFmt w:val="decimal"/>
+      <w:lvlText w:val="%7."/>
+      <w:lvlJc w:val="left"/>
+      <w:pPr>
+        <w:tabs>
+          <w:tab w:val="num" w:pos="5040"/>
+        </w:tabs>
+        <w:ind w:left="5040" w:hanging="360"/>
+      </w:pPr>
+    </w:lvl>
+    <w:lvl w:ilvl="7" w:tentative="1">
+      <w:start w:val="1"/>
+      <w:numFmt w:val="decimal"/>
+      <w:lvlText w:val="%8."/>
+      <w:lvlJc w:val="left"/>
+      <w:pPr>
+        <w:tabs>
+          <w:tab w:val="num" w:pos="5760"/>
+        </w:tabs>
+        <w:ind w:left="5760" w:hanging="360"/>
+      </w:pPr>
+    </w:lvl>
+    <w:lvl w:ilvl="8" w:tentative="1">
+      <w:start w:val="1"/>
+      <w:numFmt w:val="decimal"/>
+      <w:lvlText w:val="%9."/>
+      <w:lvlJc w:val="left"/>
+      <w:pPr>
+        <w:tabs>
+          <w:tab w:val="num" w:pos="6480"/>
+        </w:tabs>
+        <w:ind w:left="6480" w:hanging="360"/>
+      </w:pPr>
+    </w:lvl>
+  </w:abstractNum>
+  <w:abstractNum w:abstractNumId="7" w15:restartNumberingAfterBreak="0">
+    <w:nsid w:val="4F677274"/>
+    <w:multiLevelType w:val="multilevel"/>
+    <w:tmpl w:val="4730587E"/>
+    <w:lvl w:ilvl="0">
+      <w:start w:val="24"/>
+      <w:numFmt w:val="decimal"/>
+      <w:lvlText w:val="%1."/>
+      <w:lvlJc w:val="left"/>
+      <w:pPr>
+        <w:tabs>
+          <w:tab w:val="num" w:pos="720"/>
+        </w:tabs>
+        <w:ind w:left="720" w:hanging="360"/>
+      </w:pPr>
+    </w:lvl>
+    <w:lvl w:ilvl="1" w:tentative="1">
+      <w:start w:val="1"/>
+      <w:numFmt w:val="decimal"/>
+      <w:lvlText w:val="%2."/>
+      <w:lvlJc w:val="left"/>
+      <w:pPr>
+        <w:tabs>
+          <w:tab w:val="num" w:pos="1440"/>
+        </w:tabs>
+        <w:ind w:left="1440" w:hanging="360"/>
+      </w:pPr>
+    </w:lvl>
+    <w:lvl w:ilvl="2" w:tentative="1">
+      <w:start w:val="1"/>
+      <w:numFmt w:val="decimal"/>
+      <w:lvlText w:val="%3."/>
+      <w:lvlJc w:val="left"/>
+      <w:pPr>
+        <w:tabs>
+          <w:tab w:val="num" w:pos="2160"/>
+        </w:tabs>
+        <w:ind w:left="2160" w:hanging="360"/>
+      </w:pPr>
+    </w:lvl>
+    <w:lvl w:ilvl="3" w:tentative="1">
+      <w:start w:val="1"/>
+      <w:numFmt w:val="decimal"/>
+      <w:lvlText w:val="%4."/>
+      <w:lvlJc w:val="left"/>
+      <w:pPr>
+        <w:tabs>
+          <w:tab w:val="num" w:pos="2880"/>
+        </w:tabs>
+        <w:ind w:left="2880" w:hanging="360"/>
+      </w:pPr>
+    </w:lvl>
+    <w:lvl w:ilvl="4" w:tentative="1">
+      <w:start w:val="1"/>
+      <w:numFmt w:val="decimal"/>
+      <w:lvlText w:val="%5."/>
+      <w:lvlJc w:val="left"/>
+      <w:pPr>
+        <w:tabs>
+          <w:tab w:val="num" w:pos="3600"/>
+        </w:tabs>
+        <w:ind w:left="3600" w:hanging="360"/>
+      </w:pPr>
+    </w:lvl>
+    <w:lvl w:ilvl="5" w:tentative="1">
+      <w:start w:val="1"/>
+      <w:numFmt w:val="decimal"/>
+      <w:lvlText w:val="%6."/>
+      <w:lvlJc w:val="left"/>
+      <w:pPr>
+        <w:tabs>
+          <w:tab w:val="num" w:pos="4320"/>
+        </w:tabs>
+        <w:ind w:left="4320" w:hanging="360"/>
+      </w:pPr>
+    </w:lvl>
+    <w:lvl w:ilvl="6" w:tentative="1">
+      <w:start w:val="1"/>
+      <w:numFmt w:val="decimal"/>
+      <w:lvlText w:val="%7."/>
+      <w:lvlJc w:val="left"/>
+      <w:pPr>
+        <w:tabs>
+          <w:tab w:val="num" w:pos="5040"/>
+        </w:tabs>
+        <w:ind w:left="5040" w:hanging="360"/>
+      </w:pPr>
+    </w:lvl>
+    <w:lvl w:ilvl="7" w:tentative="1">
+      <w:start w:val="1"/>
+      <w:numFmt w:val="decimal"/>
+      <w:lvlText w:val="%8."/>
+      <w:lvlJc w:val="left"/>
+      <w:pPr>
+        <w:tabs>
+          <w:tab w:val="num" w:pos="5760"/>
+        </w:tabs>
+        <w:ind w:left="5760" w:hanging="360"/>
+      </w:pPr>
+    </w:lvl>
+    <w:lvl w:ilvl="8" w:tentative="1">
+      <w:start w:val="1"/>
+      <w:numFmt w:val="decimal"/>
+      <w:lvlText w:val="%9."/>
+      <w:lvlJc w:val="left"/>
+      <w:pPr>
+        <w:tabs>
+          <w:tab w:val="num" w:pos="6480"/>
+        </w:tabs>
+        <w:ind w:left="6480" w:hanging="360"/>
+      </w:pPr>
+    </w:lvl>
+  </w:abstractNum>
+  <w:abstractNum w:abstractNumId="8" w15:restartNumberingAfterBreak="0">
     <w:nsid w:val="574070D1"/>
     <w:multiLevelType w:val="multilevel"/>
     <w:tmpl w:val="AFA6FD14"/>
@@ -1555,7 +3993,7 @@
       </w:pPr>
     </w:lvl>
   </w:abstractNum>
-  <w:abstractNum w:abstractNumId="2" w15:restartNumberingAfterBreak="0">
+  <w:abstractNum w:abstractNumId="9" w15:restartNumberingAfterBreak="0">
     <w:nsid w:val="6573407F"/>
     <w:multiLevelType w:val="multilevel"/>
     <w:tmpl w:val="1C6A6450"/>
@@ -1668,14 +4106,187 @@
       </w:pPr>
     </w:lvl>
   </w:abstractNum>
+  <w:abstractNum w:abstractNumId="10" w15:restartNumberingAfterBreak="0">
+    <w:nsid w:val="676E402A"/>
+    <w:multiLevelType w:val="multilevel"/>
+    <w:tmpl w:val="9A5E8EFA"/>
+    <w:lvl w:ilvl="0">
+      <w:start w:val="1"/>
+      <w:numFmt w:val="bullet"/>
+      <w:lvlText w:val=""/>
+      <w:lvlJc w:val="left"/>
+      <w:pPr>
+        <w:tabs>
+          <w:tab w:val="num" w:pos="720"/>
+        </w:tabs>
+        <w:ind w:left="720" w:hanging="360"/>
+      </w:pPr>
+      <w:rPr>
+        <w:rFonts w:ascii="Symbol" w:hAnsi="Symbol" w:hint="default"/>
+        <w:sz w:val="20"/>
+      </w:rPr>
+    </w:lvl>
+    <w:lvl w:ilvl="1" w:tentative="1">
+      <w:start w:val="1"/>
+      <w:numFmt w:val="bullet"/>
+      <w:lvlText w:val="o"/>
+      <w:lvlJc w:val="left"/>
+      <w:pPr>
+        <w:tabs>
+          <w:tab w:val="num" w:pos="1440"/>
+        </w:tabs>
+        <w:ind w:left="1440" w:hanging="360"/>
+      </w:pPr>
+      <w:rPr>
+        <w:rFonts w:ascii="Courier New" w:hAnsi="Courier New" w:hint="default"/>
+        <w:sz w:val="20"/>
+      </w:rPr>
+    </w:lvl>
+    <w:lvl w:ilvl="2" w:tentative="1">
+      <w:start w:val="1"/>
+      <w:numFmt w:val="bullet"/>
+      <w:lvlText w:val=""/>
+      <w:lvlJc w:val="left"/>
+      <w:pPr>
+        <w:tabs>
+          <w:tab w:val="num" w:pos="2160"/>
+        </w:tabs>
+        <w:ind w:left="2160" w:hanging="360"/>
+      </w:pPr>
+      <w:rPr>
+        <w:rFonts w:ascii="Wingdings" w:hAnsi="Wingdings" w:hint="default"/>
+        <w:sz w:val="20"/>
+      </w:rPr>
+    </w:lvl>
+    <w:lvl w:ilvl="3" w:tentative="1">
+      <w:start w:val="1"/>
+      <w:numFmt w:val="bullet"/>
+      <w:lvlText w:val=""/>
+      <w:lvlJc w:val="left"/>
+      <w:pPr>
+        <w:tabs>
+          <w:tab w:val="num" w:pos="2880"/>
+        </w:tabs>
+        <w:ind w:left="2880" w:hanging="360"/>
+      </w:pPr>
+      <w:rPr>
+        <w:rFonts w:ascii="Wingdings" w:hAnsi="Wingdings" w:hint="default"/>
+        <w:sz w:val="20"/>
+      </w:rPr>
+    </w:lvl>
+    <w:lvl w:ilvl="4" w:tentative="1">
+      <w:start w:val="1"/>
+      <w:numFmt w:val="bullet"/>
+      <w:lvlText w:val=""/>
+      <w:lvlJc w:val="left"/>
+      <w:pPr>
+        <w:tabs>
+          <w:tab w:val="num" w:pos="3600"/>
+        </w:tabs>
+        <w:ind w:left="3600" w:hanging="360"/>
+      </w:pPr>
+      <w:rPr>
+        <w:rFonts w:ascii="Wingdings" w:hAnsi="Wingdings" w:hint="default"/>
+        <w:sz w:val="20"/>
+      </w:rPr>
+    </w:lvl>
+    <w:lvl w:ilvl="5" w:tentative="1">
+      <w:start w:val="1"/>
+      <w:numFmt w:val="bullet"/>
+      <w:lvlText w:val=""/>
+      <w:lvlJc w:val="left"/>
+      <w:pPr>
+        <w:tabs>
+          <w:tab w:val="num" w:pos="4320"/>
+        </w:tabs>
+        <w:ind w:left="4320" w:hanging="360"/>
+      </w:pPr>
+      <w:rPr>
+        <w:rFonts w:ascii="Wingdings" w:hAnsi="Wingdings" w:hint="default"/>
+        <w:sz w:val="20"/>
+      </w:rPr>
+    </w:lvl>
+    <w:lvl w:ilvl="6" w:tentative="1">
+      <w:start w:val="1"/>
+      <w:numFmt w:val="bullet"/>
+      <w:lvlText w:val=""/>
+      <w:lvlJc w:val="left"/>
+      <w:pPr>
+        <w:tabs>
+          <w:tab w:val="num" w:pos="5040"/>
+        </w:tabs>
+        <w:ind w:left="5040" w:hanging="360"/>
+      </w:pPr>
+      <w:rPr>
+        <w:rFonts w:ascii="Wingdings" w:hAnsi="Wingdings" w:hint="default"/>
+        <w:sz w:val="20"/>
+      </w:rPr>
+    </w:lvl>
+    <w:lvl w:ilvl="7" w:tentative="1">
+      <w:start w:val="1"/>
+      <w:numFmt w:val="bullet"/>
+      <w:lvlText w:val=""/>
+      <w:lvlJc w:val="left"/>
+      <w:pPr>
+        <w:tabs>
+          <w:tab w:val="num" w:pos="5760"/>
+        </w:tabs>
+        <w:ind w:left="5760" w:hanging="360"/>
+      </w:pPr>
+      <w:rPr>
+        <w:rFonts w:ascii="Wingdings" w:hAnsi="Wingdings" w:hint="default"/>
+        <w:sz w:val="20"/>
+      </w:rPr>
+    </w:lvl>
+    <w:lvl w:ilvl="8" w:tentative="1">
+      <w:start w:val="1"/>
+      <w:numFmt w:val="bullet"/>
+      <w:lvlText w:val=""/>
+      <w:lvlJc w:val="left"/>
+      <w:pPr>
+        <w:tabs>
+          <w:tab w:val="num" w:pos="6480"/>
+        </w:tabs>
+        <w:ind w:left="6480" w:hanging="360"/>
+      </w:pPr>
+      <w:rPr>
+        <w:rFonts w:ascii="Wingdings" w:hAnsi="Wingdings" w:hint="default"/>
+        <w:sz w:val="20"/>
+      </w:rPr>
+    </w:lvl>
+  </w:abstractNum>
   <w:num w:numId="1" w16cid:durableId="1291741873">
+    <w:abstractNumId w:val="8"/>
+  </w:num>
+  <w:num w:numId="2" w16cid:durableId="1705403788">
+    <w:abstractNumId w:val="9"/>
+  </w:num>
+  <w:num w:numId="3" w16cid:durableId="1161239122">
     <w:abstractNumId w:val="1"/>
   </w:num>
-  <w:num w:numId="2" w16cid:durableId="1705403788">
+  <w:num w:numId="4" w16cid:durableId="982004466">
+    <w:abstractNumId w:val="7"/>
+  </w:num>
+  <w:num w:numId="5" w16cid:durableId="2083092249">
+    <w:abstractNumId w:val="5"/>
+  </w:num>
+  <w:num w:numId="6" w16cid:durableId="234357438">
     <w:abstractNumId w:val="2"/>
   </w:num>
-  <w:num w:numId="3" w16cid:durableId="1161239122">
+  <w:num w:numId="7" w16cid:durableId="629363714">
     <w:abstractNumId w:val="0"/>
+  </w:num>
+  <w:num w:numId="8" w16cid:durableId="726535830">
+    <w:abstractNumId w:val="6"/>
+  </w:num>
+  <w:num w:numId="9" w16cid:durableId="1655139262">
+    <w:abstractNumId w:val="3"/>
+  </w:num>
+  <w:num w:numId="10" w16cid:durableId="32384748">
+    <w:abstractNumId w:val="4"/>
+  </w:num>
+  <w:num w:numId="11" w16cid:durableId="1086802404">
+    <w:abstractNumId w:val="10"/>
   </w:num>
 </w:numbering>
 </file>
@@ -2608,6 +5219,25 @@
       <w:rFonts w:ascii="Times New Roman" w:hAnsi="Times New Roman" w:cs="Times New Roman"/>
     </w:rPr>
   </w:style>
+  <w:style w:type="table" w:styleId="TableGrid">
+    <w:name w:val="Table Grid"/>
+    <w:basedOn w:val="TableNormal"/>
+    <w:uiPriority w:val="39"/>
+    <w:rsid w:val="00765D65"/>
+    <w:pPr>
+      <w:spacing w:after="0" w:line="240" w:lineRule="auto"/>
+    </w:pPr>
+    <w:tblPr>
+      <w:tblBorders>
+        <w:top w:val="single" w:sz="4" w:space="0" w:color="auto"/>
+        <w:left w:val="single" w:sz="4" w:space="0" w:color="auto"/>
+        <w:bottom w:val="single" w:sz="4" w:space="0" w:color="auto"/>
+        <w:right w:val="single" w:sz="4" w:space="0" w:color="auto"/>
+        <w:insideH w:val="single" w:sz="4" w:space="0" w:color="auto"/>
+        <w:insideV w:val="single" w:sz="4" w:space="0" w:color="auto"/>
+      </w:tblBorders>
+    </w:tblPr>
+  </w:style>
 </w:styles>
 </file>
 

</xml_diff>

<commit_message>
Added all remaining questions of Linux Assignment
</commit_message>
<xml_diff>
--- a/May 27 Linux/Linux Assignment.docx
+++ b/May 27 Linux/Linux Assignment.docx
@@ -6,9 +6,671 @@
       <w:pPr>
         <w:numPr>
           <w:ilvl w:val="0"/>
-          <w:numId w:val="1"/>
+          <w:numId w:val="12"/>
         </w:numPr>
-      </w:pPr>
+        <w:tabs>
+          <w:tab w:val="clear" w:pos="720"/>
+          <w:tab w:val="num" w:pos="360"/>
+        </w:tabs>
+        <w:ind w:left="360"/>
+      </w:pPr>
+      <w:r>
+        <w:rPr>
+          <w:lang w:val="en-US"/>
+        </w:rPr>
+        <w:t xml:space="preserve">Download the file </w:t>
+      </w:r>
+      <w:hyperlink r:id="rId5" w:tgtFrame="_blank" w:history="1">
+        <w:r>
+          <w:rPr>
+            <w:rStyle w:val="Hyperlink"/>
+            <w:lang w:val="en-US"/>
+          </w:rPr>
+          <w:t>scraper.sh</w:t>
+        </w:r>
+      </w:hyperlink>
+      <w:r>
+        <w:rPr>
+          <w:lang w:val="en-US"/>
+        </w:rPr>
+        <w:t xml:space="preserve"> . Make the file executable. The file takes </w:t>
+      </w:r>
+      <w:proofErr w:type="gramStart"/>
+      <w:r>
+        <w:rPr>
+          <w:lang w:val="en-US"/>
+        </w:rPr>
+        <w:t xml:space="preserve">any  </w:t>
+      </w:r>
+      <w:proofErr w:type="spellStart"/>
+      <w:r>
+        <w:rPr>
+          <w:lang w:val="en-US"/>
+        </w:rPr>
+        <w:t>wikipedia</w:t>
+      </w:r>
+      <w:proofErr w:type="spellEnd"/>
+      <w:proofErr w:type="gramEnd"/>
+      <w:r>
+        <w:rPr>
+          <w:lang w:val="en-US"/>
+        </w:rPr>
+        <w:t xml:space="preserve"> webpage as an argument. Run the process on multiple sites like </w:t>
+      </w:r>
+      <w:hyperlink r:id="rId6" w:tgtFrame="_blank" w:history="1">
+        <w:proofErr w:type="spellStart"/>
+        <w:r>
+          <w:rPr>
+            <w:rStyle w:val="Hyperlink"/>
+            <w:lang w:val="en-US"/>
+          </w:rPr>
+          <w:t>Wikipedia:Stub</w:t>
+        </w:r>
+        <w:proofErr w:type="spellEnd"/>
+        <w:r>
+          <w:rPr>
+            <w:rStyle w:val="Hyperlink"/>
+            <w:lang w:val="en-US"/>
+          </w:rPr>
+          <w:t xml:space="preserve"> - Wikipedia</w:t>
+        </w:r>
+      </w:hyperlink>
+      <w:r>
+        <w:rPr>
+          <w:lang w:val="en-US"/>
+        </w:rPr>
+        <w:t xml:space="preserve"> , </w:t>
+      </w:r>
+      <w:hyperlink r:id="rId7" w:tgtFrame="_blank" w:history="1">
+        <w:r>
+          <w:rPr>
+            <w:rStyle w:val="Hyperlink"/>
+            <w:lang w:val="en-US"/>
+          </w:rPr>
+          <w:t>India - Wikipedia</w:t>
+        </w:r>
+      </w:hyperlink>
+      <w:r>
+        <w:rPr>
+          <w:lang w:val="en-US"/>
+        </w:rPr>
+        <w:t xml:space="preserve"> at the same time and</w:t>
+      </w:r>
+      <w:r>
+        <w:t> </w:t>
+      </w:r>
+    </w:p>
+    <w:p>
+      <w:pPr>
+        <w:numPr>
+          <w:ilvl w:val="0"/>
+          <w:numId w:val="13"/>
+        </w:numPr>
+        <w:tabs>
+          <w:tab w:val="clear" w:pos="720"/>
+          <w:tab w:val="num" w:pos="360"/>
+        </w:tabs>
+        <w:ind w:left="360"/>
+      </w:pPr>
+      <w:r>
+        <w:rPr>
+          <w:lang w:val="en-US"/>
+        </w:rPr>
+        <w:t>Find all the processes running on the system.</w:t>
+      </w:r>
+      <w:r>
+        <w:t> </w:t>
+      </w:r>
+    </w:p>
+    <w:p>
+      <w:pPr>
+        <w:numPr>
+          <w:ilvl w:val="0"/>
+          <w:numId w:val="14"/>
+        </w:numPr>
+        <w:tabs>
+          <w:tab w:val="clear" w:pos="720"/>
+          <w:tab w:val="num" w:pos="360"/>
+        </w:tabs>
+        <w:ind w:left="360"/>
+      </w:pPr>
+      <w:r>
+        <w:rPr>
+          <w:lang w:val="en-US"/>
+        </w:rPr>
+        <w:t>Find the first 5 processes with the highest memory usage.</w:t>
+      </w:r>
+      <w:r>
+        <w:t> </w:t>
+      </w:r>
+    </w:p>
+    <w:p>
+      <w:pPr>
+        <w:ind w:left="360"/>
+        <w:rPr>
+          <w:i/>
+          <w:iCs/>
+        </w:rPr>
+      </w:pPr>
+      <w:r>
+        <w:rPr>
+          <w:i/>
+          <w:iCs/>
+        </w:rPr>
+        <w:t xml:space="preserve">Cannot execute in </w:t>
+      </w:r>
+      <w:proofErr w:type="spellStart"/>
+      <w:r>
+        <w:rPr>
+          <w:i/>
+          <w:iCs/>
+        </w:rPr>
+        <w:t>Gitbash</w:t>
+      </w:r>
+      <w:proofErr w:type="spellEnd"/>
+      <w:r>
+        <w:rPr>
+          <w:i/>
+          <w:iCs/>
+        </w:rPr>
+        <w:t xml:space="preserve">, and </w:t>
+      </w:r>
+      <w:proofErr w:type="spellStart"/>
+      <w:r>
+        <w:rPr>
+          <w:i/>
+          <w:iCs/>
+        </w:rPr>
+        <w:t>LabEx</w:t>
+      </w:r>
+      <w:proofErr w:type="spellEnd"/>
+      <w:r>
+        <w:rPr>
+          <w:i/>
+          <w:iCs/>
+        </w:rPr>
+        <w:t xml:space="preserve"> VM does not allow to download external files.</w:t>
+      </w:r>
+    </w:p>
+    <w:p>
+      <w:r>
+        <w:t> </w:t>
+      </w:r>
+    </w:p>
+    <w:p>
+      <w:pPr>
+        <w:numPr>
+          <w:ilvl w:val="0"/>
+          <w:numId w:val="15"/>
+        </w:numPr>
+        <w:tabs>
+          <w:tab w:val="clear" w:pos="720"/>
+          <w:tab w:val="num" w:pos="360"/>
+        </w:tabs>
+        <w:ind w:left="360"/>
+      </w:pPr>
+      <w:r>
+        <w:rPr>
+          <w:lang w:val="en-US"/>
+        </w:rPr>
+        <w:t>Print the HTTP response code obtained from google.com.</w:t>
+      </w:r>
+      <w:r>
+        <w:t> </w:t>
+      </w:r>
+    </w:p>
+    <w:p>
+      <w:pPr>
+        <w:ind w:left="360"/>
+      </w:pPr>
+      <w:r>
+        <w:drawing>
+          <wp:inline distT="0" distB="0" distL="0" distR="0" wp14:anchorId="775E55D5" wp14:editId="5D4E420F">
+            <wp:extent cx="5731510" cy="643255"/>
+            <wp:effectExtent l="0" t="0" r="2540" b="4445"/>
+            <wp:docPr id="51012763" name="Picture 1"/>
+            <wp:cNvGraphicFramePr>
+              <a:graphicFrameLocks xmlns:a="http://schemas.openxmlformats.org/drawingml/2006/main" noChangeAspect="1"/>
+            </wp:cNvGraphicFramePr>
+            <a:graphic xmlns:a="http://schemas.openxmlformats.org/drawingml/2006/main">
+              <a:graphicData uri="http://schemas.openxmlformats.org/drawingml/2006/picture">
+                <pic:pic xmlns:pic="http://schemas.openxmlformats.org/drawingml/2006/picture">
+                  <pic:nvPicPr>
+                    <pic:cNvPr id="51012763" name=""/>
+                    <pic:cNvPicPr/>
+                  </pic:nvPicPr>
+                  <pic:blipFill>
+                    <a:blip r:embed="rId8"/>
+                    <a:stretch>
+                      <a:fillRect/>
+                    </a:stretch>
+                  </pic:blipFill>
+                  <pic:spPr>
+                    <a:xfrm>
+                      <a:off x="0" y="0"/>
+                      <a:ext cx="5731510" cy="643255"/>
+                    </a:xfrm>
+                    <a:prstGeom prst="rect">
+                      <a:avLst/>
+                    </a:prstGeom>
+                  </pic:spPr>
+                </pic:pic>
+              </a:graphicData>
+            </a:graphic>
+          </wp:inline>
+        </w:drawing>
+      </w:r>
+    </w:p>
+    <w:p>
+      <w:pPr>
+        <w:numPr>
+          <w:ilvl w:val="0"/>
+          <w:numId w:val="16"/>
+        </w:numPr>
+        <w:tabs>
+          <w:tab w:val="clear" w:pos="720"/>
+          <w:tab w:val="num" w:pos="360"/>
+        </w:tabs>
+        <w:ind w:left="360"/>
+      </w:pPr>
+      <w:r>
+        <w:rPr>
+          <w:lang w:val="en-US"/>
+        </w:rPr>
+        <w:t>Find the top 3 running processes which consume the most processing power.</w:t>
+      </w:r>
+    </w:p>
+    <w:p>
+      <w:pPr>
+        <w:ind w:left="360"/>
+      </w:pPr>
+      <w:r>
+        <w:t> </w:t>
+      </w:r>
+      <w:r>
+        <w:drawing>
+          <wp:inline distT="0" distB="0" distL="0" distR="0" wp14:anchorId="5BB6F5CC" wp14:editId="2D29919A">
+            <wp:extent cx="5731510" cy="948690"/>
+            <wp:effectExtent l="0" t="0" r="2540" b="3810"/>
+            <wp:docPr id="1677486701" name="Picture 1"/>
+            <wp:cNvGraphicFramePr>
+              <a:graphicFrameLocks xmlns:a="http://schemas.openxmlformats.org/drawingml/2006/main" noChangeAspect="1"/>
+            </wp:cNvGraphicFramePr>
+            <a:graphic xmlns:a="http://schemas.openxmlformats.org/drawingml/2006/main">
+              <a:graphicData uri="http://schemas.openxmlformats.org/drawingml/2006/picture">
+                <pic:pic xmlns:pic="http://schemas.openxmlformats.org/drawingml/2006/picture">
+                  <pic:nvPicPr>
+                    <pic:cNvPr id="1677486701" name=""/>
+                    <pic:cNvPicPr/>
+                  </pic:nvPicPr>
+                  <pic:blipFill>
+                    <a:blip r:embed="rId9"/>
+                    <a:stretch>
+                      <a:fillRect/>
+                    </a:stretch>
+                  </pic:blipFill>
+                  <pic:spPr>
+                    <a:xfrm>
+                      <a:off x="0" y="0"/>
+                      <a:ext cx="5731510" cy="948690"/>
+                    </a:xfrm>
+                    <a:prstGeom prst="rect">
+                      <a:avLst/>
+                    </a:prstGeom>
+                  </pic:spPr>
+                </pic:pic>
+              </a:graphicData>
+            </a:graphic>
+          </wp:inline>
+        </w:drawing>
+      </w:r>
+    </w:p>
+    <w:p>
+      <w:pPr>
+        <w:numPr>
+          <w:ilvl w:val="0"/>
+          <w:numId w:val="17"/>
+        </w:numPr>
+        <w:tabs>
+          <w:tab w:val="clear" w:pos="720"/>
+          <w:tab w:val="num" w:pos="360"/>
+        </w:tabs>
+        <w:ind w:left="360"/>
+      </w:pPr>
+      <w:r>
+        <w:rPr>
+          <w:lang w:val="en-US"/>
+        </w:rPr>
+        <w:t>Write a script that finds all files larger than 100MB in a directory and lists them.</w:t>
+      </w:r>
+      <w:r>
+        <w:t> </w:t>
+      </w:r>
+    </w:p>
+    <w:p>
+      <w:pPr>
+        <w:ind w:left="360"/>
+      </w:pPr>
+      <w:r>
+        <w:drawing>
+          <wp:inline distT="0" distB="0" distL="0" distR="0" wp14:anchorId="692BCEC1" wp14:editId="50A7B8E0">
+            <wp:extent cx="5372850" cy="2686425"/>
+            <wp:effectExtent l="0" t="0" r="0" b="0"/>
+            <wp:docPr id="900831305" name="Picture 1"/>
+            <wp:cNvGraphicFramePr>
+              <a:graphicFrameLocks xmlns:a="http://schemas.openxmlformats.org/drawingml/2006/main" noChangeAspect="1"/>
+            </wp:cNvGraphicFramePr>
+            <a:graphic xmlns:a="http://schemas.openxmlformats.org/drawingml/2006/main">
+              <a:graphicData uri="http://schemas.openxmlformats.org/drawingml/2006/picture">
+                <pic:pic xmlns:pic="http://schemas.openxmlformats.org/drawingml/2006/picture">
+                  <pic:nvPicPr>
+                    <pic:cNvPr id="900831305" name=""/>
+                    <pic:cNvPicPr/>
+                  </pic:nvPicPr>
+                  <pic:blipFill>
+                    <a:blip r:embed="rId10"/>
+                    <a:stretch>
+                      <a:fillRect/>
+                    </a:stretch>
+                  </pic:blipFill>
+                  <pic:spPr>
+                    <a:xfrm>
+                      <a:off x="0" y="0"/>
+                      <a:ext cx="5372850" cy="2686425"/>
+                    </a:xfrm>
+                    <a:prstGeom prst="rect">
+                      <a:avLst/>
+                    </a:prstGeom>
+                  </pic:spPr>
+                </pic:pic>
+              </a:graphicData>
+            </a:graphic>
+          </wp:inline>
+        </w:drawing>
+      </w:r>
+    </w:p>
+    <w:p>
+      <w:pPr>
+        <w:ind w:left="360"/>
+      </w:pPr>
+    </w:p>
+    <w:p>
+      <w:pPr>
+        <w:numPr>
+          <w:ilvl w:val="0"/>
+          <w:numId w:val="18"/>
+        </w:numPr>
+        <w:tabs>
+          <w:tab w:val="clear" w:pos="720"/>
+          <w:tab w:val="num" w:pos="360"/>
+        </w:tabs>
+        <w:ind w:left="360"/>
+      </w:pPr>
+      <w:r>
+        <w:rPr>
+          <w:lang w:val="en-US"/>
+        </w:rPr>
+        <w:t>Find which version of Python is installed on the system.</w:t>
+      </w:r>
+      <w:r>
+        <w:t> </w:t>
+      </w:r>
+    </w:p>
+    <w:p>
+      <w:pPr>
+        <w:ind w:left="360"/>
+      </w:pPr>
+      <w:r>
+        <w:lastRenderedPageBreak/>
+        <w:drawing>
+          <wp:inline distT="0" distB="0" distL="0" distR="0" wp14:anchorId="7889FB68" wp14:editId="607ECDC0">
+            <wp:extent cx="4534533" cy="685896"/>
+            <wp:effectExtent l="0" t="0" r="0" b="0"/>
+            <wp:docPr id="1719350702" name="Picture 1"/>
+            <wp:cNvGraphicFramePr>
+              <a:graphicFrameLocks xmlns:a="http://schemas.openxmlformats.org/drawingml/2006/main" noChangeAspect="1"/>
+            </wp:cNvGraphicFramePr>
+            <a:graphic xmlns:a="http://schemas.openxmlformats.org/drawingml/2006/main">
+              <a:graphicData uri="http://schemas.openxmlformats.org/drawingml/2006/picture">
+                <pic:pic xmlns:pic="http://schemas.openxmlformats.org/drawingml/2006/picture">
+                  <pic:nvPicPr>
+                    <pic:cNvPr id="1719350702" name=""/>
+                    <pic:cNvPicPr/>
+                  </pic:nvPicPr>
+                  <pic:blipFill>
+                    <a:blip r:embed="rId11"/>
+                    <a:stretch>
+                      <a:fillRect/>
+                    </a:stretch>
+                  </pic:blipFill>
+                  <pic:spPr>
+                    <a:xfrm>
+                      <a:off x="0" y="0"/>
+                      <a:ext cx="4534533" cy="685896"/>
+                    </a:xfrm>
+                    <a:prstGeom prst="rect">
+                      <a:avLst/>
+                    </a:prstGeom>
+                  </pic:spPr>
+                </pic:pic>
+              </a:graphicData>
+            </a:graphic>
+          </wp:inline>
+        </w:drawing>
+      </w:r>
+    </w:p>
+    <w:p>
+      <w:pPr>
+        <w:numPr>
+          <w:ilvl w:val="0"/>
+          <w:numId w:val="19"/>
+        </w:numPr>
+        <w:tabs>
+          <w:tab w:val="clear" w:pos="720"/>
+          <w:tab w:val="num" w:pos="360"/>
+        </w:tabs>
+        <w:ind w:left="360"/>
+      </w:pPr>
+      <w:r>
+        <w:rPr>
+          <w:lang w:val="en-US"/>
+        </w:rPr>
+        <w:t>Get the current time zone of your system.</w:t>
+      </w:r>
+      <w:r>
+        <w:t> </w:t>
+      </w:r>
+    </w:p>
+    <w:p>
+      <w:pPr>
+        <w:ind w:left="360"/>
+      </w:pPr>
+      <w:r>
+        <w:drawing>
+          <wp:inline distT="0" distB="0" distL="0" distR="0" wp14:anchorId="1195BEB7" wp14:editId="38C232C5">
+            <wp:extent cx="4458322" cy="857370"/>
+            <wp:effectExtent l="0" t="0" r="0" b="0"/>
+            <wp:docPr id="159792462" name="Picture 1"/>
+            <wp:cNvGraphicFramePr>
+              <a:graphicFrameLocks xmlns:a="http://schemas.openxmlformats.org/drawingml/2006/main" noChangeAspect="1"/>
+            </wp:cNvGraphicFramePr>
+            <a:graphic xmlns:a="http://schemas.openxmlformats.org/drawingml/2006/main">
+              <a:graphicData uri="http://schemas.openxmlformats.org/drawingml/2006/picture">
+                <pic:pic xmlns:pic="http://schemas.openxmlformats.org/drawingml/2006/picture">
+                  <pic:nvPicPr>
+                    <pic:cNvPr id="159792462" name=""/>
+                    <pic:cNvPicPr/>
+                  </pic:nvPicPr>
+                  <pic:blipFill>
+                    <a:blip r:embed="rId12"/>
+                    <a:stretch>
+                      <a:fillRect/>
+                    </a:stretch>
+                  </pic:blipFill>
+                  <pic:spPr>
+                    <a:xfrm>
+                      <a:off x="0" y="0"/>
+                      <a:ext cx="4458322" cy="857370"/>
+                    </a:xfrm>
+                    <a:prstGeom prst="rect">
+                      <a:avLst/>
+                    </a:prstGeom>
+                  </pic:spPr>
+                </pic:pic>
+              </a:graphicData>
+            </a:graphic>
+          </wp:inline>
+        </w:drawing>
+      </w:r>
+    </w:p>
+    <w:p>
+      <w:pPr>
+        <w:numPr>
+          <w:ilvl w:val="0"/>
+          <w:numId w:val="20"/>
+        </w:numPr>
+        <w:tabs>
+          <w:tab w:val="clear" w:pos="720"/>
+          <w:tab w:val="num" w:pos="360"/>
+        </w:tabs>
+        <w:ind w:left="360"/>
+      </w:pPr>
+      <w:r>
+        <w:rPr>
+          <w:lang w:val="en-US"/>
+        </w:rPr>
+        <w:t>Get the current time in New York, London, and Sydney.</w:t>
+      </w:r>
+      <w:r>
+        <w:t> </w:t>
+      </w:r>
+    </w:p>
+    <w:p>
+      <w:pPr>
+        <w:ind w:left="360"/>
+      </w:pPr>
+      <w:r>
+        <w:drawing>
+          <wp:inline distT="0" distB="0" distL="0" distR="0" wp14:anchorId="073ABE5C" wp14:editId="73A596AD">
+            <wp:extent cx="5477639" cy="1781424"/>
+            <wp:effectExtent l="0" t="0" r="0" b="9525"/>
+            <wp:docPr id="180126348" name="Picture 1"/>
+            <wp:cNvGraphicFramePr>
+              <a:graphicFrameLocks xmlns:a="http://schemas.openxmlformats.org/drawingml/2006/main" noChangeAspect="1"/>
+            </wp:cNvGraphicFramePr>
+            <a:graphic xmlns:a="http://schemas.openxmlformats.org/drawingml/2006/main">
+              <a:graphicData uri="http://schemas.openxmlformats.org/drawingml/2006/picture">
+                <pic:pic xmlns:pic="http://schemas.openxmlformats.org/drawingml/2006/picture">
+                  <pic:nvPicPr>
+                    <pic:cNvPr id="180126348" name=""/>
+                    <pic:cNvPicPr/>
+                  </pic:nvPicPr>
+                  <pic:blipFill>
+                    <a:blip r:embed="rId13"/>
+                    <a:stretch>
+                      <a:fillRect/>
+                    </a:stretch>
+                  </pic:blipFill>
+                  <pic:spPr>
+                    <a:xfrm>
+                      <a:off x="0" y="0"/>
+                      <a:ext cx="5477639" cy="1781424"/>
+                    </a:xfrm>
+                    <a:prstGeom prst="rect">
+                      <a:avLst/>
+                    </a:prstGeom>
+                  </pic:spPr>
+                </pic:pic>
+              </a:graphicData>
+            </a:graphic>
+          </wp:inline>
+        </w:drawing>
+      </w:r>
+    </w:p>
+    <w:p>
+      <w:pPr>
+        <w:numPr>
+          <w:ilvl w:val="0"/>
+          <w:numId w:val="21"/>
+        </w:numPr>
+        <w:tabs>
+          <w:tab w:val="clear" w:pos="720"/>
+          <w:tab w:val="num" w:pos="360"/>
+        </w:tabs>
+        <w:ind w:left="360"/>
+      </w:pPr>
+      <w:r>
+        <w:rPr>
+          <w:lang w:val="en-US"/>
+        </w:rPr>
+        <w:t>Check for how long the system is up.</w:t>
+      </w:r>
+      <w:r>
+        <w:t> </w:t>
+      </w:r>
+    </w:p>
+    <w:p>
+      <w:pPr>
+        <w:ind w:left="360"/>
+      </w:pPr>
+      <w:r>
+        <w:drawing>
+          <wp:inline distT="0" distB="0" distL="0" distR="0" wp14:anchorId="7D49530A" wp14:editId="02C34359">
+            <wp:extent cx="5731510" cy="567055"/>
+            <wp:effectExtent l="0" t="0" r="2540" b="4445"/>
+            <wp:docPr id="25096565" name="Picture 1"/>
+            <wp:cNvGraphicFramePr>
+              <a:graphicFrameLocks xmlns:a="http://schemas.openxmlformats.org/drawingml/2006/main" noChangeAspect="1"/>
+            </wp:cNvGraphicFramePr>
+            <a:graphic xmlns:a="http://schemas.openxmlformats.org/drawingml/2006/main">
+              <a:graphicData uri="http://schemas.openxmlformats.org/drawingml/2006/picture">
+                <pic:pic xmlns:pic="http://schemas.openxmlformats.org/drawingml/2006/picture">
+                  <pic:nvPicPr>
+                    <pic:cNvPr id="25096565" name=""/>
+                    <pic:cNvPicPr/>
+                  </pic:nvPicPr>
+                  <pic:blipFill>
+                    <a:blip r:embed="rId14"/>
+                    <a:stretch>
+                      <a:fillRect/>
+                    </a:stretch>
+                  </pic:blipFill>
+                  <pic:spPr>
+                    <a:xfrm>
+                      <a:off x="0" y="0"/>
+                      <a:ext cx="5731510" cy="567055"/>
+                    </a:xfrm>
+                    <a:prstGeom prst="rect">
+                      <a:avLst/>
+                    </a:prstGeom>
+                  </pic:spPr>
+                </pic:pic>
+              </a:graphicData>
+            </a:graphic>
+          </wp:inline>
+        </w:drawing>
+      </w:r>
+    </w:p>
+    <w:p>
+      <w:pPr>
+        <w:rPr>
+          <w:lang w:val="en-US"/>
+        </w:rPr>
+      </w:pPr>
+      <w:r>
+        <w:rPr>
+          <w:lang w:val="en-US"/>
+        </w:rPr>
+        <w:t>9, 10. No Questions in assignment.</w:t>
+      </w:r>
+    </w:p>
+    <w:p>
+      <w:r>
+        <w:rPr>
+          <w:lang w:val="en-US"/>
+        </w:rPr>
+        <w:t>11.</w:t>
+      </w:r>
       <w:r>
         <w:rPr>
           <w:lang w:val="en-US"/>
@@ -44,6 +706,7 @@
         <w:rPr>
           <w:noProof/>
         </w:rPr>
+        <w:lastRenderedPageBreak/>
         <w:drawing>
           <wp:inline distT="0" distB="0" distL="0" distR="0" wp14:anchorId="7FBF8290" wp14:editId="1EAC47DC">
             <wp:extent cx="5731510" cy="4526915"/>
@@ -60,7 +723,7 @@
                     <pic:cNvPicPr/>
                   </pic:nvPicPr>
                   <pic:blipFill>
-                    <a:blip r:embed="rId5"/>
+                    <a:blip r:embed="rId15"/>
                     <a:stretch>
                       <a:fillRect/>
                     </a:stretch>
@@ -113,7 +776,7 @@
                     <pic:cNvPicPr/>
                   </pic:nvPicPr>
                   <pic:blipFill>
-                    <a:blip r:embed="rId6"/>
+                    <a:blip r:embed="rId16"/>
                     <a:stretch>
                       <a:fillRect/>
                     </a:stretch>
@@ -153,24 +816,24 @@
         <w:rPr>
           <w:lang w:val="en-US"/>
         </w:rPr>
+        <w:t xml:space="preserve">b. </w:t>
+      </w:r>
+      <w:r>
+        <w:rPr>
+          <w:lang w:val="en-US"/>
+        </w:rPr>
+        <w:t>What events occurred between 09:10 and 09:19?</w:t>
+      </w:r>
+      <w:r>
+        <w:t> </w:t>
+      </w:r>
+    </w:p>
+    <w:p>
+      <w:r>
+        <w:rPr>
+          <w:noProof/>
+        </w:rPr>
         <w:lastRenderedPageBreak/>
-        <w:t xml:space="preserve">b. </w:t>
-      </w:r>
-      <w:r>
-        <w:rPr>
-          <w:lang w:val="en-US"/>
-        </w:rPr>
-        <w:t>What events occurred between 09:10 and 09:19?</w:t>
-      </w:r>
-      <w:r>
-        <w:t> </w:t>
-      </w:r>
-    </w:p>
-    <w:p>
-      <w:r>
-        <w:rPr>
-          <w:noProof/>
-        </w:rPr>
         <w:drawing>
           <wp:inline distT="0" distB="0" distL="0" distR="0" wp14:anchorId="521FAD22" wp14:editId="38B828EE">
             <wp:extent cx="5731510" cy="2152650"/>
@@ -187,7 +850,7 @@
                     <pic:cNvPicPr/>
                   </pic:nvPicPr>
                   <pic:blipFill>
-                    <a:blip r:embed="rId7"/>
+                    <a:blip r:embed="rId17"/>
                     <a:stretch>
                       <a:fillRect/>
                     </a:stretch>
@@ -253,7 +916,7 @@
                     <pic:cNvPicPr/>
                   </pic:nvPicPr>
                   <pic:blipFill>
-                    <a:blip r:embed="rId8"/>
+                    <a:blip r:embed="rId18"/>
                     <a:stretch>
                       <a:fillRect/>
                     </a:stretch>
@@ -313,7 +976,7 @@
                     <pic:cNvPicPr/>
                   </pic:nvPicPr>
                   <pic:blipFill>
-                    <a:blip r:embed="rId9"/>
+                    <a:blip r:embed="rId19"/>
                     <a:stretch>
                       <a:fillRect/>
                     </a:stretch>
@@ -388,7 +1051,7 @@
                     <pic:cNvPicPr/>
                   </pic:nvPicPr>
                   <pic:blipFill>
-                    <a:blip r:embed="rId10"/>
+                    <a:blip r:embed="rId20"/>
                     <a:stretch>
                       <a:fillRect/>
                     </a:stretch>
@@ -413,21 +1076,21 @@
     <w:p/>
     <w:p>
       <w:r>
+        <w:t xml:space="preserve">f. </w:t>
+      </w:r>
+      <w:r>
+        <w:rPr>
+          <w:lang w:val="en-US"/>
+        </w:rPr>
+        <w:t> Print lines if the lines contain error, fail, or warning.</w:t>
+      </w:r>
+      <w:r>
+        <w:t> </w:t>
+      </w:r>
+    </w:p>
+    <w:p>
+      <w:r>
         <w:lastRenderedPageBreak/>
-        <w:t xml:space="preserve">f. </w:t>
-      </w:r>
-      <w:r>
-        <w:rPr>
-          <w:lang w:val="en-US"/>
-        </w:rPr>
-        <w:t> Print lines if the lines contain error, fail, or warning.</w:t>
-      </w:r>
-      <w:r>
-        <w:t> </w:t>
-      </w:r>
-    </w:p>
-    <w:p>
-      <w:r>
         <w:t>Use -</w:t>
       </w:r>
       <w:proofErr w:type="spellStart"/>
@@ -518,7 +1181,7 @@
                     <pic:cNvPicPr/>
                   </pic:nvPicPr>
                   <pic:blipFill>
-                    <a:blip r:embed="rId11"/>
+                    <a:blip r:embed="rId21"/>
                     <a:stretch>
                       <a:fillRect/>
                     </a:stretch>
@@ -575,7 +1238,7 @@
                     <pic:cNvPicPr/>
                   </pic:nvPicPr>
                   <pic:blipFill rotWithShape="1">
-                    <a:blip r:embed="rId12"/>
+                    <a:blip r:embed="rId22"/>
                     <a:srcRect r="13130"/>
                     <a:stretch/>
                   </pic:blipFill>
@@ -673,7 +1336,7 @@
                     <pic:cNvPicPr/>
                   </pic:nvPicPr>
                   <pic:blipFill>
-                    <a:blip r:embed="rId13"/>
+                    <a:blip r:embed="rId23"/>
                     <a:stretch>
                       <a:fillRect/>
                     </a:stretch>
@@ -1005,7 +1668,7 @@
                     <pic:cNvPicPr/>
                   </pic:nvPicPr>
                   <pic:blipFill>
-                    <a:blip r:embed="rId14"/>
+                    <a:blip r:embed="rId24"/>
                     <a:stretch>
                       <a:fillRect/>
                     </a:stretch>
@@ -1177,7 +1840,7 @@
                     <pic:cNvPicPr/>
                   </pic:nvPicPr>
                   <pic:blipFill>
-                    <a:blip r:embed="rId15"/>
+                    <a:blip r:embed="rId25"/>
                     <a:stretch>
                       <a:fillRect/>
                     </a:stretch>
@@ -1317,7 +1980,7 @@
                     <pic:cNvPicPr/>
                   </pic:nvPicPr>
                   <pic:blipFill>
-                    <a:blip r:embed="rId16"/>
+                    <a:blip r:embed="rId26"/>
                     <a:stretch>
                       <a:fillRect/>
                     </a:stretch>
@@ -1386,6 +2049,7 @@
       </w:pPr>
       <w:r>
         <w:rPr>
+          <w:noProof/>
           <w:lang w:val="en-US"/>
         </w:rPr>
         <w:drawing>
@@ -1404,7 +2068,7 @@
                     <pic:cNvPicPr/>
                   </pic:nvPicPr>
                   <pic:blipFill>
-                    <a:blip r:embed="rId17"/>
+                    <a:blip r:embed="rId27"/>
                     <a:stretch>
                       <a:fillRect/>
                     </a:stretch>
@@ -1451,7 +2115,17 @@
       </w:r>
     </w:p>
     <w:p>
-      <w:r>
+      <w:pPr>
+        <w:rPr>
+          <w:i/>
+          <w:iCs/>
+        </w:rPr>
+      </w:pPr>
+      <w:r>
+        <w:rPr>
+          <w:i/>
+          <w:iCs/>
+        </w:rPr>
         <w:t>Need to install VMWare for providing execution permission</w:t>
       </w:r>
     </w:p>
@@ -1470,7 +2144,55 @@
         <w:t> </w:t>
       </w:r>
     </w:p>
-    <w:p/>
+    <w:p>
+      <w:proofErr w:type="gramStart"/>
+      <w:r>
+        <w:t>444 .</w:t>
+      </w:r>
+      <w:proofErr w:type="gramEnd"/>
+      <w:r>
+        <w:t xml:space="preserve"> : “.” Dot means current directory.</w:t>
+      </w:r>
+    </w:p>
+    <w:p>
+      <w:r>
+        <w:drawing>
+          <wp:inline distT="0" distB="0" distL="0" distR="0" wp14:anchorId="4567CACD" wp14:editId="4BEC970B">
+            <wp:extent cx="5731510" cy="2914650"/>
+            <wp:effectExtent l="0" t="0" r="2540" b="0"/>
+            <wp:docPr id="1728822086" name="Picture 1"/>
+            <wp:cNvGraphicFramePr>
+              <a:graphicFrameLocks xmlns:a="http://schemas.openxmlformats.org/drawingml/2006/main" noChangeAspect="1"/>
+            </wp:cNvGraphicFramePr>
+            <a:graphic xmlns:a="http://schemas.openxmlformats.org/drawingml/2006/main">
+              <a:graphicData uri="http://schemas.openxmlformats.org/drawingml/2006/picture">
+                <pic:pic xmlns:pic="http://schemas.openxmlformats.org/drawingml/2006/picture">
+                  <pic:nvPicPr>
+                    <pic:cNvPr id="1728822086" name=""/>
+                    <pic:cNvPicPr/>
+                  </pic:nvPicPr>
+                  <pic:blipFill>
+                    <a:blip r:embed="rId28"/>
+                    <a:stretch>
+                      <a:fillRect/>
+                    </a:stretch>
+                  </pic:blipFill>
+                  <pic:spPr>
+                    <a:xfrm>
+                      <a:off x="0" y="0"/>
+                      <a:ext cx="5731510" cy="2914650"/>
+                    </a:xfrm>
+                    <a:prstGeom prst="rect">
+                      <a:avLst/>
+                    </a:prstGeom>
+                  </pic:spPr>
+                </pic:pic>
+              </a:graphicData>
+            </a:graphic>
+          </wp:inline>
+        </w:drawing>
+      </w:r>
+    </w:p>
     <w:p>
       <w:pPr>
         <w:tabs>
@@ -1498,6 +2220,7 @@
       </w:pPr>
       <w:r>
         <w:rPr>
+          <w:noProof/>
           <w:lang w:val="en-US"/>
         </w:rPr>
         <w:drawing>
@@ -1516,7 +2239,7 @@
                     <pic:cNvPicPr/>
                   </pic:nvPicPr>
                   <pic:blipFill>
-                    <a:blip r:embed="rId18"/>
+                    <a:blip r:embed="rId29"/>
                     <a:stretch>
                       <a:fillRect/>
                     </a:stretch>
@@ -1554,6 +2277,9 @@
     </w:p>
     <w:p>
       <w:r>
+        <w:rPr>
+          <w:noProof/>
+        </w:rPr>
         <w:drawing>
           <wp:inline distT="0" distB="0" distL="0" distR="0" wp14:anchorId="3746B167" wp14:editId="7CC1D8D7">
             <wp:extent cx="5731510" cy="1174750"/>
@@ -1570,7 +2296,7 @@
                     <pic:cNvPicPr/>
                   </pic:nvPicPr>
                   <pic:blipFill>
-                    <a:blip r:embed="rId19"/>
+                    <a:blip r:embed="rId30"/>
                     <a:stretch>
                       <a:fillRect/>
                     </a:stretch>
@@ -1593,6 +2319,7 @@
     </w:p>
     <w:p>
       <w:r>
+        <w:lastRenderedPageBreak/>
         <w:t xml:space="preserve">Difference between </w:t>
       </w:r>
       <w:proofErr w:type="spellStart"/>
@@ -1901,7 +2628,6 @@
     </w:p>
     <w:p>
       <w:r>
-        <w:lastRenderedPageBreak/>
         <w:t>Need VMWare</w:t>
       </w:r>
     </w:p>
@@ -2050,6 +2776,9 @@
     </w:p>
     <w:p>
       <w:r>
+        <w:rPr>
+          <w:noProof/>
+        </w:rPr>
         <w:drawing>
           <wp:inline distT="0" distB="0" distL="0" distR="0" wp14:anchorId="5516554E" wp14:editId="0F6A10FF">
             <wp:extent cx="5731510" cy="1770380"/>
@@ -2066,7 +2795,7 @@
                     <pic:cNvPicPr/>
                   </pic:nvPicPr>
                   <pic:blipFill>
-                    <a:blip r:embed="rId20"/>
+                    <a:blip r:embed="rId31"/>
                     <a:stretch>
                       <a:fillRect/>
                     </a:stretch>
@@ -2114,6 +2843,10 @@
     </w:p>
     <w:p>
       <w:r>
+        <w:rPr>
+          <w:noProof/>
+        </w:rPr>
+        <w:lastRenderedPageBreak/>
         <w:drawing>
           <wp:inline distT="0" distB="0" distL="0" distR="0" wp14:anchorId="3CFA88D1" wp14:editId="075AFBF6">
             <wp:extent cx="5731510" cy="1772920"/>
@@ -2130,7 +2863,7 @@
                     <pic:cNvPicPr/>
                   </pic:nvPicPr>
                   <pic:blipFill>
-                    <a:blip r:embed="rId21"/>
+                    <a:blip r:embed="rId32"/>
                     <a:stretch>
                       <a:fillRect/>
                     </a:stretch>
@@ -2177,6 +2910,9 @@
     </w:p>
     <w:p>
       <w:r>
+        <w:rPr>
+          <w:noProof/>
+        </w:rPr>
         <w:drawing>
           <wp:inline distT="0" distB="0" distL="0" distR="0" wp14:anchorId="321D5647" wp14:editId="2A83B018">
             <wp:extent cx="5391902" cy="704948"/>
@@ -2193,7 +2929,7 @@
                     <pic:cNvPicPr/>
                   </pic:nvPicPr>
                   <pic:blipFill>
-                    <a:blip r:embed="rId22"/>
+                    <a:blip r:embed="rId33"/>
                     <a:stretch>
                       <a:fillRect/>
                     </a:stretch>
@@ -2234,7 +2970,6 @@
     </w:p>
     <w:p>
       <w:r>
-        <w:lastRenderedPageBreak/>
         <w:t>First created a temporary process (</w:t>
       </w:r>
       <w:r>
@@ -2246,6 +2981,9 @@
     </w:p>
     <w:p>
       <w:r>
+        <w:rPr>
+          <w:noProof/>
+        </w:rPr>
         <w:drawing>
           <wp:inline distT="0" distB="0" distL="0" distR="0" wp14:anchorId="5DB8CFFF" wp14:editId="16105FA7">
             <wp:extent cx="4572638" cy="2257740"/>
@@ -2262,7 +3000,7 @@
                     <pic:cNvPicPr/>
                   </pic:nvPicPr>
                   <pic:blipFill>
-                    <a:blip r:embed="rId23"/>
+                    <a:blip r:embed="rId34"/>
                     <a:stretch>
                       <a:fillRect/>
                     </a:stretch>
@@ -2319,6 +3057,10 @@
         <w:ind w:left="360"/>
       </w:pPr>
       <w:r>
+        <w:rPr>
+          <w:noProof/>
+        </w:rPr>
+        <w:lastRenderedPageBreak/>
         <w:drawing>
           <wp:inline distT="0" distB="0" distL="0" distR="0" wp14:anchorId="6D93113B" wp14:editId="25C3B840">
             <wp:extent cx="5731510" cy="1981835"/>
@@ -2335,7 +3077,7 @@
                     <pic:cNvPicPr/>
                   </pic:nvPicPr>
                   <pic:blipFill>
-                    <a:blip r:embed="rId24"/>
+                    <a:blip r:embed="rId35"/>
                     <a:stretch>
                       <a:fillRect/>
                     </a:stretch>
@@ -2393,6 +3135,9 @@
         <w:ind w:left="360"/>
       </w:pPr>
       <w:r>
+        <w:rPr>
+          <w:noProof/>
+        </w:rPr>
         <w:drawing>
           <wp:inline distT="0" distB="0" distL="0" distR="0" wp14:anchorId="757F8031" wp14:editId="492ED5D5">
             <wp:extent cx="5731510" cy="1305560"/>
@@ -2409,7 +3154,7 @@
                     <pic:cNvPicPr/>
                   </pic:nvPicPr>
                   <pic:blipFill>
-                    <a:blip r:embed="rId25"/>
+                    <a:blip r:embed="rId36"/>
                     <a:stretch>
                       <a:fillRect/>
                     </a:stretch>
@@ -2454,7 +3199,9 @@
     </w:p>
     <w:p>
       <w:r>
-        <w:lastRenderedPageBreak/>
+        <w:rPr>
+          <w:noProof/>
+        </w:rPr>
         <w:drawing>
           <wp:inline distT="0" distB="0" distL="0" distR="0" wp14:anchorId="206B752F" wp14:editId="5EBD6247">
             <wp:extent cx="5731510" cy="4214495"/>
@@ -2471,7 +3218,7 @@
                     <pic:cNvPicPr/>
                   </pic:nvPicPr>
                   <pic:blipFill>
-                    <a:blip r:embed="rId26"/>
+                    <a:blip r:embed="rId37"/>
                     <a:stretch>
                       <a:fillRect/>
                     </a:stretch>
@@ -2576,6 +3323,9 @@
         <w:ind w:left="360"/>
       </w:pPr>
       <w:r>
+        <w:rPr>
+          <w:noProof/>
+        </w:rPr>
         <w:drawing>
           <wp:inline distT="0" distB="0" distL="0" distR="0" wp14:anchorId="388F3B43" wp14:editId="69E1489D">
             <wp:extent cx="5068007" cy="3038899"/>
@@ -2592,7 +3342,7 @@
                     <pic:cNvPicPr/>
                   </pic:nvPicPr>
                   <pic:blipFill>
-                    <a:blip r:embed="rId27"/>
+                    <a:blip r:embed="rId38"/>
                     <a:stretch>
                       <a:fillRect/>
                     </a:stretch>
@@ -2676,7 +3426,6 @@
           <w:b/>
           <w:bCs/>
         </w:rPr>
-        <w:lastRenderedPageBreak/>
         <w:t>#!/</w:t>
       </w:r>
       <w:proofErr w:type="gramEnd"/>
@@ -2834,6 +3583,10 @@
         <w:ind w:left="360"/>
       </w:pPr>
       <w:r>
+        <w:rPr>
+          <w:noProof/>
+        </w:rPr>
+        <w:lastRenderedPageBreak/>
         <w:drawing>
           <wp:inline distT="0" distB="0" distL="0" distR="0" wp14:anchorId="397F5D78" wp14:editId="66319943">
             <wp:extent cx="4686954" cy="3153215"/>
@@ -2850,7 +3603,7 @@
                     <pic:cNvPicPr/>
                   </pic:nvPicPr>
                   <pic:blipFill>
-                    <a:blip r:embed="rId28"/>
+                    <a:blip r:embed="rId39"/>
                     <a:stretch>
                       <a:fillRect/>
                     </a:stretch>
@@ -2883,11 +3636,203 @@
         </w:tabs>
         <w:ind w:left="360"/>
       </w:pPr>
+      <w:r>
+        <w:rPr>
+          <w:lang w:val="en-US"/>
+        </w:rPr>
+        <w:t xml:space="preserve">Write a command to download file.zip from  </w:t>
+      </w:r>
+      <w:hyperlink r:id="rId40" w:tgtFrame="_blank" w:history="1">
+        <w:r>
+          <w:rPr>
+            <w:rStyle w:val="Hyperlink"/>
+            <w:lang w:val="en-US"/>
+          </w:rPr>
+          <w:t>https://github.com/github/gitignore/archive/refs/heads/main.zip</w:t>
+        </w:r>
+      </w:hyperlink>
+      <w:r>
+        <w:t> </w:t>
+      </w:r>
+    </w:p>
+    <w:p>
+      <w:pPr>
+        <w:ind w:left="360"/>
+      </w:pPr>
+      <w:r>
+        <w:drawing>
+          <wp:inline distT="0" distB="0" distL="0" distR="0" wp14:anchorId="13EE6D26" wp14:editId="33DDC80A">
+            <wp:extent cx="5731510" cy="767715"/>
+            <wp:effectExtent l="0" t="0" r="2540" b="0"/>
+            <wp:docPr id="2092413722" name="Picture 1"/>
+            <wp:cNvGraphicFramePr>
+              <a:graphicFrameLocks xmlns:a="http://schemas.openxmlformats.org/drawingml/2006/main" noChangeAspect="1"/>
+            </wp:cNvGraphicFramePr>
+            <a:graphic xmlns:a="http://schemas.openxmlformats.org/drawingml/2006/main">
+              <a:graphicData uri="http://schemas.openxmlformats.org/drawingml/2006/picture">
+                <pic:pic xmlns:pic="http://schemas.openxmlformats.org/drawingml/2006/picture">
+                  <pic:nvPicPr>
+                    <pic:cNvPr id="2092413722" name=""/>
+                    <pic:cNvPicPr/>
+                  </pic:nvPicPr>
+                  <pic:blipFill>
+                    <a:blip r:embed="rId41"/>
+                    <a:stretch>
+                      <a:fillRect/>
+                    </a:stretch>
+                  </pic:blipFill>
+                  <pic:spPr>
+                    <a:xfrm>
+                      <a:off x="0" y="0"/>
+                      <a:ext cx="5731510" cy="767715"/>
+                    </a:xfrm>
+                    <a:prstGeom prst="rect">
+                      <a:avLst/>
+                    </a:prstGeom>
+                  </pic:spPr>
+                </pic:pic>
+              </a:graphicData>
+            </a:graphic>
+          </wp:inline>
+        </w:drawing>
+      </w:r>
     </w:p>
     <w:p/>
-    <w:p/>
-    <w:p/>
-    <w:p/>
+    <w:p>
+      <w:pPr>
+        <w:pStyle w:val="ListParagraph"/>
+        <w:numPr>
+          <w:ilvl w:val="0"/>
+          <w:numId w:val="8"/>
+        </w:numPr>
+      </w:pPr>
+      <w:r>
+        <w:rPr>
+          <w:lang w:val="en-US"/>
+        </w:rPr>
+        <w:t>Write a command to zip test.txt to test.zip and unzip it.</w:t>
+      </w:r>
+      <w:r>
+        <w:t> </w:t>
+      </w:r>
+    </w:p>
+    <w:p>
+      <w:pPr>
+        <w:pStyle w:val="ListParagraph"/>
+      </w:pPr>
+      <w:proofErr w:type="spellStart"/>
+      <w:proofErr w:type="gramStart"/>
+      <w:r>
+        <w:t>a.Zip</w:t>
+      </w:r>
+      <w:proofErr w:type="spellEnd"/>
+      <w:proofErr w:type="gramEnd"/>
+      <w:r>
+        <w:t>:</w:t>
+      </w:r>
+    </w:p>
+    <w:p>
+      <w:pPr>
+        <w:pStyle w:val="ListParagraph"/>
+        <w:ind w:left="1080"/>
+      </w:pPr>
+      <w:r>
+        <w:drawing>
+          <wp:inline distT="0" distB="0" distL="0" distR="0" wp14:anchorId="0E2E7797" wp14:editId="27AE9B3F">
+            <wp:extent cx="5315692" cy="1562318"/>
+            <wp:effectExtent l="0" t="0" r="0" b="0"/>
+            <wp:docPr id="1950367327" name="Picture 1"/>
+            <wp:cNvGraphicFramePr>
+              <a:graphicFrameLocks xmlns:a="http://schemas.openxmlformats.org/drawingml/2006/main" noChangeAspect="1"/>
+            </wp:cNvGraphicFramePr>
+            <a:graphic xmlns:a="http://schemas.openxmlformats.org/drawingml/2006/main">
+              <a:graphicData uri="http://schemas.openxmlformats.org/drawingml/2006/picture">
+                <pic:pic xmlns:pic="http://schemas.openxmlformats.org/drawingml/2006/picture">
+                  <pic:nvPicPr>
+                    <pic:cNvPr id="1950367327" name=""/>
+                    <pic:cNvPicPr/>
+                  </pic:nvPicPr>
+                  <pic:blipFill>
+                    <a:blip r:embed="rId42"/>
+                    <a:stretch>
+                      <a:fillRect/>
+                    </a:stretch>
+                  </pic:blipFill>
+                  <pic:spPr>
+                    <a:xfrm>
+                      <a:off x="0" y="0"/>
+                      <a:ext cx="5315692" cy="1562318"/>
+                    </a:xfrm>
+                    <a:prstGeom prst="rect">
+                      <a:avLst/>
+                    </a:prstGeom>
+                  </pic:spPr>
+                </pic:pic>
+              </a:graphicData>
+            </a:graphic>
+          </wp:inline>
+        </w:drawing>
+      </w:r>
+    </w:p>
+    <w:p>
+      <w:pPr>
+        <w:pStyle w:val="ListParagraph"/>
+        <w:numPr>
+          <w:ilvl w:val="1"/>
+          <w:numId w:val="2"/>
+        </w:numPr>
+      </w:pPr>
+      <w:proofErr w:type="spellStart"/>
+      <w:r>
+        <w:t>UnZip</w:t>
+      </w:r>
+      <w:proofErr w:type="spellEnd"/>
+      <w:r>
+        <w:t>:</w:t>
+      </w:r>
+    </w:p>
+    <w:p>
+      <w:pPr>
+        <w:ind w:left="720"/>
+      </w:pPr>
+      <w:r>
+        <w:drawing>
+          <wp:inline distT="0" distB="0" distL="0" distR="0" wp14:anchorId="3A50DAB3" wp14:editId="22475D89">
+            <wp:extent cx="5731510" cy="1088390"/>
+            <wp:effectExtent l="0" t="0" r="2540" b="0"/>
+            <wp:docPr id="1532488731" name="Picture 1"/>
+            <wp:cNvGraphicFramePr>
+              <a:graphicFrameLocks xmlns:a="http://schemas.openxmlformats.org/drawingml/2006/main" noChangeAspect="1"/>
+            </wp:cNvGraphicFramePr>
+            <a:graphic xmlns:a="http://schemas.openxmlformats.org/drawingml/2006/main">
+              <a:graphicData uri="http://schemas.openxmlformats.org/drawingml/2006/picture">
+                <pic:pic xmlns:pic="http://schemas.openxmlformats.org/drawingml/2006/picture">
+                  <pic:nvPicPr>
+                    <pic:cNvPr id="1532488731" name=""/>
+                    <pic:cNvPicPr/>
+                  </pic:nvPicPr>
+                  <pic:blipFill>
+                    <a:blip r:embed="rId43"/>
+                    <a:stretch>
+                      <a:fillRect/>
+                    </a:stretch>
+                  </pic:blipFill>
+                  <pic:spPr>
+                    <a:xfrm>
+                      <a:off x="0" y="0"/>
+                      <a:ext cx="5731510" cy="1088390"/>
+                    </a:xfrm>
+                    <a:prstGeom prst="rect">
+                      <a:avLst/>
+                    </a:prstGeom>
+                  </pic:spPr>
+                </pic:pic>
+              </a:graphicData>
+            </a:graphic>
+          </wp:inline>
+        </w:drawing>
+      </w:r>
+    </w:p>
     <w:sectPr>
       <w:pgSz w:w="11906" w:h="16838"/>
       <w:pgMar w:top="1440" w:right="1440" w:bottom="1440" w:left="1440" w:header="708" w:footer="708" w:gutter="0"/>
@@ -2901,6 +3846,345 @@
 <file path=word/numbering.xml><?xml version="1.0" encoding="utf-8"?>
 <w:numbering xmlns:wpc="http://schemas.microsoft.com/office/word/2010/wordprocessingCanvas" xmlns:cx="http://schemas.microsoft.com/office/drawing/2014/chartex" xmlns:cx1="http://schemas.microsoft.com/office/drawing/2015/9/8/chartex" xmlns:cx2="http://schemas.microsoft.com/office/drawing/2015/10/21/chartex" xmlns:cx3="http://schemas.microsoft.com/office/drawing/2016/5/9/chartex" xmlns:cx4="http://schemas.microsoft.com/office/drawing/2016/5/10/chartex" xmlns:cx5="http://schemas.microsoft.com/office/drawing/2016/5/11/chartex" xmlns:cx6="http://schemas.microsoft.com/office/drawing/2016/5/12/chartex" xmlns:cx7="http://schemas.microsoft.com/office/drawing/2016/5/13/chartex" xmlns:cx8="http://schemas.microsoft.com/office/drawing/2016/5/14/chartex" xmlns:mc="http://schemas.openxmlformats.org/markup-compatibility/2006" xmlns:aink="http://schemas.microsoft.com/office/drawing/2016/ink" xmlns:am3d="http://schemas.microsoft.com/office/drawing/2017/model3d" xmlns:o="urn:schemas-microsoft-com:office:office" xmlns:oel="http://schemas.microsoft.com/office/2019/extlst" xmlns:r="http://schemas.openxmlformats.org/officeDocument/2006/relationships" xmlns:m="http://schemas.openxmlformats.org/officeDocument/2006/math" xmlns:v="urn:schemas-microsoft-com:vml" xmlns:wp14="http://schemas.microsoft.com/office/word/2010/wordprocessingDrawing" xmlns:wp="http://schemas.openxmlformats.org/drawingml/2006/wordprocessingDrawing" xmlns:w10="urn:schemas-microsoft-com:office:word" xmlns:w="http://schemas.openxmlformats.org/wordprocessingml/2006/main" xmlns:w14="http://schemas.microsoft.com/office/word/2010/wordml" xmlns:w15="http://schemas.microsoft.com/office/word/2012/wordml" xmlns:w16cex="http://schemas.microsoft.com/office/word/2018/wordml/cex" xmlns:w16cid="http://schemas.microsoft.com/office/word/2016/wordml/cid" xmlns:w16="http://schemas.microsoft.com/office/word/2018/wordml" xmlns:w16sdtdh="http://schemas.microsoft.com/office/word/2020/wordml/sdtdatahash" xmlns:w16se="http://schemas.microsoft.com/office/word/2015/wordml/symex" xmlns:wpg="http://schemas.microsoft.com/office/word/2010/wordprocessingGroup" xmlns:wpi="http://schemas.microsoft.com/office/word/2010/wordprocessingInk" xmlns:wne="http://schemas.microsoft.com/office/word/2006/wordml" xmlns:wps="http://schemas.microsoft.com/office/word/2010/wordprocessingShape" mc:Ignorable="w14 w15 w16se w16cid w16 w16cex w16sdtdh wp14">
   <w:abstractNum w:abstractNumId="0" w15:restartNumberingAfterBreak="0">
+    <w:nsid w:val="00FA2F5E"/>
+    <w:multiLevelType w:val="multilevel"/>
+    <w:tmpl w:val="A650D392"/>
+    <w:lvl w:ilvl="0">
+      <w:start w:val="2"/>
+      <w:numFmt w:val="lowerLetter"/>
+      <w:lvlText w:val="%1."/>
+      <w:lvlJc w:val="left"/>
+      <w:pPr>
+        <w:tabs>
+          <w:tab w:val="num" w:pos="720"/>
+        </w:tabs>
+        <w:ind w:left="720" w:hanging="360"/>
+      </w:pPr>
+    </w:lvl>
+    <w:lvl w:ilvl="1" w:tentative="1">
+      <w:start w:val="1"/>
+      <w:numFmt w:val="lowerLetter"/>
+      <w:lvlText w:val="%2."/>
+      <w:lvlJc w:val="left"/>
+      <w:pPr>
+        <w:tabs>
+          <w:tab w:val="num" w:pos="1440"/>
+        </w:tabs>
+        <w:ind w:left="1440" w:hanging="360"/>
+      </w:pPr>
+    </w:lvl>
+    <w:lvl w:ilvl="2" w:tentative="1">
+      <w:start w:val="1"/>
+      <w:numFmt w:val="lowerLetter"/>
+      <w:lvlText w:val="%3."/>
+      <w:lvlJc w:val="left"/>
+      <w:pPr>
+        <w:tabs>
+          <w:tab w:val="num" w:pos="2160"/>
+        </w:tabs>
+        <w:ind w:left="2160" w:hanging="360"/>
+      </w:pPr>
+    </w:lvl>
+    <w:lvl w:ilvl="3" w:tentative="1">
+      <w:start w:val="1"/>
+      <w:numFmt w:val="lowerLetter"/>
+      <w:lvlText w:val="%4."/>
+      <w:lvlJc w:val="left"/>
+      <w:pPr>
+        <w:tabs>
+          <w:tab w:val="num" w:pos="2880"/>
+        </w:tabs>
+        <w:ind w:left="2880" w:hanging="360"/>
+      </w:pPr>
+    </w:lvl>
+    <w:lvl w:ilvl="4" w:tentative="1">
+      <w:start w:val="1"/>
+      <w:numFmt w:val="lowerLetter"/>
+      <w:lvlText w:val="%5."/>
+      <w:lvlJc w:val="left"/>
+      <w:pPr>
+        <w:tabs>
+          <w:tab w:val="num" w:pos="3600"/>
+        </w:tabs>
+        <w:ind w:left="3600" w:hanging="360"/>
+      </w:pPr>
+    </w:lvl>
+    <w:lvl w:ilvl="5" w:tentative="1">
+      <w:start w:val="1"/>
+      <w:numFmt w:val="lowerLetter"/>
+      <w:lvlText w:val="%6."/>
+      <w:lvlJc w:val="left"/>
+      <w:pPr>
+        <w:tabs>
+          <w:tab w:val="num" w:pos="4320"/>
+        </w:tabs>
+        <w:ind w:left="4320" w:hanging="360"/>
+      </w:pPr>
+    </w:lvl>
+    <w:lvl w:ilvl="6" w:tentative="1">
+      <w:start w:val="1"/>
+      <w:numFmt w:val="lowerLetter"/>
+      <w:lvlText w:val="%7."/>
+      <w:lvlJc w:val="left"/>
+      <w:pPr>
+        <w:tabs>
+          <w:tab w:val="num" w:pos="5040"/>
+        </w:tabs>
+        <w:ind w:left="5040" w:hanging="360"/>
+      </w:pPr>
+    </w:lvl>
+    <w:lvl w:ilvl="7" w:tentative="1">
+      <w:start w:val="1"/>
+      <w:numFmt w:val="lowerLetter"/>
+      <w:lvlText w:val="%8."/>
+      <w:lvlJc w:val="left"/>
+      <w:pPr>
+        <w:tabs>
+          <w:tab w:val="num" w:pos="5760"/>
+        </w:tabs>
+        <w:ind w:left="5760" w:hanging="360"/>
+      </w:pPr>
+    </w:lvl>
+    <w:lvl w:ilvl="8" w:tentative="1">
+      <w:start w:val="1"/>
+      <w:numFmt w:val="lowerLetter"/>
+      <w:lvlText w:val="%9."/>
+      <w:lvlJc w:val="left"/>
+      <w:pPr>
+        <w:tabs>
+          <w:tab w:val="num" w:pos="6480"/>
+        </w:tabs>
+        <w:ind w:left="6480" w:hanging="360"/>
+      </w:pPr>
+    </w:lvl>
+  </w:abstractNum>
+  <w:abstractNum w:abstractNumId="1" w15:restartNumberingAfterBreak="0">
+    <w:nsid w:val="026172C1"/>
+    <w:multiLevelType w:val="multilevel"/>
+    <w:tmpl w:val="41A49508"/>
+    <w:lvl w:ilvl="0">
+      <w:start w:val="4"/>
+      <w:numFmt w:val="decimal"/>
+      <w:lvlText w:val="%1."/>
+      <w:lvlJc w:val="left"/>
+      <w:pPr>
+        <w:tabs>
+          <w:tab w:val="num" w:pos="720"/>
+        </w:tabs>
+        <w:ind w:left="720" w:hanging="360"/>
+      </w:pPr>
+    </w:lvl>
+    <w:lvl w:ilvl="1" w:tentative="1">
+      <w:start w:val="1"/>
+      <w:numFmt w:val="decimal"/>
+      <w:lvlText w:val="%2."/>
+      <w:lvlJc w:val="left"/>
+      <w:pPr>
+        <w:tabs>
+          <w:tab w:val="num" w:pos="1440"/>
+        </w:tabs>
+        <w:ind w:left="1440" w:hanging="360"/>
+      </w:pPr>
+    </w:lvl>
+    <w:lvl w:ilvl="2" w:tentative="1">
+      <w:start w:val="1"/>
+      <w:numFmt w:val="decimal"/>
+      <w:lvlText w:val="%3."/>
+      <w:lvlJc w:val="left"/>
+      <w:pPr>
+        <w:tabs>
+          <w:tab w:val="num" w:pos="2160"/>
+        </w:tabs>
+        <w:ind w:left="2160" w:hanging="360"/>
+      </w:pPr>
+    </w:lvl>
+    <w:lvl w:ilvl="3" w:tentative="1">
+      <w:start w:val="1"/>
+      <w:numFmt w:val="decimal"/>
+      <w:lvlText w:val="%4."/>
+      <w:lvlJc w:val="left"/>
+      <w:pPr>
+        <w:tabs>
+          <w:tab w:val="num" w:pos="2880"/>
+        </w:tabs>
+        <w:ind w:left="2880" w:hanging="360"/>
+      </w:pPr>
+    </w:lvl>
+    <w:lvl w:ilvl="4" w:tentative="1">
+      <w:start w:val="1"/>
+      <w:numFmt w:val="decimal"/>
+      <w:lvlText w:val="%5."/>
+      <w:lvlJc w:val="left"/>
+      <w:pPr>
+        <w:tabs>
+          <w:tab w:val="num" w:pos="3600"/>
+        </w:tabs>
+        <w:ind w:left="3600" w:hanging="360"/>
+      </w:pPr>
+    </w:lvl>
+    <w:lvl w:ilvl="5" w:tentative="1">
+      <w:start w:val="1"/>
+      <w:numFmt w:val="decimal"/>
+      <w:lvlText w:val="%6."/>
+      <w:lvlJc w:val="left"/>
+      <w:pPr>
+        <w:tabs>
+          <w:tab w:val="num" w:pos="4320"/>
+        </w:tabs>
+        <w:ind w:left="4320" w:hanging="360"/>
+      </w:pPr>
+    </w:lvl>
+    <w:lvl w:ilvl="6" w:tentative="1">
+      <w:start w:val="1"/>
+      <w:numFmt w:val="decimal"/>
+      <w:lvlText w:val="%7."/>
+      <w:lvlJc w:val="left"/>
+      <w:pPr>
+        <w:tabs>
+          <w:tab w:val="num" w:pos="5040"/>
+        </w:tabs>
+        <w:ind w:left="5040" w:hanging="360"/>
+      </w:pPr>
+    </w:lvl>
+    <w:lvl w:ilvl="7" w:tentative="1">
+      <w:start w:val="1"/>
+      <w:numFmt w:val="decimal"/>
+      <w:lvlText w:val="%8."/>
+      <w:lvlJc w:val="left"/>
+      <w:pPr>
+        <w:tabs>
+          <w:tab w:val="num" w:pos="5760"/>
+        </w:tabs>
+        <w:ind w:left="5760" w:hanging="360"/>
+      </w:pPr>
+    </w:lvl>
+    <w:lvl w:ilvl="8" w:tentative="1">
+      <w:start w:val="1"/>
+      <w:numFmt w:val="decimal"/>
+      <w:lvlText w:val="%9."/>
+      <w:lvlJc w:val="left"/>
+      <w:pPr>
+        <w:tabs>
+          <w:tab w:val="num" w:pos="6480"/>
+        </w:tabs>
+        <w:ind w:left="6480" w:hanging="360"/>
+      </w:pPr>
+    </w:lvl>
+  </w:abstractNum>
+  <w:abstractNum w:abstractNumId="2" w15:restartNumberingAfterBreak="0">
+    <w:nsid w:val="0E446683"/>
+    <w:multiLevelType w:val="multilevel"/>
+    <w:tmpl w:val="E4D8E04C"/>
+    <w:lvl w:ilvl="0">
+      <w:start w:val="6"/>
+      <w:numFmt w:val="decimal"/>
+      <w:lvlText w:val="%1."/>
+      <w:lvlJc w:val="left"/>
+      <w:pPr>
+        <w:tabs>
+          <w:tab w:val="num" w:pos="720"/>
+        </w:tabs>
+        <w:ind w:left="720" w:hanging="360"/>
+      </w:pPr>
+    </w:lvl>
+    <w:lvl w:ilvl="1" w:tentative="1">
+      <w:start w:val="1"/>
+      <w:numFmt w:val="decimal"/>
+      <w:lvlText w:val="%2."/>
+      <w:lvlJc w:val="left"/>
+      <w:pPr>
+        <w:tabs>
+          <w:tab w:val="num" w:pos="1440"/>
+        </w:tabs>
+        <w:ind w:left="1440" w:hanging="360"/>
+      </w:pPr>
+    </w:lvl>
+    <w:lvl w:ilvl="2" w:tentative="1">
+      <w:start w:val="1"/>
+      <w:numFmt w:val="decimal"/>
+      <w:lvlText w:val="%3."/>
+      <w:lvlJc w:val="left"/>
+      <w:pPr>
+        <w:tabs>
+          <w:tab w:val="num" w:pos="2160"/>
+        </w:tabs>
+        <w:ind w:left="2160" w:hanging="360"/>
+      </w:pPr>
+    </w:lvl>
+    <w:lvl w:ilvl="3" w:tentative="1">
+      <w:start w:val="1"/>
+      <w:numFmt w:val="decimal"/>
+      <w:lvlText w:val="%4."/>
+      <w:lvlJc w:val="left"/>
+      <w:pPr>
+        <w:tabs>
+          <w:tab w:val="num" w:pos="2880"/>
+        </w:tabs>
+        <w:ind w:left="2880" w:hanging="360"/>
+      </w:pPr>
+    </w:lvl>
+    <w:lvl w:ilvl="4" w:tentative="1">
+      <w:start w:val="1"/>
+      <w:numFmt w:val="decimal"/>
+      <w:lvlText w:val="%5."/>
+      <w:lvlJc w:val="left"/>
+      <w:pPr>
+        <w:tabs>
+          <w:tab w:val="num" w:pos="3600"/>
+        </w:tabs>
+        <w:ind w:left="3600" w:hanging="360"/>
+      </w:pPr>
+    </w:lvl>
+    <w:lvl w:ilvl="5" w:tentative="1">
+      <w:start w:val="1"/>
+      <w:numFmt w:val="decimal"/>
+      <w:lvlText w:val="%6."/>
+      <w:lvlJc w:val="left"/>
+      <w:pPr>
+        <w:tabs>
+          <w:tab w:val="num" w:pos="4320"/>
+        </w:tabs>
+        <w:ind w:left="4320" w:hanging="360"/>
+      </w:pPr>
+    </w:lvl>
+    <w:lvl w:ilvl="6" w:tentative="1">
+      <w:start w:val="1"/>
+      <w:numFmt w:val="decimal"/>
+      <w:lvlText w:val="%7."/>
+      <w:lvlJc w:val="left"/>
+      <w:pPr>
+        <w:tabs>
+          <w:tab w:val="num" w:pos="5040"/>
+        </w:tabs>
+        <w:ind w:left="5040" w:hanging="360"/>
+      </w:pPr>
+    </w:lvl>
+    <w:lvl w:ilvl="7" w:tentative="1">
+      <w:start w:val="1"/>
+      <w:numFmt w:val="decimal"/>
+      <w:lvlText w:val="%8."/>
+      <w:lvlJc w:val="left"/>
+      <w:pPr>
+        <w:tabs>
+          <w:tab w:val="num" w:pos="5760"/>
+        </w:tabs>
+        <w:ind w:left="5760" w:hanging="360"/>
+      </w:pPr>
+    </w:lvl>
+    <w:lvl w:ilvl="8" w:tentative="1">
+      <w:start w:val="1"/>
+      <w:numFmt w:val="decimal"/>
+      <w:lvlText w:val="%9."/>
+      <w:lvlJc w:val="left"/>
+      <w:pPr>
+        <w:tabs>
+          <w:tab w:val="num" w:pos="6480"/>
+        </w:tabs>
+        <w:ind w:left="6480" w:hanging="360"/>
+      </w:pPr>
+    </w:lvl>
+  </w:abstractNum>
+  <w:abstractNum w:abstractNumId="3" w15:restartNumberingAfterBreak="0">
     <w:nsid w:val="11A763D0"/>
     <w:multiLevelType w:val="multilevel"/>
     <w:tmpl w:val="CFDA7AAA"/>
@@ -3013,7 +4297,7 @@
       </w:pPr>
     </w:lvl>
   </w:abstractNum>
-  <w:abstractNum w:abstractNumId="1" w15:restartNumberingAfterBreak="0">
+  <w:abstractNum w:abstractNumId="4" w15:restartNumberingAfterBreak="0">
     <w:nsid w:val="167D7BB0"/>
     <w:multiLevelType w:val="multilevel"/>
     <w:tmpl w:val="B80E9D72"/>
@@ -3130,7 +4414,7 @@
       </w:pPr>
     </w:lvl>
   </w:abstractNum>
-  <w:abstractNum w:abstractNumId="2" w15:restartNumberingAfterBreak="0">
+  <w:abstractNum w:abstractNumId="5" w15:restartNumberingAfterBreak="0">
     <w:nsid w:val="2B7F618C"/>
     <w:multiLevelType w:val="multilevel"/>
     <w:tmpl w:val="E1E24212"/>
@@ -3243,7 +4527,7 @@
       </w:pPr>
     </w:lvl>
   </w:abstractNum>
-  <w:abstractNum w:abstractNumId="3" w15:restartNumberingAfterBreak="0">
+  <w:abstractNum w:abstractNumId="6" w15:restartNumberingAfterBreak="0">
     <w:nsid w:val="2C3525DF"/>
     <w:multiLevelType w:val="multilevel"/>
     <w:tmpl w:val="3F7872A0"/>
@@ -3392,7 +4676,7 @@
       </w:rPr>
     </w:lvl>
   </w:abstractNum>
-  <w:abstractNum w:abstractNumId="4" w15:restartNumberingAfterBreak="0">
+  <w:abstractNum w:abstractNumId="7" w15:restartNumberingAfterBreak="0">
     <w:nsid w:val="2F09201F"/>
     <w:multiLevelType w:val="multilevel"/>
     <w:tmpl w:val="FA541904"/>
@@ -3541,7 +4825,7 @@
       </w:rPr>
     </w:lvl>
   </w:abstractNum>
-  <w:abstractNum w:abstractNumId="5" w15:restartNumberingAfterBreak="0">
+  <w:abstractNum w:abstractNumId="8" w15:restartNumberingAfterBreak="0">
     <w:nsid w:val="31496BFF"/>
     <w:multiLevelType w:val="multilevel"/>
     <w:tmpl w:val="C4C8E926"/>
@@ -3654,10 +4938,10 @@
       </w:pPr>
     </w:lvl>
   </w:abstractNum>
-  <w:abstractNum w:abstractNumId="6" w15:restartNumberingAfterBreak="0">
+  <w:abstractNum w:abstractNumId="9" w15:restartNumberingAfterBreak="0">
     <w:nsid w:val="3E935D36"/>
     <w:multiLevelType w:val="multilevel"/>
-    <w:tmpl w:val="59629032"/>
+    <w:tmpl w:val="F3F810C8"/>
     <w:lvl w:ilvl="0">
       <w:start w:val="28"/>
       <w:numFmt w:val="decimal"/>
@@ -3670,6 +4954,119 @@
         <w:ind w:left="720" w:hanging="360"/>
       </w:pPr>
     </w:lvl>
+    <w:lvl w:ilvl="1">
+      <w:start w:val="1"/>
+      <w:numFmt w:val="lowerLetter"/>
+      <w:lvlText w:val="%2."/>
+      <w:lvlJc w:val="left"/>
+      <w:pPr>
+        <w:ind w:left="1440" w:hanging="360"/>
+      </w:pPr>
+      <w:rPr>
+        <w:rFonts w:hint="default"/>
+      </w:rPr>
+    </w:lvl>
+    <w:lvl w:ilvl="2" w:tentative="1">
+      <w:start w:val="1"/>
+      <w:numFmt w:val="decimal"/>
+      <w:lvlText w:val="%3."/>
+      <w:lvlJc w:val="left"/>
+      <w:pPr>
+        <w:tabs>
+          <w:tab w:val="num" w:pos="2160"/>
+        </w:tabs>
+        <w:ind w:left="2160" w:hanging="360"/>
+      </w:pPr>
+    </w:lvl>
+    <w:lvl w:ilvl="3" w:tentative="1">
+      <w:start w:val="1"/>
+      <w:numFmt w:val="decimal"/>
+      <w:lvlText w:val="%4."/>
+      <w:lvlJc w:val="left"/>
+      <w:pPr>
+        <w:tabs>
+          <w:tab w:val="num" w:pos="2880"/>
+        </w:tabs>
+        <w:ind w:left="2880" w:hanging="360"/>
+      </w:pPr>
+    </w:lvl>
+    <w:lvl w:ilvl="4" w:tentative="1">
+      <w:start w:val="1"/>
+      <w:numFmt w:val="decimal"/>
+      <w:lvlText w:val="%5."/>
+      <w:lvlJc w:val="left"/>
+      <w:pPr>
+        <w:tabs>
+          <w:tab w:val="num" w:pos="3600"/>
+        </w:tabs>
+        <w:ind w:left="3600" w:hanging="360"/>
+      </w:pPr>
+    </w:lvl>
+    <w:lvl w:ilvl="5" w:tentative="1">
+      <w:start w:val="1"/>
+      <w:numFmt w:val="decimal"/>
+      <w:lvlText w:val="%6."/>
+      <w:lvlJc w:val="left"/>
+      <w:pPr>
+        <w:tabs>
+          <w:tab w:val="num" w:pos="4320"/>
+        </w:tabs>
+        <w:ind w:left="4320" w:hanging="360"/>
+      </w:pPr>
+    </w:lvl>
+    <w:lvl w:ilvl="6" w:tentative="1">
+      <w:start w:val="1"/>
+      <w:numFmt w:val="decimal"/>
+      <w:lvlText w:val="%7."/>
+      <w:lvlJc w:val="left"/>
+      <w:pPr>
+        <w:tabs>
+          <w:tab w:val="num" w:pos="5040"/>
+        </w:tabs>
+        <w:ind w:left="5040" w:hanging="360"/>
+      </w:pPr>
+    </w:lvl>
+    <w:lvl w:ilvl="7" w:tentative="1">
+      <w:start w:val="1"/>
+      <w:numFmt w:val="decimal"/>
+      <w:lvlText w:val="%8."/>
+      <w:lvlJc w:val="left"/>
+      <w:pPr>
+        <w:tabs>
+          <w:tab w:val="num" w:pos="5760"/>
+        </w:tabs>
+        <w:ind w:left="5760" w:hanging="360"/>
+      </w:pPr>
+    </w:lvl>
+    <w:lvl w:ilvl="8" w:tentative="1">
+      <w:start w:val="1"/>
+      <w:numFmt w:val="decimal"/>
+      <w:lvlText w:val="%9."/>
+      <w:lvlJc w:val="left"/>
+      <w:pPr>
+        <w:tabs>
+          <w:tab w:val="num" w:pos="6480"/>
+        </w:tabs>
+        <w:ind w:left="6480" w:hanging="360"/>
+      </w:pPr>
+    </w:lvl>
+  </w:abstractNum>
+  <w:abstractNum w:abstractNumId="10" w15:restartNumberingAfterBreak="0">
+    <w:nsid w:val="42114E21"/>
+    <w:multiLevelType w:val="multilevel"/>
+    <w:tmpl w:val="0F0214FC"/>
+    <w:lvl w:ilvl="0">
+      <w:start w:val="8"/>
+      <w:numFmt w:val="decimal"/>
+      <w:lvlText w:val="%1."/>
+      <w:lvlJc w:val="left"/>
+      <w:pPr>
+        <w:tabs>
+          <w:tab w:val="num" w:pos="720"/>
+        </w:tabs>
+        <w:ind w:left="720" w:hanging="360"/>
+      </w:pPr>
+    </w:lvl>
     <w:lvl w:ilvl="1" w:tentative="1">
       <w:start w:val="1"/>
       <w:numFmt w:val="decimal"/>
@@ -3767,7 +5164,459 @@
       </w:pPr>
     </w:lvl>
   </w:abstractNum>
-  <w:abstractNum w:abstractNumId="7" w15:restartNumberingAfterBreak="0">
+  <w:abstractNum w:abstractNumId="11" w15:restartNumberingAfterBreak="0">
+    <w:nsid w:val="47666739"/>
+    <w:multiLevelType w:val="multilevel"/>
+    <w:tmpl w:val="71C62190"/>
+    <w:lvl w:ilvl="0">
+      <w:start w:val="1"/>
+      <w:numFmt w:val="lowerLetter"/>
+      <w:lvlText w:val="%1."/>
+      <w:lvlJc w:val="left"/>
+      <w:pPr>
+        <w:tabs>
+          <w:tab w:val="num" w:pos="720"/>
+        </w:tabs>
+        <w:ind w:left="720" w:hanging="360"/>
+      </w:pPr>
+    </w:lvl>
+    <w:lvl w:ilvl="1" w:tentative="1">
+      <w:start w:val="1"/>
+      <w:numFmt w:val="lowerLetter"/>
+      <w:lvlText w:val="%2."/>
+      <w:lvlJc w:val="left"/>
+      <w:pPr>
+        <w:tabs>
+          <w:tab w:val="num" w:pos="1440"/>
+        </w:tabs>
+        <w:ind w:left="1440" w:hanging="360"/>
+      </w:pPr>
+    </w:lvl>
+    <w:lvl w:ilvl="2" w:tentative="1">
+      <w:start w:val="1"/>
+      <w:numFmt w:val="lowerLetter"/>
+      <w:lvlText w:val="%3."/>
+      <w:lvlJc w:val="left"/>
+      <w:pPr>
+        <w:tabs>
+          <w:tab w:val="num" w:pos="2160"/>
+        </w:tabs>
+        <w:ind w:left="2160" w:hanging="360"/>
+      </w:pPr>
+    </w:lvl>
+    <w:lvl w:ilvl="3" w:tentative="1">
+      <w:start w:val="1"/>
+      <w:numFmt w:val="lowerLetter"/>
+      <w:lvlText w:val="%4."/>
+      <w:lvlJc w:val="left"/>
+      <w:pPr>
+        <w:tabs>
+          <w:tab w:val="num" w:pos="2880"/>
+        </w:tabs>
+        <w:ind w:left="2880" w:hanging="360"/>
+      </w:pPr>
+    </w:lvl>
+    <w:lvl w:ilvl="4" w:tentative="1">
+      <w:start w:val="1"/>
+      <w:numFmt w:val="lowerLetter"/>
+      <w:lvlText w:val="%5."/>
+      <w:lvlJc w:val="left"/>
+      <w:pPr>
+        <w:tabs>
+          <w:tab w:val="num" w:pos="3600"/>
+        </w:tabs>
+        <w:ind w:left="3600" w:hanging="360"/>
+      </w:pPr>
+    </w:lvl>
+    <w:lvl w:ilvl="5" w:tentative="1">
+      <w:start w:val="1"/>
+      <w:numFmt w:val="lowerLetter"/>
+      <w:lvlText w:val="%6."/>
+      <w:lvlJc w:val="left"/>
+      <w:pPr>
+        <w:tabs>
+          <w:tab w:val="num" w:pos="4320"/>
+        </w:tabs>
+        <w:ind w:left="4320" w:hanging="360"/>
+      </w:pPr>
+    </w:lvl>
+    <w:lvl w:ilvl="6" w:tentative="1">
+      <w:start w:val="1"/>
+      <w:numFmt w:val="lowerLetter"/>
+      <w:lvlText w:val="%7."/>
+      <w:lvlJc w:val="left"/>
+      <w:pPr>
+        <w:tabs>
+          <w:tab w:val="num" w:pos="5040"/>
+        </w:tabs>
+        <w:ind w:left="5040" w:hanging="360"/>
+      </w:pPr>
+    </w:lvl>
+    <w:lvl w:ilvl="7" w:tentative="1">
+      <w:start w:val="1"/>
+      <w:numFmt w:val="lowerLetter"/>
+      <w:lvlText w:val="%8."/>
+      <w:lvlJc w:val="left"/>
+      <w:pPr>
+        <w:tabs>
+          <w:tab w:val="num" w:pos="5760"/>
+        </w:tabs>
+        <w:ind w:left="5760" w:hanging="360"/>
+      </w:pPr>
+    </w:lvl>
+    <w:lvl w:ilvl="8" w:tentative="1">
+      <w:start w:val="1"/>
+      <w:numFmt w:val="lowerLetter"/>
+      <w:lvlText w:val="%9."/>
+      <w:lvlJc w:val="left"/>
+      <w:pPr>
+        <w:tabs>
+          <w:tab w:val="num" w:pos="6480"/>
+        </w:tabs>
+        <w:ind w:left="6480" w:hanging="360"/>
+      </w:pPr>
+    </w:lvl>
+  </w:abstractNum>
+  <w:abstractNum w:abstractNumId="12" w15:restartNumberingAfterBreak="0">
+    <w:nsid w:val="49173294"/>
+    <w:multiLevelType w:val="multilevel"/>
+    <w:tmpl w:val="45089A2E"/>
+    <w:lvl w:ilvl="0">
+      <w:start w:val="1"/>
+      <w:numFmt w:val="decimal"/>
+      <w:lvlText w:val="%1."/>
+      <w:lvlJc w:val="left"/>
+      <w:pPr>
+        <w:tabs>
+          <w:tab w:val="num" w:pos="720"/>
+        </w:tabs>
+        <w:ind w:left="720" w:hanging="360"/>
+      </w:pPr>
+    </w:lvl>
+    <w:lvl w:ilvl="1" w:tentative="1">
+      <w:start w:val="1"/>
+      <w:numFmt w:val="decimal"/>
+      <w:lvlText w:val="%2."/>
+      <w:lvlJc w:val="left"/>
+      <w:pPr>
+        <w:tabs>
+          <w:tab w:val="num" w:pos="1440"/>
+        </w:tabs>
+        <w:ind w:left="1440" w:hanging="360"/>
+      </w:pPr>
+    </w:lvl>
+    <w:lvl w:ilvl="2" w:tentative="1">
+      <w:start w:val="1"/>
+      <w:numFmt w:val="decimal"/>
+      <w:lvlText w:val="%3."/>
+      <w:lvlJc w:val="left"/>
+      <w:pPr>
+        <w:tabs>
+          <w:tab w:val="num" w:pos="2160"/>
+        </w:tabs>
+        <w:ind w:left="2160" w:hanging="360"/>
+      </w:pPr>
+    </w:lvl>
+    <w:lvl w:ilvl="3" w:tentative="1">
+      <w:start w:val="1"/>
+      <w:numFmt w:val="decimal"/>
+      <w:lvlText w:val="%4."/>
+      <w:lvlJc w:val="left"/>
+      <w:pPr>
+        <w:tabs>
+          <w:tab w:val="num" w:pos="2880"/>
+        </w:tabs>
+        <w:ind w:left="2880" w:hanging="360"/>
+      </w:pPr>
+    </w:lvl>
+    <w:lvl w:ilvl="4" w:tentative="1">
+      <w:start w:val="1"/>
+      <w:numFmt w:val="decimal"/>
+      <w:lvlText w:val="%5."/>
+      <w:lvlJc w:val="left"/>
+      <w:pPr>
+        <w:tabs>
+          <w:tab w:val="num" w:pos="3600"/>
+        </w:tabs>
+        <w:ind w:left="3600" w:hanging="360"/>
+      </w:pPr>
+    </w:lvl>
+    <w:lvl w:ilvl="5" w:tentative="1">
+      <w:start w:val="1"/>
+      <w:numFmt w:val="decimal"/>
+      <w:lvlText w:val="%6."/>
+      <w:lvlJc w:val="left"/>
+      <w:pPr>
+        <w:tabs>
+          <w:tab w:val="num" w:pos="4320"/>
+        </w:tabs>
+        <w:ind w:left="4320" w:hanging="360"/>
+      </w:pPr>
+    </w:lvl>
+    <w:lvl w:ilvl="6" w:tentative="1">
+      <w:start w:val="1"/>
+      <w:numFmt w:val="decimal"/>
+      <w:lvlText w:val="%7."/>
+      <w:lvlJc w:val="left"/>
+      <w:pPr>
+        <w:tabs>
+          <w:tab w:val="num" w:pos="5040"/>
+        </w:tabs>
+        <w:ind w:left="5040" w:hanging="360"/>
+      </w:pPr>
+    </w:lvl>
+    <w:lvl w:ilvl="7" w:tentative="1">
+      <w:start w:val="1"/>
+      <w:numFmt w:val="decimal"/>
+      <w:lvlText w:val="%8."/>
+      <w:lvlJc w:val="left"/>
+      <w:pPr>
+        <w:tabs>
+          <w:tab w:val="num" w:pos="5760"/>
+        </w:tabs>
+        <w:ind w:left="5760" w:hanging="360"/>
+      </w:pPr>
+    </w:lvl>
+    <w:lvl w:ilvl="8" w:tentative="1">
+      <w:start w:val="1"/>
+      <w:numFmt w:val="decimal"/>
+      <w:lvlText w:val="%9."/>
+      <w:lvlJc w:val="left"/>
+      <w:pPr>
+        <w:tabs>
+          <w:tab w:val="num" w:pos="6480"/>
+        </w:tabs>
+        <w:ind w:left="6480" w:hanging="360"/>
+      </w:pPr>
+    </w:lvl>
+  </w:abstractNum>
+  <w:abstractNum w:abstractNumId="13" w15:restartNumberingAfterBreak="0">
+    <w:nsid w:val="49FD20B8"/>
+    <w:multiLevelType w:val="multilevel"/>
+    <w:tmpl w:val="E55E0806"/>
+    <w:lvl w:ilvl="0">
+      <w:start w:val="2"/>
+      <w:numFmt w:val="decimal"/>
+      <w:lvlText w:val="%1."/>
+      <w:lvlJc w:val="left"/>
+      <w:pPr>
+        <w:tabs>
+          <w:tab w:val="num" w:pos="720"/>
+        </w:tabs>
+        <w:ind w:left="720" w:hanging="360"/>
+      </w:pPr>
+    </w:lvl>
+    <w:lvl w:ilvl="1" w:tentative="1">
+      <w:start w:val="1"/>
+      <w:numFmt w:val="decimal"/>
+      <w:lvlText w:val="%2."/>
+      <w:lvlJc w:val="left"/>
+      <w:pPr>
+        <w:tabs>
+          <w:tab w:val="num" w:pos="1440"/>
+        </w:tabs>
+        <w:ind w:left="1440" w:hanging="360"/>
+      </w:pPr>
+    </w:lvl>
+    <w:lvl w:ilvl="2" w:tentative="1">
+      <w:start w:val="1"/>
+      <w:numFmt w:val="decimal"/>
+      <w:lvlText w:val="%3."/>
+      <w:lvlJc w:val="left"/>
+      <w:pPr>
+        <w:tabs>
+          <w:tab w:val="num" w:pos="2160"/>
+        </w:tabs>
+        <w:ind w:left="2160" w:hanging="360"/>
+      </w:pPr>
+    </w:lvl>
+    <w:lvl w:ilvl="3" w:tentative="1">
+      <w:start w:val="1"/>
+      <w:numFmt w:val="decimal"/>
+      <w:lvlText w:val="%4."/>
+      <w:lvlJc w:val="left"/>
+      <w:pPr>
+        <w:tabs>
+          <w:tab w:val="num" w:pos="2880"/>
+        </w:tabs>
+        <w:ind w:left="2880" w:hanging="360"/>
+      </w:pPr>
+    </w:lvl>
+    <w:lvl w:ilvl="4" w:tentative="1">
+      <w:start w:val="1"/>
+      <w:numFmt w:val="decimal"/>
+      <w:lvlText w:val="%5."/>
+      <w:lvlJc w:val="left"/>
+      <w:pPr>
+        <w:tabs>
+          <w:tab w:val="num" w:pos="3600"/>
+        </w:tabs>
+        <w:ind w:left="3600" w:hanging="360"/>
+      </w:pPr>
+    </w:lvl>
+    <w:lvl w:ilvl="5" w:tentative="1">
+      <w:start w:val="1"/>
+      <w:numFmt w:val="decimal"/>
+      <w:lvlText w:val="%6."/>
+      <w:lvlJc w:val="left"/>
+      <w:pPr>
+        <w:tabs>
+          <w:tab w:val="num" w:pos="4320"/>
+        </w:tabs>
+        <w:ind w:left="4320" w:hanging="360"/>
+      </w:pPr>
+    </w:lvl>
+    <w:lvl w:ilvl="6" w:tentative="1">
+      <w:start w:val="1"/>
+      <w:numFmt w:val="decimal"/>
+      <w:lvlText w:val="%7."/>
+      <w:lvlJc w:val="left"/>
+      <w:pPr>
+        <w:tabs>
+          <w:tab w:val="num" w:pos="5040"/>
+        </w:tabs>
+        <w:ind w:left="5040" w:hanging="360"/>
+      </w:pPr>
+    </w:lvl>
+    <w:lvl w:ilvl="7" w:tentative="1">
+      <w:start w:val="1"/>
+      <w:numFmt w:val="decimal"/>
+      <w:lvlText w:val="%8."/>
+      <w:lvlJc w:val="left"/>
+      <w:pPr>
+        <w:tabs>
+          <w:tab w:val="num" w:pos="5760"/>
+        </w:tabs>
+        <w:ind w:left="5760" w:hanging="360"/>
+      </w:pPr>
+    </w:lvl>
+    <w:lvl w:ilvl="8" w:tentative="1">
+      <w:start w:val="1"/>
+      <w:numFmt w:val="decimal"/>
+      <w:lvlText w:val="%9."/>
+      <w:lvlJc w:val="left"/>
+      <w:pPr>
+        <w:tabs>
+          <w:tab w:val="num" w:pos="6480"/>
+        </w:tabs>
+        <w:ind w:left="6480" w:hanging="360"/>
+      </w:pPr>
+    </w:lvl>
+  </w:abstractNum>
+  <w:abstractNum w:abstractNumId="14" w15:restartNumberingAfterBreak="0">
+    <w:nsid w:val="4F1D63C5"/>
+    <w:multiLevelType w:val="multilevel"/>
+    <w:tmpl w:val="781090BA"/>
+    <w:lvl w:ilvl="0">
+      <w:start w:val="7"/>
+      <w:numFmt w:val="decimal"/>
+      <w:lvlText w:val="%1."/>
+      <w:lvlJc w:val="left"/>
+      <w:pPr>
+        <w:tabs>
+          <w:tab w:val="num" w:pos="720"/>
+        </w:tabs>
+        <w:ind w:left="720" w:hanging="360"/>
+      </w:pPr>
+    </w:lvl>
+    <w:lvl w:ilvl="1" w:tentative="1">
+      <w:start w:val="1"/>
+      <w:numFmt w:val="decimal"/>
+      <w:lvlText w:val="%2."/>
+      <w:lvlJc w:val="left"/>
+      <w:pPr>
+        <w:tabs>
+          <w:tab w:val="num" w:pos="1440"/>
+        </w:tabs>
+        <w:ind w:left="1440" w:hanging="360"/>
+      </w:pPr>
+    </w:lvl>
+    <w:lvl w:ilvl="2" w:tentative="1">
+      <w:start w:val="1"/>
+      <w:numFmt w:val="decimal"/>
+      <w:lvlText w:val="%3."/>
+      <w:lvlJc w:val="left"/>
+      <w:pPr>
+        <w:tabs>
+          <w:tab w:val="num" w:pos="2160"/>
+        </w:tabs>
+        <w:ind w:left="2160" w:hanging="360"/>
+      </w:pPr>
+    </w:lvl>
+    <w:lvl w:ilvl="3" w:tentative="1">
+      <w:start w:val="1"/>
+      <w:numFmt w:val="decimal"/>
+      <w:lvlText w:val="%4."/>
+      <w:lvlJc w:val="left"/>
+      <w:pPr>
+        <w:tabs>
+          <w:tab w:val="num" w:pos="2880"/>
+        </w:tabs>
+        <w:ind w:left="2880" w:hanging="360"/>
+      </w:pPr>
+    </w:lvl>
+    <w:lvl w:ilvl="4" w:tentative="1">
+      <w:start w:val="1"/>
+      <w:numFmt w:val="decimal"/>
+      <w:lvlText w:val="%5."/>
+      <w:lvlJc w:val="left"/>
+      <w:pPr>
+        <w:tabs>
+          <w:tab w:val="num" w:pos="3600"/>
+        </w:tabs>
+        <w:ind w:left="3600" w:hanging="360"/>
+      </w:pPr>
+    </w:lvl>
+    <w:lvl w:ilvl="5" w:tentative="1">
+      <w:start w:val="1"/>
+      <w:numFmt w:val="decimal"/>
+      <w:lvlText w:val="%6."/>
+      <w:lvlJc w:val="left"/>
+      <w:pPr>
+        <w:tabs>
+          <w:tab w:val="num" w:pos="4320"/>
+        </w:tabs>
+        <w:ind w:left="4320" w:hanging="360"/>
+      </w:pPr>
+    </w:lvl>
+    <w:lvl w:ilvl="6" w:tentative="1">
+      <w:start w:val="1"/>
+      <w:numFmt w:val="decimal"/>
+      <w:lvlText w:val="%7."/>
+      <w:lvlJc w:val="left"/>
+      <w:pPr>
+        <w:tabs>
+          <w:tab w:val="num" w:pos="5040"/>
+        </w:tabs>
+        <w:ind w:left="5040" w:hanging="360"/>
+      </w:pPr>
+    </w:lvl>
+    <w:lvl w:ilvl="7" w:tentative="1">
+      <w:start w:val="1"/>
+      <w:numFmt w:val="decimal"/>
+      <w:lvlText w:val="%8."/>
+      <w:lvlJc w:val="left"/>
+      <w:pPr>
+        <w:tabs>
+          <w:tab w:val="num" w:pos="5760"/>
+        </w:tabs>
+        <w:ind w:left="5760" w:hanging="360"/>
+      </w:pPr>
+    </w:lvl>
+    <w:lvl w:ilvl="8" w:tentative="1">
+      <w:start w:val="1"/>
+      <w:numFmt w:val="decimal"/>
+      <w:lvlText w:val="%9."/>
+      <w:lvlJc w:val="left"/>
+      <w:pPr>
+        <w:tabs>
+          <w:tab w:val="num" w:pos="6480"/>
+        </w:tabs>
+        <w:ind w:left="6480" w:hanging="360"/>
+      </w:pPr>
+    </w:lvl>
+  </w:abstractNum>
+  <w:abstractNum w:abstractNumId="15" w15:restartNumberingAfterBreak="0">
     <w:nsid w:val="4F677274"/>
     <w:multiLevelType w:val="multilevel"/>
     <w:tmpl w:val="4730587E"/>
@@ -3880,7 +5729,7 @@
       </w:pPr>
     </w:lvl>
   </w:abstractNum>
-  <w:abstractNum w:abstractNumId="8" w15:restartNumberingAfterBreak="0">
+  <w:abstractNum w:abstractNumId="16" w15:restartNumberingAfterBreak="0">
     <w:nsid w:val="574070D1"/>
     <w:multiLevelType w:val="multilevel"/>
     <w:tmpl w:val="AFA6FD14"/>
@@ -3993,7 +5842,120 @@
       </w:pPr>
     </w:lvl>
   </w:abstractNum>
-  <w:abstractNum w:abstractNumId="9" w15:restartNumberingAfterBreak="0">
+  <w:abstractNum w:abstractNumId="17" w15:restartNumberingAfterBreak="0">
+    <w:nsid w:val="60E87269"/>
+    <w:multiLevelType w:val="multilevel"/>
+    <w:tmpl w:val="E64211AE"/>
+    <w:lvl w:ilvl="0">
+      <w:start w:val="3"/>
+      <w:numFmt w:val="decimal"/>
+      <w:lvlText w:val="%1."/>
+      <w:lvlJc w:val="left"/>
+      <w:pPr>
+        <w:tabs>
+          <w:tab w:val="num" w:pos="720"/>
+        </w:tabs>
+        <w:ind w:left="720" w:hanging="360"/>
+      </w:pPr>
+    </w:lvl>
+    <w:lvl w:ilvl="1" w:tentative="1">
+      <w:start w:val="1"/>
+      <w:numFmt w:val="decimal"/>
+      <w:lvlText w:val="%2."/>
+      <w:lvlJc w:val="left"/>
+      <w:pPr>
+        <w:tabs>
+          <w:tab w:val="num" w:pos="1440"/>
+        </w:tabs>
+        <w:ind w:left="1440" w:hanging="360"/>
+      </w:pPr>
+    </w:lvl>
+    <w:lvl w:ilvl="2" w:tentative="1">
+      <w:start w:val="1"/>
+      <w:numFmt w:val="decimal"/>
+      <w:lvlText w:val="%3."/>
+      <w:lvlJc w:val="left"/>
+      <w:pPr>
+        <w:tabs>
+          <w:tab w:val="num" w:pos="2160"/>
+        </w:tabs>
+        <w:ind w:left="2160" w:hanging="360"/>
+      </w:pPr>
+    </w:lvl>
+    <w:lvl w:ilvl="3" w:tentative="1">
+      <w:start w:val="1"/>
+      <w:numFmt w:val="decimal"/>
+      <w:lvlText w:val="%4."/>
+      <w:lvlJc w:val="left"/>
+      <w:pPr>
+        <w:tabs>
+          <w:tab w:val="num" w:pos="2880"/>
+        </w:tabs>
+        <w:ind w:left="2880" w:hanging="360"/>
+      </w:pPr>
+    </w:lvl>
+    <w:lvl w:ilvl="4" w:tentative="1">
+      <w:start w:val="1"/>
+      <w:numFmt w:val="decimal"/>
+      <w:lvlText w:val="%5."/>
+      <w:lvlJc w:val="left"/>
+      <w:pPr>
+        <w:tabs>
+          <w:tab w:val="num" w:pos="3600"/>
+        </w:tabs>
+        <w:ind w:left="3600" w:hanging="360"/>
+      </w:pPr>
+    </w:lvl>
+    <w:lvl w:ilvl="5" w:tentative="1">
+      <w:start w:val="1"/>
+      <w:numFmt w:val="decimal"/>
+      <w:lvlText w:val="%6."/>
+      <w:lvlJc w:val="left"/>
+      <w:pPr>
+        <w:tabs>
+          <w:tab w:val="num" w:pos="4320"/>
+        </w:tabs>
+        <w:ind w:left="4320" w:hanging="360"/>
+      </w:pPr>
+    </w:lvl>
+    <w:lvl w:ilvl="6" w:tentative="1">
+      <w:start w:val="1"/>
+      <w:numFmt w:val="decimal"/>
+      <w:lvlText w:val="%7."/>
+      <w:lvlJc w:val="left"/>
+      <w:pPr>
+        <w:tabs>
+          <w:tab w:val="num" w:pos="5040"/>
+        </w:tabs>
+        <w:ind w:left="5040" w:hanging="360"/>
+      </w:pPr>
+    </w:lvl>
+    <w:lvl w:ilvl="7" w:tentative="1">
+      <w:start w:val="1"/>
+      <w:numFmt w:val="decimal"/>
+      <w:lvlText w:val="%8."/>
+      <w:lvlJc w:val="left"/>
+      <w:pPr>
+        <w:tabs>
+          <w:tab w:val="num" w:pos="5760"/>
+        </w:tabs>
+        <w:ind w:left="5760" w:hanging="360"/>
+      </w:pPr>
+    </w:lvl>
+    <w:lvl w:ilvl="8" w:tentative="1">
+      <w:start w:val="1"/>
+      <w:numFmt w:val="decimal"/>
+      <w:lvlText w:val="%9."/>
+      <w:lvlJc w:val="left"/>
+      <w:pPr>
+        <w:tabs>
+          <w:tab w:val="num" w:pos="6480"/>
+        </w:tabs>
+        <w:ind w:left="6480" w:hanging="360"/>
+      </w:pPr>
+    </w:lvl>
+  </w:abstractNum>
+  <w:abstractNum w:abstractNumId="18" w15:restartNumberingAfterBreak="0">
     <w:nsid w:val="6573407F"/>
     <w:multiLevelType w:val="multilevel"/>
     <w:tmpl w:val="1C6A6450"/>
@@ -4004,21 +5966,21 @@
       <w:lvlJc w:val="left"/>
       <w:pPr>
         <w:tabs>
-          <w:tab w:val="num" w:pos="1080"/>
-        </w:tabs>
-        <w:ind w:left="1080" w:hanging="360"/>
-      </w:pPr>
-    </w:lvl>
-    <w:lvl w:ilvl="1" w:tentative="1">
+          <w:tab w:val="num" w:pos="360"/>
+        </w:tabs>
+        <w:ind w:left="360" w:hanging="360"/>
+      </w:pPr>
+    </w:lvl>
+    <w:lvl w:ilvl="1">
       <w:start w:val="1"/>
       <w:numFmt w:val="lowerLetter"/>
       <w:lvlText w:val="%2."/>
       <w:lvlJc w:val="left"/>
       <w:pPr>
         <w:tabs>
-          <w:tab w:val="num" w:pos="1800"/>
-        </w:tabs>
-        <w:ind w:left="1800" w:hanging="360"/>
+          <w:tab w:val="num" w:pos="1080"/>
+        </w:tabs>
+        <w:ind w:left="1080" w:hanging="360"/>
       </w:pPr>
     </w:lvl>
     <w:lvl w:ilvl="2" w:tentative="1">
@@ -4028,9 +5990,9 @@
       <w:lvlJc w:val="left"/>
       <w:pPr>
         <w:tabs>
-          <w:tab w:val="num" w:pos="2520"/>
-        </w:tabs>
-        <w:ind w:left="2520" w:hanging="360"/>
+          <w:tab w:val="num" w:pos="1800"/>
+        </w:tabs>
+        <w:ind w:left="1800" w:hanging="360"/>
       </w:pPr>
     </w:lvl>
     <w:lvl w:ilvl="3" w:tentative="1">
@@ -4040,9 +6002,9 @@
       <w:lvlJc w:val="left"/>
       <w:pPr>
         <w:tabs>
-          <w:tab w:val="num" w:pos="3240"/>
-        </w:tabs>
-        <w:ind w:left="3240" w:hanging="360"/>
+          <w:tab w:val="num" w:pos="2520"/>
+        </w:tabs>
+        <w:ind w:left="2520" w:hanging="360"/>
       </w:pPr>
     </w:lvl>
     <w:lvl w:ilvl="4" w:tentative="1">
@@ -4052,9 +6014,9 @@
       <w:lvlJc w:val="left"/>
       <w:pPr>
         <w:tabs>
-          <w:tab w:val="num" w:pos="3960"/>
-        </w:tabs>
-        <w:ind w:left="3960" w:hanging="360"/>
+          <w:tab w:val="num" w:pos="3240"/>
+        </w:tabs>
+        <w:ind w:left="3240" w:hanging="360"/>
       </w:pPr>
     </w:lvl>
     <w:lvl w:ilvl="5" w:tentative="1">
@@ -4064,9 +6026,9 @@
       <w:lvlJc w:val="left"/>
       <w:pPr>
         <w:tabs>
-          <w:tab w:val="num" w:pos="4680"/>
-        </w:tabs>
-        <w:ind w:left="4680" w:hanging="360"/>
+          <w:tab w:val="num" w:pos="3960"/>
+        </w:tabs>
+        <w:ind w:left="3960" w:hanging="360"/>
       </w:pPr>
     </w:lvl>
     <w:lvl w:ilvl="6" w:tentative="1">
@@ -4076,9 +6038,9 @@
       <w:lvlJc w:val="left"/>
       <w:pPr>
         <w:tabs>
-          <w:tab w:val="num" w:pos="5400"/>
-        </w:tabs>
-        <w:ind w:left="5400" w:hanging="360"/>
+          <w:tab w:val="num" w:pos="4680"/>
+        </w:tabs>
+        <w:ind w:left="4680" w:hanging="360"/>
       </w:pPr>
     </w:lvl>
     <w:lvl w:ilvl="7" w:tentative="1">
@@ -4088,9 +6050,9 @@
       <w:lvlJc w:val="left"/>
       <w:pPr>
         <w:tabs>
-          <w:tab w:val="num" w:pos="6120"/>
-        </w:tabs>
-        <w:ind w:left="6120" w:hanging="360"/>
+          <w:tab w:val="num" w:pos="5400"/>
+        </w:tabs>
+        <w:ind w:left="5400" w:hanging="360"/>
       </w:pPr>
     </w:lvl>
     <w:lvl w:ilvl="8" w:tentative="1">
@@ -4100,13 +6062,13 @@
       <w:lvlJc w:val="left"/>
       <w:pPr>
         <w:tabs>
-          <w:tab w:val="num" w:pos="6840"/>
-        </w:tabs>
-        <w:ind w:left="6840" w:hanging="360"/>
+          <w:tab w:val="num" w:pos="6120"/>
+        </w:tabs>
+        <w:ind w:left="6120" w:hanging="360"/>
       </w:pPr>
     </w:lvl>
   </w:abstractNum>
-  <w:abstractNum w:abstractNumId="10" w15:restartNumberingAfterBreak="0">
+  <w:abstractNum w:abstractNumId="19" w15:restartNumberingAfterBreak="0">
     <w:nsid w:val="676E402A"/>
     <w:multiLevelType w:val="multilevel"/>
     <w:tmpl w:val="9A5E8EFA"/>
@@ -4255,37 +6217,180 @@
       </w:rPr>
     </w:lvl>
   </w:abstractNum>
+  <w:abstractNum w:abstractNumId="20" w15:restartNumberingAfterBreak="0">
+    <w:nsid w:val="77C50E20"/>
+    <w:multiLevelType w:val="multilevel"/>
+    <w:tmpl w:val="40B261A6"/>
+    <w:lvl w:ilvl="0">
+      <w:start w:val="5"/>
+      <w:numFmt w:val="decimal"/>
+      <w:lvlText w:val="%1."/>
+      <w:lvlJc w:val="left"/>
+      <w:pPr>
+        <w:tabs>
+          <w:tab w:val="num" w:pos="720"/>
+        </w:tabs>
+        <w:ind w:left="720" w:hanging="360"/>
+      </w:pPr>
+    </w:lvl>
+    <w:lvl w:ilvl="1" w:tentative="1">
+      <w:start w:val="1"/>
+      <w:numFmt w:val="decimal"/>
+      <w:lvlText w:val="%2."/>
+      <w:lvlJc w:val="left"/>
+      <w:pPr>
+        <w:tabs>
+          <w:tab w:val="num" w:pos="1440"/>
+        </w:tabs>
+        <w:ind w:left="1440" w:hanging="360"/>
+      </w:pPr>
+    </w:lvl>
+    <w:lvl w:ilvl="2" w:tentative="1">
+      <w:start w:val="1"/>
+      <w:numFmt w:val="decimal"/>
+      <w:lvlText w:val="%3."/>
+      <w:lvlJc w:val="left"/>
+      <w:pPr>
+        <w:tabs>
+          <w:tab w:val="num" w:pos="2160"/>
+        </w:tabs>
+        <w:ind w:left="2160" w:hanging="360"/>
+      </w:pPr>
+    </w:lvl>
+    <w:lvl w:ilvl="3" w:tentative="1">
+      <w:start w:val="1"/>
+      <w:numFmt w:val="decimal"/>
+      <w:lvlText w:val="%4."/>
+      <w:lvlJc w:val="left"/>
+      <w:pPr>
+        <w:tabs>
+          <w:tab w:val="num" w:pos="2880"/>
+        </w:tabs>
+        <w:ind w:left="2880" w:hanging="360"/>
+      </w:pPr>
+    </w:lvl>
+    <w:lvl w:ilvl="4" w:tentative="1">
+      <w:start w:val="1"/>
+      <w:numFmt w:val="decimal"/>
+      <w:lvlText w:val="%5."/>
+      <w:lvlJc w:val="left"/>
+      <w:pPr>
+        <w:tabs>
+          <w:tab w:val="num" w:pos="3600"/>
+        </w:tabs>
+        <w:ind w:left="3600" w:hanging="360"/>
+      </w:pPr>
+    </w:lvl>
+    <w:lvl w:ilvl="5" w:tentative="1">
+      <w:start w:val="1"/>
+      <w:numFmt w:val="decimal"/>
+      <w:lvlText w:val="%6."/>
+      <w:lvlJc w:val="left"/>
+      <w:pPr>
+        <w:tabs>
+          <w:tab w:val="num" w:pos="4320"/>
+        </w:tabs>
+        <w:ind w:left="4320" w:hanging="360"/>
+      </w:pPr>
+    </w:lvl>
+    <w:lvl w:ilvl="6" w:tentative="1">
+      <w:start w:val="1"/>
+      <w:numFmt w:val="decimal"/>
+      <w:lvlText w:val="%7."/>
+      <w:lvlJc w:val="left"/>
+      <w:pPr>
+        <w:tabs>
+          <w:tab w:val="num" w:pos="5040"/>
+        </w:tabs>
+        <w:ind w:left="5040" w:hanging="360"/>
+      </w:pPr>
+    </w:lvl>
+    <w:lvl w:ilvl="7" w:tentative="1">
+      <w:start w:val="1"/>
+      <w:numFmt w:val="decimal"/>
+      <w:lvlText w:val="%8."/>
+      <w:lvlJc w:val="left"/>
+      <w:pPr>
+        <w:tabs>
+          <w:tab w:val="num" w:pos="5760"/>
+        </w:tabs>
+        <w:ind w:left="5760" w:hanging="360"/>
+      </w:pPr>
+    </w:lvl>
+    <w:lvl w:ilvl="8" w:tentative="1">
+      <w:start w:val="1"/>
+      <w:numFmt w:val="decimal"/>
+      <w:lvlText w:val="%9."/>
+      <w:lvlJc w:val="left"/>
+      <w:pPr>
+        <w:tabs>
+          <w:tab w:val="num" w:pos="6480"/>
+        </w:tabs>
+        <w:ind w:left="6480" w:hanging="360"/>
+      </w:pPr>
+    </w:lvl>
+  </w:abstractNum>
   <w:num w:numId="1" w16cid:durableId="1291741873">
+    <w:abstractNumId w:val="16"/>
+  </w:num>
+  <w:num w:numId="2" w16cid:durableId="1705403788">
+    <w:abstractNumId w:val="18"/>
+  </w:num>
+  <w:num w:numId="3" w16cid:durableId="1161239122">
+    <w:abstractNumId w:val="4"/>
+  </w:num>
+  <w:num w:numId="4" w16cid:durableId="982004466">
+    <w:abstractNumId w:val="15"/>
+  </w:num>
+  <w:num w:numId="5" w16cid:durableId="2083092249">
     <w:abstractNumId w:val="8"/>
   </w:num>
-  <w:num w:numId="2" w16cid:durableId="1705403788">
+  <w:num w:numId="6" w16cid:durableId="234357438">
+    <w:abstractNumId w:val="5"/>
+  </w:num>
+  <w:num w:numId="7" w16cid:durableId="629363714">
+    <w:abstractNumId w:val="3"/>
+  </w:num>
+  <w:num w:numId="8" w16cid:durableId="726535830">
     <w:abstractNumId w:val="9"/>
   </w:num>
-  <w:num w:numId="3" w16cid:durableId="1161239122">
+  <w:num w:numId="9" w16cid:durableId="1655139262">
+    <w:abstractNumId w:val="6"/>
+  </w:num>
+  <w:num w:numId="10" w16cid:durableId="32384748">
+    <w:abstractNumId w:val="7"/>
+  </w:num>
+  <w:num w:numId="11" w16cid:durableId="1086802404">
+    <w:abstractNumId w:val="19"/>
+  </w:num>
+  <w:num w:numId="12" w16cid:durableId="516312644">
+    <w:abstractNumId w:val="12"/>
+  </w:num>
+  <w:num w:numId="13" w16cid:durableId="1963147978">
+    <w:abstractNumId w:val="11"/>
+  </w:num>
+  <w:num w:numId="14" w16cid:durableId="231282070">
+    <w:abstractNumId w:val="0"/>
+  </w:num>
+  <w:num w:numId="15" w16cid:durableId="159587225">
+    <w:abstractNumId w:val="13"/>
+  </w:num>
+  <w:num w:numId="16" w16cid:durableId="1050033976">
+    <w:abstractNumId w:val="17"/>
+  </w:num>
+  <w:num w:numId="17" w16cid:durableId="1973092454">
     <w:abstractNumId w:val="1"/>
   </w:num>
-  <w:num w:numId="4" w16cid:durableId="982004466">
-    <w:abstractNumId w:val="7"/>
+  <w:num w:numId="18" w16cid:durableId="962884242">
+    <w:abstractNumId w:val="20"/>
   </w:num>
-  <w:num w:numId="5" w16cid:durableId="2083092249">
-    <w:abstractNumId w:val="5"/>
-  </w:num>
-  <w:num w:numId="6" w16cid:durableId="234357438">
+  <w:num w:numId="19" w16cid:durableId="596060587">
     <w:abstractNumId w:val="2"/>
   </w:num>
-  <w:num w:numId="7" w16cid:durableId="629363714">
-    <w:abstractNumId w:val="0"/>
+  <w:num w:numId="20" w16cid:durableId="1445927852">
+    <w:abstractNumId w:val="14"/>
   </w:num>
-  <w:num w:numId="8" w16cid:durableId="726535830">
-    <w:abstractNumId w:val="6"/>
-  </w:num>
-  <w:num w:numId="9" w16cid:durableId="1655139262">
-    <w:abstractNumId w:val="3"/>
-  </w:num>
-  <w:num w:numId="10" w16cid:durableId="32384748">
-    <w:abstractNumId w:val="4"/>
-  </w:num>
-  <w:num w:numId="11" w16cid:durableId="1086802404">
+  <w:num w:numId="21" w16cid:durableId="594824334">
     <w:abstractNumId w:val="10"/>
   </w:num>
 </w:numbering>
@@ -5238,6 +7343,29 @@
       </w:tblBorders>
     </w:tblPr>
   </w:style>
+  <w:style w:type="character" w:styleId="Hyperlink">
+    <w:name w:val="Hyperlink"/>
+    <w:basedOn w:val="DefaultParagraphFont"/>
+    <w:uiPriority w:val="99"/>
+    <w:unhideWhenUsed/>
+    <w:rsid w:val="00040603"/>
+    <w:rPr>
+      <w:color w:val="467886" w:themeColor="hyperlink"/>
+      <w:u w:val="single"/>
+    </w:rPr>
+  </w:style>
+  <w:style w:type="character" w:styleId="UnresolvedMention">
+    <w:name w:val="Unresolved Mention"/>
+    <w:basedOn w:val="DefaultParagraphFont"/>
+    <w:uiPriority w:val="99"/>
+    <w:semiHidden/>
+    <w:unhideWhenUsed/>
+    <w:rsid w:val="00040603"/>
+    <w:rPr>
+      <w:color w:val="605E5C"/>
+      <w:shd w:val="clear" w:color="auto" w:fill="E1DFDD"/>
+    </w:rPr>
+  </w:style>
 </w:styles>
 </file>
 

</xml_diff>